<commit_message>
feat(sys): extend organization services and validation
</commit_message>
<xml_diff>
--- a/docs/99-output/MyERP_SRS.docx
+++ b/docs/99-output/MyERP_SRS.docx
@@ -1258,7 +1258,7 @@
           <w:p>
             <w:pPr/>
             <w:r>
-              <w:t xml:space="preserve">1.0</w:t>
+              <w:t xml:space="preserve">1.1</w:t>
             </w:r>
           </w:p>
         </w:tc>
@@ -3367,7 +3367,7 @@
           <w:p>
             <w:pPr/>
             <w:r>
-              <w:t xml:space="preserve">1–30 字元</w:t>
+              <w:t xml:space="preserve">1–30 字元；ASCII 英文、數字、-、_</w:t>
             </w:r>
           </w:p>
         </w:tc>
@@ -3921,7 +3921,7 @@
           <w:p>
             <w:pPr/>
             <w:r>
-              <w:t xml:space="preserve">1–30 字元</w:t>
+              <w:t xml:space="preserve">1–30 字元；ASCII 英文、數字、-、_</w:t>
             </w:r>
           </w:p>
         </w:tc>
@@ -4202,7 +4202,7 @@
           <w:p>
             <w:pPr/>
             <w:r>
-              <w:t xml:space="preserve">1–30 字元</w:t>
+              <w:t xml:space="preserve">1–30 字元；ASCII 英文、數字、-、_</w:t>
             </w:r>
           </w:p>
         </w:tc>
@@ -4713,7 +4713,7 @@
       </w:r>
     </w:p>
     <w:sectPr>
-      <w:footerReference xmlns:r="http://schemas.openxmlformats.org/officeDocument/2006/relationships" w:type="default" r:id="R912afd1ecf1e4e2d"/>
+      <w:footerReference xmlns:r="http://schemas.openxmlformats.org/officeDocument/2006/relationships" w:type="default" r:id="R4fe9942cf4b74391"/>
       <w:pgSz w:w="11906" w:h="16838"/>
       <w:pgMar w:top="1440" w:right="1440" w:bottom="1440" w:left="1440" w:header="720" w:footer="720" w:gutter="0"/>
     </w:sectPr>

</xml_diff>

<commit_message>
feat(sys): scope internal company list to authorized IDs
</commit_message>
<xml_diff>
--- a/docs/99-output/MyERP_SRS.docx
+++ b/docs/99-output/MyERP_SRS.docx
@@ -1112,7 +1112,7 @@
           <w:p>
             <w:pPr/>
             <w:r>
-              <w:t xml:space="preserve">1.0</w:t>
+              <w:t xml:space="preserve">1.1</w:t>
             </w:r>
           </w:p>
         </w:tc>
@@ -4713,7 +4713,7 @@
       </w:r>
     </w:p>
     <w:sectPr>
-      <w:footerReference xmlns:r="http://schemas.openxmlformats.org/officeDocument/2006/relationships" w:type="default" r:id="R8efb248ee9854ed2"/>
+      <w:footerReference xmlns:r="http://schemas.openxmlformats.org/officeDocument/2006/relationships" w:type="default" r:id="Rd27b821520614884"/>
       <w:pgSz w:w="11906" w:h="16838"/>
       <w:pgMar w:top="1440" w:right="1440" w:bottom="1440" w:left="1440" w:header="720" w:footer="720" w:gutter="0"/>
     </w:sectPr>

</xml_diff>

<commit_message>
feat(sys): complete WU-SYS-001 organization work unit
Extract PagedResultMapping, add ADR-015 (organization API scope and
creator grant), update SYS requirements/api/ui/test-plan docs and
regenerate SRS/SDS. Backend 414/414, frontend 285/285, E2E 28/28.

Co-Authored-By: Claude Opus 5.5 <noreply@anthropic.com>
</commit_message>
<xml_diff>
--- a/docs/99-output/MyERP_SRS.docx
+++ b/docs/99-output/MyERP_SRS.docx
@@ -1112,7 +1112,7 @@
           <w:p>
             <w:pPr/>
             <w:r>
-              <w:t xml:space="preserve">1.1</w:t>
+              <w:t xml:space="preserve">1.2</w:t>
             </w:r>
           </w:p>
         </w:tc>
@@ -1258,7 +1258,7 @@
           <w:p>
             <w:pPr/>
             <w:r>
-              <w:t xml:space="preserve">1.1</w:t>
+              <w:t xml:space="preserve">1.2</w:t>
             </w:r>
           </w:p>
         </w:tc>
@@ -1404,7 +1404,7 @@
           <w:p>
             <w:pPr/>
             <w:r>
-              <w:t xml:space="preserve">1.0</w:t>
+              <w:t xml:space="preserve">1.1</w:t>
             </w:r>
           </w:p>
         </w:tc>
@@ -10136,7 +10136,7 @@
       </w:r>
     </w:p>
     <w:sectPr>
-      <w:footerReference xmlns:r="http://schemas.openxmlformats.org/officeDocument/2006/relationships" w:type="default" r:id="Rb0f4581c90cf446b"/>
+      <w:footerReference xmlns:r="http://schemas.openxmlformats.org/officeDocument/2006/relationships" w:type="default" r:id="Raea46d1d1f4041b5"/>
       <w:pgSz w:w="11906" w:h="16838"/>
       <w:pgMar w:top="1440" w:right="1440" w:bottom="1440" w:left="1440" w:header="720" w:footer="720" w:gutter="0"/>
     </w:sectPr>

</xml_diff>

<commit_message>
docs(sys): document security middleware and complete WU-SYS-005
Adds ADR-018, architecture/security.md, REQ_F4118.26.x, SYS-SEC test plan,
cross-origin rate-limit test, and updates state and progress.

Co-Authored-By: Claude Opus 5.5 <noreply@anthropic.com>
</commit_message>
<xml_diff>
--- a/docs/99-output/MyERP_SRS.docx
+++ b/docs/99-output/MyERP_SRS.docx
@@ -5455,6 +5455,1182 @@
       </w:tr>
     </w:tbl>
     <w:p/>
+    <w:tbl>
+      <w:tblPr>
+        <w:tblStyle w:val="TableGrid"/>
+        <w:tblW w:w="9345" w:type="dxa"/>
+        <w:jc w:val="left"/>
+        <w:tblBorders>
+          <w:top w:val="single" w:color="000000" w:sz="8" w:space="0"/>
+          <w:left w:val="single" w:color="000000" w:sz="8" w:space="0"/>
+          <w:bottom w:val="single" w:color="000000" w:sz="8" w:space="0"/>
+          <w:right w:val="single" w:color="000000" w:sz="8" w:space="0"/>
+          <w:insideH w:val="single" w:color="000000" w:sz="8" w:space="0"/>
+          <w:insideV w:val="single" w:color="000000" w:sz="8" w:space="0"/>
+        </w:tblBorders>
+        <w:tblLayout w:type="fixed"/>
+        <w:tblCellMar>
+          <w:top w:w="100" w:type="dxa"/>
+          <w:left w:w="100" w:type="dxa"/>
+          <w:bottom w:w="100" w:type="dxa"/>
+          <w:right w:w="100" w:type="dxa"/>
+        </w:tblCellMar>
+      </w:tblPr>
+      <w:tblGrid>
+        <w:gridCol w:w="2220"/>
+        <w:gridCol w:w="3525"/>
+        <w:gridCol w:w="2370"/>
+        <w:gridCol w:w="1230"/>
+      </w:tblGrid>
+      <w:tr>
+        <w:trPr>
+          <w:trHeight w:val="465" w:hRule="atLeast"/>
+        </w:trPr>
+        <w:tc>
+          <w:tcPr>
+            <w:tcW w:w="2220" w:type="dxa"/>
+          </w:tcPr>
+          <w:p>
+            <w:pPr/>
+            <w:r>
+              <w:rPr>
+                <w:b/>
+              </w:rPr>
+              <w:t xml:space="preserve">Requirement ID</w:t>
+            </w:r>
+          </w:p>
+        </w:tc>
+        <w:tc>
+          <w:tcPr>
+            <w:tcW w:w="3525" w:type="dxa"/>
+          </w:tcPr>
+          <w:p>
+            <w:pPr/>
+            <w:r>
+              <w:t xml:space="preserve">REQ_F4118.25.8</w:t>
+            </w:r>
+          </w:p>
+        </w:tc>
+        <w:tc>
+          <w:tcPr>
+            <w:tcW w:w="2370" w:type="dxa"/>
+          </w:tcPr>
+          <w:p>
+            <w:pPr/>
+            <w:r>
+              <w:rPr>
+                <w:b/>
+              </w:rPr>
+              <w:t xml:space="preserve">Version</w:t>
+            </w:r>
+          </w:p>
+        </w:tc>
+        <w:tc>
+          <w:tcPr>
+            <w:tcW w:w="1230" w:type="dxa"/>
+          </w:tcPr>
+          <w:p>
+            <w:pPr/>
+            <w:r>
+              <w:t xml:space="preserve">1.0</w:t>
+            </w:r>
+          </w:p>
+        </w:tc>
+      </w:tr>
+      <w:tr>
+        <w:trPr>
+          <w:trHeight w:val="465" w:hRule="atLeast"/>
+        </w:trPr>
+        <w:tc>
+          <w:tcPr>
+            <w:tcW w:w="2220" w:type="dxa"/>
+          </w:tcPr>
+          <w:p>
+            <w:pPr/>
+            <w:r>
+              <w:rPr>
+                <w:b/>
+              </w:rPr>
+              <w:t xml:space="preserve">Description</w:t>
+            </w:r>
+          </w:p>
+        </w:tc>
+        <w:tc>
+          <w:tcPr>
+            <w:tcW w:w="7125" w:type="dxa"/>
+            <w:gridSpan w:val="3"/>
+          </w:tcPr>
+          <w:p>
+            <w:pPr/>
+            <w:r>
+              <w:t xml:space="preserve">System should allow authorized users to view a user's company access, organization and roles.</w:t>
+            </w:r>
+          </w:p>
+        </w:tc>
+      </w:tr>
+      <w:tr>
+        <w:trPr>
+          <w:trHeight w:val="465" w:hRule="atLeast"/>
+        </w:trPr>
+        <w:tc>
+          <w:tcPr>
+            <w:tcW w:w="2220" w:type="dxa"/>
+          </w:tcPr>
+          <w:p>
+            <w:pPr/>
+            <w:r>
+              <w:rPr>
+                <w:b/>
+              </w:rPr>
+              <w:t xml:space="preserve">Author</w:t>
+            </w:r>
+          </w:p>
+        </w:tc>
+        <w:tc>
+          <w:tcPr>
+            <w:tcW w:w="7125" w:type="dxa"/>
+            <w:gridSpan w:val="3"/>
+          </w:tcPr>
+          <w:p>
+            <w:pPr/>
+            <w:r>
+              <w:t xml:space="preserve">Developer</w:t>
+            </w:r>
+          </w:p>
+        </w:tc>
+      </w:tr>
+    </w:tbl>
+    <w:p/>
+    <w:p>
+      <w:pPr>
+        <w:pStyle w:val="Heading5"/>
+      </w:pPr>
+      <w:r>
+        <w:t xml:space="preserve">4.1.1.8.26 Web Security Middleware</w:t>
+      </w:r>
+    </w:p>
+    <w:tbl>
+      <w:tblPr>
+        <w:tblStyle w:val="TableGrid"/>
+        <w:tblW w:w="9345" w:type="dxa"/>
+        <w:jc w:val="left"/>
+        <w:tblBorders>
+          <w:top w:val="single" w:color="000000" w:sz="8" w:space="0"/>
+          <w:left w:val="single" w:color="000000" w:sz="8" w:space="0"/>
+          <w:bottom w:val="single" w:color="000000" w:sz="8" w:space="0"/>
+          <w:right w:val="single" w:color="000000" w:sz="8" w:space="0"/>
+          <w:insideH w:val="single" w:color="000000" w:sz="8" w:space="0"/>
+          <w:insideV w:val="single" w:color="000000" w:sz="8" w:space="0"/>
+        </w:tblBorders>
+        <w:tblLayout w:type="fixed"/>
+        <w:tblCellMar>
+          <w:top w:w="100" w:type="dxa"/>
+          <w:left w:w="100" w:type="dxa"/>
+          <w:bottom w:w="100" w:type="dxa"/>
+          <w:right w:w="100" w:type="dxa"/>
+        </w:tblCellMar>
+      </w:tblPr>
+      <w:tblGrid>
+        <w:gridCol w:w="2220"/>
+        <w:gridCol w:w="3525"/>
+        <w:gridCol w:w="2370"/>
+        <w:gridCol w:w="1230"/>
+      </w:tblGrid>
+      <w:tr>
+        <w:trPr>
+          <w:trHeight w:val="465" w:hRule="atLeast"/>
+        </w:trPr>
+        <w:tc>
+          <w:tcPr>
+            <w:tcW w:w="2220" w:type="dxa"/>
+          </w:tcPr>
+          <w:p>
+            <w:pPr/>
+            <w:r>
+              <w:rPr>
+                <w:b/>
+              </w:rPr>
+              <w:t xml:space="preserve">Requirement ID</w:t>
+            </w:r>
+          </w:p>
+        </w:tc>
+        <w:tc>
+          <w:tcPr>
+            <w:tcW w:w="3525" w:type="dxa"/>
+          </w:tcPr>
+          <w:p>
+            <w:pPr/>
+            <w:r>
+              <w:t xml:space="preserve">REQ_F4118.26.1</w:t>
+            </w:r>
+          </w:p>
+        </w:tc>
+        <w:tc>
+          <w:tcPr>
+            <w:tcW w:w="2370" w:type="dxa"/>
+          </w:tcPr>
+          <w:p>
+            <w:pPr/>
+            <w:r>
+              <w:rPr>
+                <w:b/>
+              </w:rPr>
+              <w:t xml:space="preserve">Version</w:t>
+            </w:r>
+          </w:p>
+        </w:tc>
+        <w:tc>
+          <w:tcPr>
+            <w:tcW w:w="1230" w:type="dxa"/>
+          </w:tcPr>
+          <w:p>
+            <w:pPr/>
+            <w:r>
+              <w:t xml:space="preserve">1.0</w:t>
+            </w:r>
+          </w:p>
+        </w:tc>
+      </w:tr>
+      <w:tr>
+        <w:trPr>
+          <w:trHeight w:val="465" w:hRule="atLeast"/>
+        </w:trPr>
+        <w:tc>
+          <w:tcPr>
+            <w:tcW w:w="2220" w:type="dxa"/>
+          </w:tcPr>
+          <w:p>
+            <w:pPr/>
+            <w:r>
+              <w:rPr>
+                <w:b/>
+              </w:rPr>
+              <w:t xml:space="preserve">Description</w:t>
+            </w:r>
+          </w:p>
+        </w:tc>
+        <w:tc>
+          <w:tcPr>
+            <w:tcW w:w="7125" w:type="dxa"/>
+            <w:gridSpan w:val="3"/>
+          </w:tcPr>
+          <w:p>
+            <w:pPr/>
+            <w:r>
+              <w:t xml:space="preserve">System should enforce HTTPS with HSTS outside the development environment.</w:t>
+            </w:r>
+          </w:p>
+        </w:tc>
+      </w:tr>
+      <w:tr>
+        <w:trPr>
+          <w:trHeight w:val="465" w:hRule="atLeast"/>
+        </w:trPr>
+        <w:tc>
+          <w:tcPr>
+            <w:tcW w:w="2220" w:type="dxa"/>
+          </w:tcPr>
+          <w:p>
+            <w:pPr/>
+            <w:r>
+              <w:rPr>
+                <w:b/>
+              </w:rPr>
+              <w:t xml:space="preserve">Author</w:t>
+            </w:r>
+          </w:p>
+        </w:tc>
+        <w:tc>
+          <w:tcPr>
+            <w:tcW w:w="7125" w:type="dxa"/>
+            <w:gridSpan w:val="3"/>
+          </w:tcPr>
+          <w:p>
+            <w:pPr/>
+            <w:r>
+              <w:t xml:space="preserve">Developer</w:t>
+            </w:r>
+          </w:p>
+        </w:tc>
+      </w:tr>
+    </w:tbl>
+    <w:p/>
+    <w:tbl>
+      <w:tblPr>
+        <w:tblStyle w:val="TableGrid"/>
+        <w:tblW w:w="9345" w:type="dxa"/>
+        <w:jc w:val="left"/>
+        <w:tblBorders>
+          <w:top w:val="single" w:color="000000" w:sz="8" w:space="0"/>
+          <w:left w:val="single" w:color="000000" w:sz="8" w:space="0"/>
+          <w:bottom w:val="single" w:color="000000" w:sz="8" w:space="0"/>
+          <w:right w:val="single" w:color="000000" w:sz="8" w:space="0"/>
+          <w:insideH w:val="single" w:color="000000" w:sz="8" w:space="0"/>
+          <w:insideV w:val="single" w:color="000000" w:sz="8" w:space="0"/>
+        </w:tblBorders>
+        <w:tblLayout w:type="fixed"/>
+        <w:tblCellMar>
+          <w:top w:w="100" w:type="dxa"/>
+          <w:left w:w="100" w:type="dxa"/>
+          <w:bottom w:w="100" w:type="dxa"/>
+          <w:right w:w="100" w:type="dxa"/>
+        </w:tblCellMar>
+      </w:tblPr>
+      <w:tblGrid>
+        <w:gridCol w:w="2220"/>
+        <w:gridCol w:w="3525"/>
+        <w:gridCol w:w="2370"/>
+        <w:gridCol w:w="1230"/>
+      </w:tblGrid>
+      <w:tr>
+        <w:trPr>
+          <w:trHeight w:val="465" w:hRule="atLeast"/>
+        </w:trPr>
+        <w:tc>
+          <w:tcPr>
+            <w:tcW w:w="2220" w:type="dxa"/>
+          </w:tcPr>
+          <w:p>
+            <w:pPr/>
+            <w:r>
+              <w:rPr>
+                <w:b/>
+              </w:rPr>
+              <w:t xml:space="preserve">Requirement ID</w:t>
+            </w:r>
+          </w:p>
+        </w:tc>
+        <w:tc>
+          <w:tcPr>
+            <w:tcW w:w="3525" w:type="dxa"/>
+          </w:tcPr>
+          <w:p>
+            <w:pPr/>
+            <w:r>
+              <w:t xml:space="preserve">REQ_F4118.26.2</w:t>
+            </w:r>
+          </w:p>
+        </w:tc>
+        <w:tc>
+          <w:tcPr>
+            <w:tcW w:w="2370" w:type="dxa"/>
+          </w:tcPr>
+          <w:p>
+            <w:pPr/>
+            <w:r>
+              <w:rPr>
+                <w:b/>
+              </w:rPr>
+              <w:t xml:space="preserve">Version</w:t>
+            </w:r>
+          </w:p>
+        </w:tc>
+        <w:tc>
+          <w:tcPr>
+            <w:tcW w:w="1230" w:type="dxa"/>
+          </w:tcPr>
+          <w:p>
+            <w:pPr/>
+            <w:r>
+              <w:t xml:space="preserve">1.0</w:t>
+            </w:r>
+          </w:p>
+        </w:tc>
+      </w:tr>
+      <w:tr>
+        <w:trPr>
+          <w:trHeight w:val="465" w:hRule="atLeast"/>
+        </w:trPr>
+        <w:tc>
+          <w:tcPr>
+            <w:tcW w:w="2220" w:type="dxa"/>
+          </w:tcPr>
+          <w:p>
+            <w:pPr/>
+            <w:r>
+              <w:rPr>
+                <w:b/>
+              </w:rPr>
+              <w:t xml:space="preserve">Description</w:t>
+            </w:r>
+          </w:p>
+        </w:tc>
+        <w:tc>
+          <w:tcPr>
+            <w:tcW w:w="7125" w:type="dxa"/>
+            <w:gridSpan w:val="3"/>
+          </w:tcPr>
+          <w:p>
+            <w:pPr/>
+            <w:r>
+              <w:t xml:space="preserve">System should allow cross-origin requests only from configured frontend origins.</w:t>
+            </w:r>
+          </w:p>
+        </w:tc>
+      </w:tr>
+      <w:tr>
+        <w:trPr>
+          <w:trHeight w:val="465" w:hRule="atLeast"/>
+        </w:trPr>
+        <w:tc>
+          <w:tcPr>
+            <w:tcW w:w="2220" w:type="dxa"/>
+          </w:tcPr>
+          <w:p>
+            <w:pPr/>
+            <w:r>
+              <w:rPr>
+                <w:b/>
+              </w:rPr>
+              <w:t xml:space="preserve">Author</w:t>
+            </w:r>
+          </w:p>
+        </w:tc>
+        <w:tc>
+          <w:tcPr>
+            <w:tcW w:w="7125" w:type="dxa"/>
+            <w:gridSpan w:val="3"/>
+          </w:tcPr>
+          <w:p>
+            <w:pPr/>
+            <w:r>
+              <w:t xml:space="preserve">Developer</w:t>
+            </w:r>
+          </w:p>
+        </w:tc>
+      </w:tr>
+    </w:tbl>
+    <w:p/>
+    <w:tbl>
+      <w:tblPr>
+        <w:tblStyle w:val="TableGrid"/>
+        <w:tblW w:w="9345" w:type="dxa"/>
+        <w:jc w:val="left"/>
+        <w:tblBorders>
+          <w:top w:val="single" w:color="000000" w:sz="8" w:space="0"/>
+          <w:left w:val="single" w:color="000000" w:sz="8" w:space="0"/>
+          <w:bottom w:val="single" w:color="000000" w:sz="8" w:space="0"/>
+          <w:right w:val="single" w:color="000000" w:sz="8" w:space="0"/>
+          <w:insideH w:val="single" w:color="000000" w:sz="8" w:space="0"/>
+          <w:insideV w:val="single" w:color="000000" w:sz="8" w:space="0"/>
+        </w:tblBorders>
+        <w:tblLayout w:type="fixed"/>
+        <w:tblCellMar>
+          <w:top w:w="100" w:type="dxa"/>
+          <w:left w:w="100" w:type="dxa"/>
+          <w:bottom w:w="100" w:type="dxa"/>
+          <w:right w:w="100" w:type="dxa"/>
+        </w:tblCellMar>
+      </w:tblPr>
+      <w:tblGrid>
+        <w:gridCol w:w="2220"/>
+        <w:gridCol w:w="3525"/>
+        <w:gridCol w:w="2370"/>
+        <w:gridCol w:w="1230"/>
+      </w:tblGrid>
+      <w:tr>
+        <w:trPr>
+          <w:trHeight w:val="465" w:hRule="atLeast"/>
+        </w:trPr>
+        <w:tc>
+          <w:tcPr>
+            <w:tcW w:w="2220" w:type="dxa"/>
+          </w:tcPr>
+          <w:p>
+            <w:pPr/>
+            <w:r>
+              <w:rPr>
+                <w:b/>
+              </w:rPr>
+              <w:t xml:space="preserve">Requirement ID</w:t>
+            </w:r>
+          </w:p>
+        </w:tc>
+        <w:tc>
+          <w:tcPr>
+            <w:tcW w:w="3525" w:type="dxa"/>
+          </w:tcPr>
+          <w:p>
+            <w:pPr/>
+            <w:r>
+              <w:t xml:space="preserve">REQ_F4118.26.3</w:t>
+            </w:r>
+          </w:p>
+        </w:tc>
+        <w:tc>
+          <w:tcPr>
+            <w:tcW w:w="2370" w:type="dxa"/>
+          </w:tcPr>
+          <w:p>
+            <w:pPr/>
+            <w:r>
+              <w:rPr>
+                <w:b/>
+              </w:rPr>
+              <w:t xml:space="preserve">Version</w:t>
+            </w:r>
+          </w:p>
+        </w:tc>
+        <w:tc>
+          <w:tcPr>
+            <w:tcW w:w="1230" w:type="dxa"/>
+          </w:tcPr>
+          <w:p>
+            <w:pPr/>
+            <w:r>
+              <w:t xml:space="preserve">1.0</w:t>
+            </w:r>
+          </w:p>
+        </w:tc>
+      </w:tr>
+      <w:tr>
+        <w:trPr>
+          <w:trHeight w:val="465" w:hRule="atLeast"/>
+        </w:trPr>
+        <w:tc>
+          <w:tcPr>
+            <w:tcW w:w="2220" w:type="dxa"/>
+          </w:tcPr>
+          <w:p>
+            <w:pPr/>
+            <w:r>
+              <w:rPr>
+                <w:b/>
+              </w:rPr>
+              <w:t xml:space="preserve">Description</w:t>
+            </w:r>
+          </w:p>
+        </w:tc>
+        <w:tc>
+          <w:tcPr>
+            <w:tcW w:w="7125" w:type="dxa"/>
+            <w:gridSpan w:val="3"/>
+          </w:tcPr>
+          <w:p>
+            <w:pPr/>
+            <w:r>
+              <w:t xml:space="preserve">System should rate-limit login, token refresh and captcha requests per client IP.</w:t>
+            </w:r>
+          </w:p>
+        </w:tc>
+      </w:tr>
+      <w:tr>
+        <w:trPr>
+          <w:trHeight w:val="465" w:hRule="atLeast"/>
+        </w:trPr>
+        <w:tc>
+          <w:tcPr>
+            <w:tcW w:w="2220" w:type="dxa"/>
+          </w:tcPr>
+          <w:p>
+            <w:pPr/>
+            <w:r>
+              <w:rPr>
+                <w:b/>
+              </w:rPr>
+              <w:t xml:space="preserve">Author</w:t>
+            </w:r>
+          </w:p>
+        </w:tc>
+        <w:tc>
+          <w:tcPr>
+            <w:tcW w:w="7125" w:type="dxa"/>
+            <w:gridSpan w:val="3"/>
+          </w:tcPr>
+          <w:p>
+            <w:pPr/>
+            <w:r>
+              <w:t xml:space="preserve">Developer</w:t>
+            </w:r>
+          </w:p>
+        </w:tc>
+      </w:tr>
+    </w:tbl>
+    <w:p/>
+    <w:tbl>
+      <w:tblPr>
+        <w:tblStyle w:val="TableGrid"/>
+        <w:tblW w:w="9345" w:type="dxa"/>
+        <w:jc w:val="left"/>
+        <w:tblBorders>
+          <w:top w:val="single" w:color="000000" w:sz="8" w:space="0"/>
+          <w:left w:val="single" w:color="000000" w:sz="8" w:space="0"/>
+          <w:bottom w:val="single" w:color="000000" w:sz="8" w:space="0"/>
+          <w:right w:val="single" w:color="000000" w:sz="8" w:space="0"/>
+          <w:insideH w:val="single" w:color="000000" w:sz="8" w:space="0"/>
+          <w:insideV w:val="single" w:color="000000" w:sz="8" w:space="0"/>
+        </w:tblBorders>
+        <w:tblLayout w:type="fixed"/>
+        <w:tblCellMar>
+          <w:top w:w="100" w:type="dxa"/>
+          <w:left w:w="100" w:type="dxa"/>
+          <w:bottom w:w="100" w:type="dxa"/>
+          <w:right w:w="100" w:type="dxa"/>
+        </w:tblCellMar>
+      </w:tblPr>
+      <w:tblGrid>
+        <w:gridCol w:w="2220"/>
+        <w:gridCol w:w="3525"/>
+        <w:gridCol w:w="2370"/>
+        <w:gridCol w:w="1230"/>
+      </w:tblGrid>
+      <w:tr>
+        <w:trPr>
+          <w:trHeight w:val="465" w:hRule="atLeast"/>
+        </w:trPr>
+        <w:tc>
+          <w:tcPr>
+            <w:tcW w:w="2220" w:type="dxa"/>
+          </w:tcPr>
+          <w:p>
+            <w:pPr/>
+            <w:r>
+              <w:rPr>
+                <w:b/>
+              </w:rPr>
+              <w:t xml:space="preserve">Requirement ID</w:t>
+            </w:r>
+          </w:p>
+        </w:tc>
+        <w:tc>
+          <w:tcPr>
+            <w:tcW w:w="3525" w:type="dxa"/>
+          </w:tcPr>
+          <w:p>
+            <w:pPr/>
+            <w:r>
+              <w:t xml:space="preserve">REQ_F4118.26.4</w:t>
+            </w:r>
+          </w:p>
+        </w:tc>
+        <w:tc>
+          <w:tcPr>
+            <w:tcW w:w="2370" w:type="dxa"/>
+          </w:tcPr>
+          <w:p>
+            <w:pPr/>
+            <w:r>
+              <w:rPr>
+                <w:b/>
+              </w:rPr>
+              <w:t xml:space="preserve">Version</w:t>
+            </w:r>
+          </w:p>
+        </w:tc>
+        <w:tc>
+          <w:tcPr>
+            <w:tcW w:w="1230" w:type="dxa"/>
+          </w:tcPr>
+          <w:p>
+            <w:pPr/>
+            <w:r>
+              <w:t xml:space="preserve">1.0</w:t>
+            </w:r>
+          </w:p>
+        </w:tc>
+      </w:tr>
+      <w:tr>
+        <w:trPr>
+          <w:trHeight w:val="465" w:hRule="atLeast"/>
+        </w:trPr>
+        <w:tc>
+          <w:tcPr>
+            <w:tcW w:w="2220" w:type="dxa"/>
+          </w:tcPr>
+          <w:p>
+            <w:pPr/>
+            <w:r>
+              <w:rPr>
+                <w:b/>
+              </w:rPr>
+              <w:t xml:space="preserve">Description</w:t>
+            </w:r>
+          </w:p>
+        </w:tc>
+        <w:tc>
+          <w:tcPr>
+            <w:tcW w:w="7125" w:type="dxa"/>
+            <w:gridSpan w:val="3"/>
+          </w:tcPr>
+          <w:p>
+            <w:pPr/>
+            <w:r>
+              <w:t xml:space="preserve">System should rate-limit authenticated API requests per user.</w:t>
+            </w:r>
+          </w:p>
+        </w:tc>
+      </w:tr>
+      <w:tr>
+        <w:trPr>
+          <w:trHeight w:val="465" w:hRule="atLeast"/>
+        </w:trPr>
+        <w:tc>
+          <w:tcPr>
+            <w:tcW w:w="2220" w:type="dxa"/>
+          </w:tcPr>
+          <w:p>
+            <w:pPr/>
+            <w:r>
+              <w:rPr>
+                <w:b/>
+              </w:rPr>
+              <w:t xml:space="preserve">Author</w:t>
+            </w:r>
+          </w:p>
+        </w:tc>
+        <w:tc>
+          <w:tcPr>
+            <w:tcW w:w="7125" w:type="dxa"/>
+            <w:gridSpan w:val="3"/>
+          </w:tcPr>
+          <w:p>
+            <w:pPr/>
+            <w:r>
+              <w:t xml:space="preserve">Developer</w:t>
+            </w:r>
+          </w:p>
+        </w:tc>
+      </w:tr>
+    </w:tbl>
+    <w:p/>
+    <w:tbl>
+      <w:tblPr>
+        <w:tblStyle w:val="TableGrid"/>
+        <w:tblW w:w="9345" w:type="dxa"/>
+        <w:jc w:val="left"/>
+        <w:tblBorders>
+          <w:top w:val="single" w:color="000000" w:sz="8" w:space="0"/>
+          <w:left w:val="single" w:color="000000" w:sz="8" w:space="0"/>
+          <w:bottom w:val="single" w:color="000000" w:sz="8" w:space="0"/>
+          <w:right w:val="single" w:color="000000" w:sz="8" w:space="0"/>
+          <w:insideH w:val="single" w:color="000000" w:sz="8" w:space="0"/>
+          <w:insideV w:val="single" w:color="000000" w:sz="8" w:space="0"/>
+        </w:tblBorders>
+        <w:tblLayout w:type="fixed"/>
+        <w:tblCellMar>
+          <w:top w:w="100" w:type="dxa"/>
+          <w:left w:w="100" w:type="dxa"/>
+          <w:bottom w:w="100" w:type="dxa"/>
+          <w:right w:w="100" w:type="dxa"/>
+        </w:tblCellMar>
+      </w:tblPr>
+      <w:tblGrid>
+        <w:gridCol w:w="2220"/>
+        <w:gridCol w:w="3525"/>
+        <w:gridCol w:w="2370"/>
+        <w:gridCol w:w="1230"/>
+      </w:tblGrid>
+      <w:tr>
+        <w:trPr>
+          <w:trHeight w:val="465" w:hRule="atLeast"/>
+        </w:trPr>
+        <w:tc>
+          <w:tcPr>
+            <w:tcW w:w="2220" w:type="dxa"/>
+          </w:tcPr>
+          <w:p>
+            <w:pPr/>
+            <w:r>
+              <w:rPr>
+                <w:b/>
+              </w:rPr>
+              <w:t xml:space="preserve">Requirement ID</w:t>
+            </w:r>
+          </w:p>
+        </w:tc>
+        <w:tc>
+          <w:tcPr>
+            <w:tcW w:w="3525" w:type="dxa"/>
+          </w:tcPr>
+          <w:p>
+            <w:pPr/>
+            <w:r>
+              <w:t xml:space="preserve">REQ_F4118.26.5</w:t>
+            </w:r>
+          </w:p>
+        </w:tc>
+        <w:tc>
+          <w:tcPr>
+            <w:tcW w:w="2370" w:type="dxa"/>
+          </w:tcPr>
+          <w:p>
+            <w:pPr/>
+            <w:r>
+              <w:rPr>
+                <w:b/>
+              </w:rPr>
+              <w:t xml:space="preserve">Version</w:t>
+            </w:r>
+          </w:p>
+        </w:tc>
+        <w:tc>
+          <w:tcPr>
+            <w:tcW w:w="1230" w:type="dxa"/>
+          </w:tcPr>
+          <w:p>
+            <w:pPr/>
+            <w:r>
+              <w:t xml:space="preserve">1.0</w:t>
+            </w:r>
+          </w:p>
+        </w:tc>
+      </w:tr>
+      <w:tr>
+        <w:trPr>
+          <w:trHeight w:val="465" w:hRule="atLeast"/>
+        </w:trPr>
+        <w:tc>
+          <w:tcPr>
+            <w:tcW w:w="2220" w:type="dxa"/>
+          </w:tcPr>
+          <w:p>
+            <w:pPr/>
+            <w:r>
+              <w:rPr>
+                <w:b/>
+              </w:rPr>
+              <w:t xml:space="preserve">Description</w:t>
+            </w:r>
+          </w:p>
+        </w:tc>
+        <w:tc>
+          <w:tcPr>
+            <w:tcW w:w="7125" w:type="dxa"/>
+            <w:gridSpan w:val="3"/>
+          </w:tcPr>
+          <w:p>
+            <w:pPr/>
+            <w:r>
+              <w:t xml:space="preserve">System should add security headers to every API response.</w:t>
+            </w:r>
+          </w:p>
+        </w:tc>
+      </w:tr>
+      <w:tr>
+        <w:trPr>
+          <w:trHeight w:val="465" w:hRule="atLeast"/>
+        </w:trPr>
+        <w:tc>
+          <w:tcPr>
+            <w:tcW w:w="2220" w:type="dxa"/>
+          </w:tcPr>
+          <w:p>
+            <w:pPr/>
+            <w:r>
+              <w:rPr>
+                <w:b/>
+              </w:rPr>
+              <w:t xml:space="preserve">Author</w:t>
+            </w:r>
+          </w:p>
+        </w:tc>
+        <w:tc>
+          <w:tcPr>
+            <w:tcW w:w="7125" w:type="dxa"/>
+            <w:gridSpan w:val="3"/>
+          </w:tcPr>
+          <w:p>
+            <w:pPr/>
+            <w:r>
+              <w:t xml:space="preserve">Developer</w:t>
+            </w:r>
+          </w:p>
+        </w:tc>
+      </w:tr>
+    </w:tbl>
+    <w:p/>
+    <w:tbl>
+      <w:tblPr>
+        <w:tblStyle w:val="TableGrid"/>
+        <w:tblW w:w="9345" w:type="dxa"/>
+        <w:jc w:val="left"/>
+        <w:tblBorders>
+          <w:top w:val="single" w:color="000000" w:sz="8" w:space="0"/>
+          <w:left w:val="single" w:color="000000" w:sz="8" w:space="0"/>
+          <w:bottom w:val="single" w:color="000000" w:sz="8" w:space="0"/>
+          <w:right w:val="single" w:color="000000" w:sz="8" w:space="0"/>
+          <w:insideH w:val="single" w:color="000000" w:sz="8" w:space="0"/>
+          <w:insideV w:val="single" w:color="000000" w:sz="8" w:space="0"/>
+        </w:tblBorders>
+        <w:tblLayout w:type="fixed"/>
+        <w:tblCellMar>
+          <w:top w:w="100" w:type="dxa"/>
+          <w:left w:w="100" w:type="dxa"/>
+          <w:bottom w:w="100" w:type="dxa"/>
+          <w:right w:w="100" w:type="dxa"/>
+        </w:tblCellMar>
+      </w:tblPr>
+      <w:tblGrid>
+        <w:gridCol w:w="2220"/>
+        <w:gridCol w:w="3525"/>
+        <w:gridCol w:w="2370"/>
+        <w:gridCol w:w="1230"/>
+      </w:tblGrid>
+      <w:tr>
+        <w:trPr>
+          <w:trHeight w:val="465" w:hRule="atLeast"/>
+        </w:trPr>
+        <w:tc>
+          <w:tcPr>
+            <w:tcW w:w="2220" w:type="dxa"/>
+          </w:tcPr>
+          <w:p>
+            <w:pPr/>
+            <w:r>
+              <w:rPr>
+                <w:b/>
+              </w:rPr>
+              <w:t xml:space="preserve">Requirement ID</w:t>
+            </w:r>
+          </w:p>
+        </w:tc>
+        <w:tc>
+          <w:tcPr>
+            <w:tcW w:w="3525" w:type="dxa"/>
+          </w:tcPr>
+          <w:p>
+            <w:pPr/>
+            <w:r>
+              <w:t xml:space="preserve">REQ_F4118.26.6</w:t>
+            </w:r>
+          </w:p>
+        </w:tc>
+        <w:tc>
+          <w:tcPr>
+            <w:tcW w:w="2370" w:type="dxa"/>
+          </w:tcPr>
+          <w:p>
+            <w:pPr/>
+            <w:r>
+              <w:rPr>
+                <w:b/>
+              </w:rPr>
+              <w:t xml:space="preserve">Version</w:t>
+            </w:r>
+          </w:p>
+        </w:tc>
+        <w:tc>
+          <w:tcPr>
+            <w:tcW w:w="1230" w:type="dxa"/>
+          </w:tcPr>
+          <w:p>
+            <w:pPr/>
+            <w:r>
+              <w:t xml:space="preserve">1.0</w:t>
+            </w:r>
+          </w:p>
+        </w:tc>
+      </w:tr>
+      <w:tr>
+        <w:trPr>
+          <w:trHeight w:val="465" w:hRule="atLeast"/>
+        </w:trPr>
+        <w:tc>
+          <w:tcPr>
+            <w:tcW w:w="2220" w:type="dxa"/>
+          </w:tcPr>
+          <w:p>
+            <w:pPr/>
+            <w:r>
+              <w:rPr>
+                <w:b/>
+              </w:rPr>
+              <w:t xml:space="preserve">Description</w:t>
+            </w:r>
+          </w:p>
+        </w:tc>
+        <w:tc>
+          <w:tcPr>
+            <w:tcW w:w="7125" w:type="dxa"/>
+            <w:gridSpan w:val="3"/>
+          </w:tcPr>
+          <w:p>
+            <w:pPr/>
+            <w:r>
+              <w:t xml:space="preserve">System should honour X-Forwarded-For only from configured proxies.</w:t>
+            </w:r>
+          </w:p>
+        </w:tc>
+      </w:tr>
+      <w:tr>
+        <w:trPr>
+          <w:trHeight w:val="465" w:hRule="atLeast"/>
+        </w:trPr>
+        <w:tc>
+          <w:tcPr>
+            <w:tcW w:w="2220" w:type="dxa"/>
+          </w:tcPr>
+          <w:p>
+            <w:pPr/>
+            <w:r>
+              <w:rPr>
+                <w:b/>
+              </w:rPr>
+              <w:t xml:space="preserve">Author</w:t>
+            </w:r>
+          </w:p>
+        </w:tc>
+        <w:tc>
+          <w:tcPr>
+            <w:tcW w:w="7125" w:type="dxa"/>
+            <w:gridSpan w:val="3"/>
+          </w:tcPr>
+          <w:p>
+            <w:pPr/>
+            <w:r>
+              <w:t xml:space="preserve">Developer</w:t>
+            </w:r>
+          </w:p>
+        </w:tc>
+      </w:tr>
+    </w:tbl>
+    <w:p/>
+    <w:tbl>
+      <w:tblPr>
+        <w:tblStyle w:val="TableGrid"/>
+        <w:tblW w:w="9345" w:type="dxa"/>
+        <w:jc w:val="left"/>
+        <w:tblBorders>
+          <w:top w:val="single" w:color="000000" w:sz="8" w:space="0"/>
+          <w:left w:val="single" w:color="000000" w:sz="8" w:space="0"/>
+          <w:bottom w:val="single" w:color="000000" w:sz="8" w:space="0"/>
+          <w:right w:val="single" w:color="000000" w:sz="8" w:space="0"/>
+          <w:insideH w:val="single" w:color="000000" w:sz="8" w:space="0"/>
+          <w:insideV w:val="single" w:color="000000" w:sz="8" w:space="0"/>
+        </w:tblBorders>
+        <w:tblLayout w:type="fixed"/>
+        <w:tblCellMar>
+          <w:top w:w="100" w:type="dxa"/>
+          <w:left w:w="100" w:type="dxa"/>
+          <w:bottom w:w="100" w:type="dxa"/>
+          <w:right w:w="100" w:type="dxa"/>
+        </w:tblCellMar>
+      </w:tblPr>
+      <w:tblGrid>
+        <w:gridCol w:w="2220"/>
+        <w:gridCol w:w="3525"/>
+        <w:gridCol w:w="2370"/>
+        <w:gridCol w:w="1230"/>
+      </w:tblGrid>
+      <w:tr>
+        <w:trPr>
+          <w:trHeight w:val="465" w:hRule="atLeast"/>
+        </w:trPr>
+        <w:tc>
+          <w:tcPr>
+            <w:tcW w:w="2220" w:type="dxa"/>
+          </w:tcPr>
+          <w:p>
+            <w:pPr/>
+            <w:r>
+              <w:rPr>
+                <w:b/>
+              </w:rPr>
+              <w:t xml:space="preserve">Requirement ID</w:t>
+            </w:r>
+          </w:p>
+        </w:tc>
+        <w:tc>
+          <w:tcPr>
+            <w:tcW w:w="3525" w:type="dxa"/>
+          </w:tcPr>
+          <w:p>
+            <w:pPr/>
+            <w:r>
+              <w:t xml:space="preserve">REQ_F4118.26.7</w:t>
+            </w:r>
+          </w:p>
+        </w:tc>
+        <w:tc>
+          <w:tcPr>
+            <w:tcW w:w="2370" w:type="dxa"/>
+          </w:tcPr>
+          <w:p>
+            <w:pPr/>
+            <w:r>
+              <w:rPr>
+                <w:b/>
+              </w:rPr>
+              <w:t xml:space="preserve">Version</w:t>
+            </w:r>
+          </w:p>
+        </w:tc>
+        <w:tc>
+          <w:tcPr>
+            <w:tcW w:w="1230" w:type="dxa"/>
+          </w:tcPr>
+          <w:p>
+            <w:pPr/>
+            <w:r>
+              <w:t xml:space="preserve">1.0</w:t>
+            </w:r>
+          </w:p>
+        </w:tc>
+      </w:tr>
+      <w:tr>
+        <w:trPr>
+          <w:trHeight w:val="465" w:hRule="atLeast"/>
+        </w:trPr>
+        <w:tc>
+          <w:tcPr>
+            <w:tcW w:w="2220" w:type="dxa"/>
+          </w:tcPr>
+          <w:p>
+            <w:pPr/>
+            <w:r>
+              <w:rPr>
+                <w:b/>
+              </w:rPr>
+              <w:t xml:space="preserve">Description</w:t>
+            </w:r>
+          </w:p>
+        </w:tc>
+        <w:tc>
+          <w:tcPr>
+            <w:tcW w:w="7125" w:type="dxa"/>
+            <w:gridSpan w:val="3"/>
+          </w:tcPr>
+          <w:p>
+            <w:pPr/>
+            <w:r>
+              <w:t xml:space="preserve">System should show a trilingual "too many requests" message when an API call is rate-limited.</w:t>
+            </w:r>
+          </w:p>
+        </w:tc>
+      </w:tr>
+      <w:tr>
+        <w:trPr>
+          <w:trHeight w:val="465" w:hRule="atLeast"/>
+        </w:trPr>
+        <w:tc>
+          <w:tcPr>
+            <w:tcW w:w="2220" w:type="dxa"/>
+          </w:tcPr>
+          <w:p>
+            <w:pPr/>
+            <w:r>
+              <w:rPr>
+                <w:b/>
+              </w:rPr>
+              <w:t xml:space="preserve">Author</w:t>
+            </w:r>
+          </w:p>
+        </w:tc>
+        <w:tc>
+          <w:tcPr>
+            <w:tcW w:w="7125" w:type="dxa"/>
+            <w:gridSpan w:val="3"/>
+          </w:tcPr>
+          <w:p>
+            <w:pPr/>
+            <w:r>
+              <w:t xml:space="preserve">Developer</w:t>
+            </w:r>
+          </w:p>
+        </w:tc>
+      </w:tr>
+    </w:tbl>
+    <w:p/>
     <w:p>
       <w:pPr>
         <w:pStyle w:val="Heading2"/>
@@ -12119,6 +13295,3025 @@
             <w:pPr/>
             <w:r>
               <w:t xml:space="preserve">REQ_IO_A8.61.2</w:t>
+            </w:r>
+          </w:p>
+        </w:tc>
+      </w:tr>
+      <w:tr>
+        <w:tc>
+          <w:tcPr>
+            <w:tcW w:w="2340" w:type="dxa"/>
+          </w:tcPr>
+          <w:p>
+            <w:pPr/>
+            <w:r>
+              <w:rPr>
+                <w:b/>
+              </w:rPr>
+              <w:t xml:space="preserve">Author</w:t>
+            </w:r>
+          </w:p>
+        </w:tc>
+        <w:tc>
+          <w:tcPr>
+            <w:tcW w:w="7020" w:type="dxa"/>
+            <w:gridSpan w:val="3"/>
+          </w:tcPr>
+          <w:p>
+            <w:pPr/>
+            <w:r>
+              <w:t xml:space="preserve">Developer</w:t>
+            </w:r>
+          </w:p>
+        </w:tc>
+      </w:tr>
+    </w:tbl>
+    <w:p/>
+    <w:p>
+      <w:pPr>
+        <w:pStyle w:val="Heading5"/>
+      </w:pPr>
+      <w:r>
+        <w:t xml:space="preserve">4.4.1.8.64 Role Maintenance Interface</w:t>
+      </w:r>
+    </w:p>
+    <w:tbl>
+      <w:tblPr>
+        <w:tblStyle w:val="TableGrid"/>
+        <w:tblW w:w="9360" w:type="dxa"/>
+        <w:jc w:val="left"/>
+        <w:tblBorders>
+          <w:top w:val="single" w:color="000000" w:sz="6" w:space="0"/>
+          <w:left w:val="single" w:color="000000" w:sz="6" w:space="0"/>
+          <w:bottom w:val="single" w:color="000000" w:sz="6" w:space="0"/>
+          <w:right w:val="single" w:color="000000" w:sz="6" w:space="0"/>
+          <w:insideH w:val="single" w:color="000000" w:sz="6" w:space="0"/>
+          <w:insideV w:val="single" w:color="000000" w:sz="6" w:space="0"/>
+        </w:tblBorders>
+        <w:tblLayout w:type="fixed"/>
+        <w:tblCellMar>
+          <w:top w:w="100" w:type="dxa"/>
+          <w:left w:w="100" w:type="dxa"/>
+          <w:bottom w:w="100" w:type="dxa"/>
+          <w:right w:w="100" w:type="dxa"/>
+        </w:tblCellMar>
+      </w:tblPr>
+      <w:tblGrid>
+        <w:gridCol w:w="2340"/>
+        <w:gridCol w:w="2340"/>
+        <w:gridCol w:w="2340"/>
+        <w:gridCol w:w="2340"/>
+      </w:tblGrid>
+      <w:tr>
+        <w:tc>
+          <w:tcPr>
+            <w:tcW w:w="2340" w:type="dxa"/>
+          </w:tcPr>
+          <w:p>
+            <w:pPr/>
+            <w:r>
+              <w:rPr>
+                <w:b/>
+              </w:rPr>
+              <w:t xml:space="preserve">Requirement ID</w:t>
+            </w:r>
+          </w:p>
+        </w:tc>
+        <w:tc>
+          <w:tcPr>
+            <w:tcW w:w="2340" w:type="dxa"/>
+          </w:tcPr>
+          <w:p>
+            <w:pPr/>
+            <w:r>
+              <w:t xml:space="preserve">REQ_IO_A8.64.1</w:t>
+            </w:r>
+          </w:p>
+        </w:tc>
+        <w:tc>
+          <w:tcPr>
+            <w:tcW w:w="2340" w:type="dxa"/>
+          </w:tcPr>
+          <w:p>
+            <w:pPr/>
+            <w:r>
+              <w:rPr>
+                <w:b/>
+              </w:rPr>
+              <w:t xml:space="preserve">Version</w:t>
+            </w:r>
+          </w:p>
+        </w:tc>
+        <w:tc>
+          <w:tcPr>
+            <w:tcW w:w="2340" w:type="dxa"/>
+          </w:tcPr>
+          <w:p>
+            <w:pPr/>
+            <w:r>
+              <w:t xml:space="preserve">1.0</w:t>
+            </w:r>
+          </w:p>
+        </w:tc>
+      </w:tr>
+      <w:tr>
+        <w:tc>
+          <w:tcPr>
+            <w:tcW w:w="2340" w:type="dxa"/>
+          </w:tcPr>
+          <w:p>
+            <w:pPr/>
+            <w:r>
+              <w:rPr>
+                <w:b/>
+              </w:rPr>
+              <w:t xml:space="preserve">Item</w:t>
+            </w:r>
+          </w:p>
+        </w:tc>
+        <w:tc>
+          <w:tcPr>
+            <w:tcW w:w="7020" w:type="dxa"/>
+            <w:gridSpan w:val="3"/>
+          </w:tcPr>
+          <w:p>
+            <w:pPr/>
+            <w:r>
+              <w:t xml:space="preserve">Role Code (Input)</w:t>
+            </w:r>
+          </w:p>
+        </w:tc>
+      </w:tr>
+      <w:tr>
+        <w:tc>
+          <w:tcPr>
+            <w:tcW w:w="2340" w:type="dxa"/>
+          </w:tcPr>
+          <w:p>
+            <w:pPr/>
+            <w:r>
+              <w:rPr>
+                <w:b/>
+              </w:rPr>
+              <w:t xml:space="preserve">Description</w:t>
+            </w:r>
+          </w:p>
+        </w:tc>
+        <w:tc>
+          <w:tcPr>
+            <w:tcW w:w="7020" w:type="dxa"/>
+            <w:gridSpan w:val="3"/>
+          </w:tcPr>
+          <w:p>
+            <w:pPr/>
+            <w:r>
+              <w:t xml:space="preserve">角色代碼</w:t>
+            </w:r>
+          </w:p>
+        </w:tc>
+      </w:tr>
+      <w:tr>
+        <w:tc>
+          <w:tcPr>
+            <w:tcW w:w="2340" w:type="dxa"/>
+          </w:tcPr>
+          <w:p>
+            <w:pPr/>
+            <w:r>
+              <w:rPr>
+                <w:b/>
+              </w:rPr>
+              <w:t xml:space="preserve">Purpose</w:t>
+            </w:r>
+          </w:p>
+        </w:tc>
+        <w:tc>
+          <w:tcPr>
+            <w:tcW w:w="7020" w:type="dxa"/>
+            <w:gridSpan w:val="3"/>
+          </w:tcPr>
+          <w:p>
+            <w:pPr/>
+            <w:r>
+              <w:t xml:space="preserve">全系統唯一識別角色</w:t>
+            </w:r>
+          </w:p>
+        </w:tc>
+      </w:tr>
+      <w:tr>
+        <w:tc>
+          <w:tcPr>
+            <w:tcW w:w="2340" w:type="dxa"/>
+          </w:tcPr>
+          <w:p>
+            <w:pPr/>
+            <w:r>
+              <w:rPr>
+                <w:b/>
+              </w:rPr>
+              <w:t xml:space="preserve">Format</w:t>
+            </w:r>
+          </w:p>
+        </w:tc>
+        <w:tc>
+          <w:tcPr>
+            <w:tcW w:w="2340" w:type="dxa"/>
+          </w:tcPr>
+          <w:p>
+            <w:pPr/>
+            <w:r>
+              <w:t xml:space="preserve">VARCHAR(50)</w:t>
+            </w:r>
+          </w:p>
+        </w:tc>
+        <w:tc>
+          <w:tcPr>
+            <w:tcW w:w="2340" w:type="dxa"/>
+          </w:tcPr>
+          <w:p>
+            <w:pPr/>
+            <w:r>
+              <w:rPr>
+                <w:b/>
+              </w:rPr>
+              <w:t xml:space="preserve">Valid Range</w:t>
+            </w:r>
+          </w:p>
+        </w:tc>
+        <w:tc>
+          <w:tcPr>
+            <w:tcW w:w="2340" w:type="dxa"/>
+          </w:tcPr>
+          <w:p>
+            <w:pPr/>
+            <w:r>
+              <w:t xml:space="preserve">1–50 字元；ASCII 英文、數字、-、_；保存為大寫；建立後不可修改</w:t>
+            </w:r>
+          </w:p>
+        </w:tc>
+      </w:tr>
+      <w:tr>
+        <w:tc>
+          <w:tcPr>
+            <w:tcW w:w="2340" w:type="dxa"/>
+          </w:tcPr>
+          <w:p>
+            <w:pPr/>
+            <w:r>
+              <w:rPr>
+                <w:b/>
+              </w:rPr>
+              <w:t xml:space="preserve">Related I/O</w:t>
+            </w:r>
+          </w:p>
+        </w:tc>
+        <w:tc>
+          <w:tcPr>
+            <w:tcW w:w="7020" w:type="dxa"/>
+            <w:gridSpan w:val="3"/>
+          </w:tcPr>
+          <w:p>
+            <w:pPr/>
+            <w:r>
+              <w:t xml:space="preserve">None</w:t>
+            </w:r>
+          </w:p>
+        </w:tc>
+      </w:tr>
+      <w:tr>
+        <w:tc>
+          <w:tcPr>
+            <w:tcW w:w="2340" w:type="dxa"/>
+          </w:tcPr>
+          <w:p>
+            <w:pPr/>
+            <w:r>
+              <w:rPr>
+                <w:b/>
+              </w:rPr>
+              <w:t xml:space="preserve">Author</w:t>
+            </w:r>
+          </w:p>
+        </w:tc>
+        <w:tc>
+          <w:tcPr>
+            <w:tcW w:w="7020" w:type="dxa"/>
+            <w:gridSpan w:val="3"/>
+          </w:tcPr>
+          <w:p>
+            <w:pPr/>
+            <w:r>
+              <w:t xml:space="preserve">Developer</w:t>
+            </w:r>
+          </w:p>
+        </w:tc>
+      </w:tr>
+    </w:tbl>
+    <w:p/>
+    <w:tbl>
+      <w:tblPr>
+        <w:tblStyle w:val="TableGrid"/>
+        <w:tblW w:w="9360" w:type="dxa"/>
+        <w:jc w:val="left"/>
+        <w:tblBorders>
+          <w:top w:val="single" w:color="000000" w:sz="6" w:space="0"/>
+          <w:left w:val="single" w:color="000000" w:sz="6" w:space="0"/>
+          <w:bottom w:val="single" w:color="000000" w:sz="6" w:space="0"/>
+          <w:right w:val="single" w:color="000000" w:sz="6" w:space="0"/>
+          <w:insideH w:val="single" w:color="000000" w:sz="6" w:space="0"/>
+          <w:insideV w:val="single" w:color="000000" w:sz="6" w:space="0"/>
+        </w:tblBorders>
+        <w:tblLayout w:type="fixed"/>
+        <w:tblCellMar>
+          <w:top w:w="100" w:type="dxa"/>
+          <w:left w:w="100" w:type="dxa"/>
+          <w:bottom w:w="100" w:type="dxa"/>
+          <w:right w:w="100" w:type="dxa"/>
+        </w:tblCellMar>
+      </w:tblPr>
+      <w:tblGrid>
+        <w:gridCol w:w="2340"/>
+        <w:gridCol w:w="2340"/>
+        <w:gridCol w:w="2340"/>
+        <w:gridCol w:w="2340"/>
+      </w:tblGrid>
+      <w:tr>
+        <w:tc>
+          <w:tcPr>
+            <w:tcW w:w="2340" w:type="dxa"/>
+          </w:tcPr>
+          <w:p>
+            <w:pPr/>
+            <w:r>
+              <w:rPr>
+                <w:b/>
+              </w:rPr>
+              <w:t xml:space="preserve">Requirement ID</w:t>
+            </w:r>
+          </w:p>
+        </w:tc>
+        <w:tc>
+          <w:tcPr>
+            <w:tcW w:w="2340" w:type="dxa"/>
+          </w:tcPr>
+          <w:p>
+            <w:pPr/>
+            <w:r>
+              <w:t xml:space="preserve">REQ_IO_A8.64.2</w:t>
+            </w:r>
+          </w:p>
+        </w:tc>
+        <w:tc>
+          <w:tcPr>
+            <w:tcW w:w="2340" w:type="dxa"/>
+          </w:tcPr>
+          <w:p>
+            <w:pPr/>
+            <w:r>
+              <w:rPr>
+                <w:b/>
+              </w:rPr>
+              <w:t xml:space="preserve">Version</w:t>
+            </w:r>
+          </w:p>
+        </w:tc>
+        <w:tc>
+          <w:tcPr>
+            <w:tcW w:w="2340" w:type="dxa"/>
+          </w:tcPr>
+          <w:p>
+            <w:pPr/>
+            <w:r>
+              <w:t xml:space="preserve">1.0</w:t>
+            </w:r>
+          </w:p>
+        </w:tc>
+      </w:tr>
+      <w:tr>
+        <w:tc>
+          <w:tcPr>
+            <w:tcW w:w="2340" w:type="dxa"/>
+          </w:tcPr>
+          <w:p>
+            <w:pPr/>
+            <w:r>
+              <w:rPr>
+                <w:b/>
+              </w:rPr>
+              <w:t xml:space="preserve">Item</w:t>
+            </w:r>
+          </w:p>
+        </w:tc>
+        <w:tc>
+          <w:tcPr>
+            <w:tcW w:w="7020" w:type="dxa"/>
+            <w:gridSpan w:val="3"/>
+          </w:tcPr>
+          <w:p>
+            <w:pPr/>
+            <w:r>
+              <w:t xml:space="preserve">Role Name (Input)</w:t>
+            </w:r>
+          </w:p>
+        </w:tc>
+      </w:tr>
+      <w:tr>
+        <w:tc>
+          <w:tcPr>
+            <w:tcW w:w="2340" w:type="dxa"/>
+          </w:tcPr>
+          <w:p>
+            <w:pPr/>
+            <w:r>
+              <w:rPr>
+                <w:b/>
+              </w:rPr>
+              <w:t xml:space="preserve">Description</w:t>
+            </w:r>
+          </w:p>
+        </w:tc>
+        <w:tc>
+          <w:tcPr>
+            <w:tcW w:w="7020" w:type="dxa"/>
+            <w:gridSpan w:val="3"/>
+          </w:tcPr>
+          <w:p>
+            <w:pPr/>
+            <w:r>
+              <w:t xml:space="preserve">角色名稱</w:t>
+            </w:r>
+          </w:p>
+        </w:tc>
+      </w:tr>
+      <w:tr>
+        <w:tc>
+          <w:tcPr>
+            <w:tcW w:w="2340" w:type="dxa"/>
+          </w:tcPr>
+          <w:p>
+            <w:pPr/>
+            <w:r>
+              <w:rPr>
+                <w:b/>
+              </w:rPr>
+              <w:t xml:space="preserve">Purpose</w:t>
+            </w:r>
+          </w:p>
+        </w:tc>
+        <w:tc>
+          <w:tcPr>
+            <w:tcW w:w="7020" w:type="dxa"/>
+            <w:gridSpan w:val="3"/>
+          </w:tcPr>
+          <w:p>
+            <w:pPr/>
+            <w:r>
+              <w:t xml:space="preserve">顯示角色</w:t>
+            </w:r>
+          </w:p>
+        </w:tc>
+      </w:tr>
+      <w:tr>
+        <w:tc>
+          <w:tcPr>
+            <w:tcW w:w="2340" w:type="dxa"/>
+          </w:tcPr>
+          <w:p>
+            <w:pPr/>
+            <w:r>
+              <w:rPr>
+                <w:b/>
+              </w:rPr>
+              <w:t xml:space="preserve">Format</w:t>
+            </w:r>
+          </w:p>
+        </w:tc>
+        <w:tc>
+          <w:tcPr>
+            <w:tcW w:w="2340" w:type="dxa"/>
+          </w:tcPr>
+          <w:p>
+            <w:pPr/>
+            <w:r>
+              <w:t xml:space="preserve">NVARCHAR(200)</w:t>
+            </w:r>
+          </w:p>
+        </w:tc>
+        <w:tc>
+          <w:tcPr>
+            <w:tcW w:w="2340" w:type="dxa"/>
+          </w:tcPr>
+          <w:p>
+            <w:pPr/>
+            <w:r>
+              <w:rPr>
+                <w:b/>
+              </w:rPr>
+              <w:t xml:space="preserve">Valid Range</w:t>
+            </w:r>
+          </w:p>
+        </w:tc>
+        <w:tc>
+          <w:tcPr>
+            <w:tcW w:w="2340" w:type="dxa"/>
+          </w:tcPr>
+          <w:p>
+            <w:pPr/>
+            <w:r>
+              <w:t xml:space="preserve">去除空白後 1–200 字元</w:t>
+            </w:r>
+          </w:p>
+        </w:tc>
+      </w:tr>
+      <w:tr>
+        <w:tc>
+          <w:tcPr>
+            <w:tcW w:w="2340" w:type="dxa"/>
+          </w:tcPr>
+          <w:p>
+            <w:pPr/>
+            <w:r>
+              <w:rPr>
+                <w:b/>
+              </w:rPr>
+              <w:t xml:space="preserve">Related I/O</w:t>
+            </w:r>
+          </w:p>
+        </w:tc>
+        <w:tc>
+          <w:tcPr>
+            <w:tcW w:w="7020" w:type="dxa"/>
+            <w:gridSpan w:val="3"/>
+          </w:tcPr>
+          <w:p>
+            <w:pPr/>
+            <w:r>
+              <w:t xml:space="preserve">None</w:t>
+            </w:r>
+          </w:p>
+        </w:tc>
+      </w:tr>
+      <w:tr>
+        <w:tc>
+          <w:tcPr>
+            <w:tcW w:w="2340" w:type="dxa"/>
+          </w:tcPr>
+          <w:p>
+            <w:pPr/>
+            <w:r>
+              <w:rPr>
+                <w:b/>
+              </w:rPr>
+              <w:t xml:space="preserve">Author</w:t>
+            </w:r>
+          </w:p>
+        </w:tc>
+        <w:tc>
+          <w:tcPr>
+            <w:tcW w:w="7020" w:type="dxa"/>
+            <w:gridSpan w:val="3"/>
+          </w:tcPr>
+          <w:p>
+            <w:pPr/>
+            <w:r>
+              <w:t xml:space="preserve">Developer</w:t>
+            </w:r>
+          </w:p>
+        </w:tc>
+      </w:tr>
+    </w:tbl>
+    <w:p/>
+    <w:tbl>
+      <w:tblPr>
+        <w:tblStyle w:val="TableGrid"/>
+        <w:tblW w:w="9360" w:type="dxa"/>
+        <w:jc w:val="left"/>
+        <w:tblBorders>
+          <w:top w:val="single" w:color="000000" w:sz="6" w:space="0"/>
+          <w:left w:val="single" w:color="000000" w:sz="6" w:space="0"/>
+          <w:bottom w:val="single" w:color="000000" w:sz="6" w:space="0"/>
+          <w:right w:val="single" w:color="000000" w:sz="6" w:space="0"/>
+          <w:insideH w:val="single" w:color="000000" w:sz="6" w:space="0"/>
+          <w:insideV w:val="single" w:color="000000" w:sz="6" w:space="0"/>
+        </w:tblBorders>
+        <w:tblLayout w:type="fixed"/>
+        <w:tblCellMar>
+          <w:top w:w="100" w:type="dxa"/>
+          <w:left w:w="100" w:type="dxa"/>
+          <w:bottom w:w="100" w:type="dxa"/>
+          <w:right w:w="100" w:type="dxa"/>
+        </w:tblCellMar>
+      </w:tblPr>
+      <w:tblGrid>
+        <w:gridCol w:w="2340"/>
+        <w:gridCol w:w="2340"/>
+        <w:gridCol w:w="2340"/>
+        <w:gridCol w:w="2340"/>
+      </w:tblGrid>
+      <w:tr>
+        <w:tc>
+          <w:tcPr>
+            <w:tcW w:w="2340" w:type="dxa"/>
+          </w:tcPr>
+          <w:p>
+            <w:pPr/>
+            <w:r>
+              <w:rPr>
+                <w:b/>
+              </w:rPr>
+              <w:t xml:space="preserve">Requirement ID</w:t>
+            </w:r>
+          </w:p>
+        </w:tc>
+        <w:tc>
+          <w:tcPr>
+            <w:tcW w:w="2340" w:type="dxa"/>
+          </w:tcPr>
+          <w:p>
+            <w:pPr/>
+            <w:r>
+              <w:t xml:space="preserve">REQ_IO_A8.64.3</w:t>
+            </w:r>
+          </w:p>
+        </w:tc>
+        <w:tc>
+          <w:tcPr>
+            <w:tcW w:w="2340" w:type="dxa"/>
+          </w:tcPr>
+          <w:p>
+            <w:pPr/>
+            <w:r>
+              <w:rPr>
+                <w:b/>
+              </w:rPr>
+              <w:t xml:space="preserve">Version</w:t>
+            </w:r>
+          </w:p>
+        </w:tc>
+        <w:tc>
+          <w:tcPr>
+            <w:tcW w:w="2340" w:type="dxa"/>
+          </w:tcPr>
+          <w:p>
+            <w:pPr/>
+            <w:r>
+              <w:t xml:space="preserve">1.0</w:t>
+            </w:r>
+          </w:p>
+        </w:tc>
+      </w:tr>
+      <w:tr>
+        <w:tc>
+          <w:tcPr>
+            <w:tcW w:w="2340" w:type="dxa"/>
+          </w:tcPr>
+          <w:p>
+            <w:pPr/>
+            <w:r>
+              <w:rPr>
+                <w:b/>
+              </w:rPr>
+              <w:t xml:space="preserve">Item</w:t>
+            </w:r>
+          </w:p>
+        </w:tc>
+        <w:tc>
+          <w:tcPr>
+            <w:tcW w:w="7020" w:type="dxa"/>
+            <w:gridSpan w:val="3"/>
+          </w:tcPr>
+          <w:p>
+            <w:pPr/>
+            <w:r>
+              <w:t xml:space="preserve">Data Scope (Dropdown)</w:t>
+            </w:r>
+          </w:p>
+        </w:tc>
+      </w:tr>
+      <w:tr>
+        <w:tc>
+          <w:tcPr>
+            <w:tcW w:w="2340" w:type="dxa"/>
+          </w:tcPr>
+          <w:p>
+            <w:pPr/>
+            <w:r>
+              <w:rPr>
+                <w:b/>
+              </w:rPr>
+              <w:t xml:space="preserve">Description</w:t>
+            </w:r>
+          </w:p>
+        </w:tc>
+        <w:tc>
+          <w:tcPr>
+            <w:tcW w:w="7020" w:type="dxa"/>
+            <w:gridSpan w:val="3"/>
+          </w:tcPr>
+          <w:p>
+            <w:pPr/>
+            <w:r>
+              <w:t xml:space="preserve">資料範圍</w:t>
+            </w:r>
+          </w:p>
+        </w:tc>
+      </w:tr>
+      <w:tr>
+        <w:tc>
+          <w:tcPr>
+            <w:tcW w:w="2340" w:type="dxa"/>
+          </w:tcPr>
+          <w:p>
+            <w:pPr/>
+            <w:r>
+              <w:rPr>
+                <w:b/>
+              </w:rPr>
+              <w:t xml:space="preserve">Purpose</w:t>
+            </w:r>
+          </w:p>
+        </w:tc>
+        <w:tc>
+          <w:tcPr>
+            <w:tcW w:w="7020" w:type="dxa"/>
+            <w:gridSpan w:val="3"/>
+          </w:tcPr>
+          <w:p>
+            <w:pPr/>
+            <w:r>
+              <w:t xml:space="preserve">決定可見單據範圍</w:t>
+            </w:r>
+          </w:p>
+        </w:tc>
+      </w:tr>
+      <w:tr>
+        <w:tc>
+          <w:tcPr>
+            <w:tcW w:w="2340" w:type="dxa"/>
+          </w:tcPr>
+          <w:p>
+            <w:pPr/>
+            <w:r>
+              <w:rPr>
+                <w:b/>
+              </w:rPr>
+              <w:t xml:space="preserve">Format</w:t>
+            </w:r>
+          </w:p>
+        </w:tc>
+        <w:tc>
+          <w:tcPr>
+            <w:tcW w:w="2340" w:type="dxa"/>
+          </w:tcPr>
+          <w:p>
+            <w:pPr/>
+            <w:r>
+              <w:t xml:space="preserve">Self／Department／Branch／Company</w:t>
+            </w:r>
+          </w:p>
+        </w:tc>
+        <w:tc>
+          <w:tcPr>
+            <w:tcW w:w="2340" w:type="dxa"/>
+          </w:tcPr>
+          <w:p>
+            <w:pPr/>
+            <w:r>
+              <w:rPr>
+                <w:b/>
+              </w:rPr>
+              <w:t xml:space="preserve">Valid Range</w:t>
+            </w:r>
+          </w:p>
+        </w:tc>
+        <w:tc>
+          <w:tcPr>
+            <w:tcW w:w="2340" w:type="dxa"/>
+          </w:tcPr>
+          <w:p>
+            <w:pPr/>
+            <w:r>
+              <w:t xml:space="preserve">必選，預設本人</w:t>
+            </w:r>
+          </w:p>
+        </w:tc>
+      </w:tr>
+      <w:tr>
+        <w:tc>
+          <w:tcPr>
+            <w:tcW w:w="2340" w:type="dxa"/>
+          </w:tcPr>
+          <w:p>
+            <w:pPr/>
+            <w:r>
+              <w:rPr>
+                <w:b/>
+              </w:rPr>
+              <w:t xml:space="preserve">Related I/O</w:t>
+            </w:r>
+          </w:p>
+        </w:tc>
+        <w:tc>
+          <w:tcPr>
+            <w:tcW w:w="7020" w:type="dxa"/>
+            <w:gridSpan w:val="3"/>
+          </w:tcPr>
+          <w:p>
+            <w:pPr/>
+            <w:r>
+              <w:t xml:space="preserve">None</w:t>
+            </w:r>
+          </w:p>
+        </w:tc>
+      </w:tr>
+      <w:tr>
+        <w:tc>
+          <w:tcPr>
+            <w:tcW w:w="2340" w:type="dxa"/>
+          </w:tcPr>
+          <w:p>
+            <w:pPr/>
+            <w:r>
+              <w:rPr>
+                <w:b/>
+              </w:rPr>
+              <w:t xml:space="preserve">Author</w:t>
+            </w:r>
+          </w:p>
+        </w:tc>
+        <w:tc>
+          <w:tcPr>
+            <w:tcW w:w="7020" w:type="dxa"/>
+            <w:gridSpan w:val="3"/>
+          </w:tcPr>
+          <w:p>
+            <w:pPr/>
+            <w:r>
+              <w:t xml:space="preserve">Developer</w:t>
+            </w:r>
+          </w:p>
+        </w:tc>
+      </w:tr>
+    </w:tbl>
+    <w:p/>
+    <w:tbl>
+      <w:tblPr>
+        <w:tblStyle w:val="TableGrid"/>
+        <w:tblW w:w="9360" w:type="dxa"/>
+        <w:jc w:val="left"/>
+        <w:tblBorders>
+          <w:top w:val="single" w:color="000000" w:sz="6" w:space="0"/>
+          <w:left w:val="single" w:color="000000" w:sz="6" w:space="0"/>
+          <w:bottom w:val="single" w:color="000000" w:sz="6" w:space="0"/>
+          <w:right w:val="single" w:color="000000" w:sz="6" w:space="0"/>
+          <w:insideH w:val="single" w:color="000000" w:sz="6" w:space="0"/>
+          <w:insideV w:val="single" w:color="000000" w:sz="6" w:space="0"/>
+        </w:tblBorders>
+        <w:tblLayout w:type="fixed"/>
+        <w:tblCellMar>
+          <w:top w:w="100" w:type="dxa"/>
+          <w:left w:w="100" w:type="dxa"/>
+          <w:bottom w:w="100" w:type="dxa"/>
+          <w:right w:w="100" w:type="dxa"/>
+        </w:tblCellMar>
+      </w:tblPr>
+      <w:tblGrid>
+        <w:gridCol w:w="2340"/>
+        <w:gridCol w:w="2340"/>
+        <w:gridCol w:w="2340"/>
+        <w:gridCol w:w="2340"/>
+      </w:tblGrid>
+      <w:tr>
+        <w:tc>
+          <w:tcPr>
+            <w:tcW w:w="2340" w:type="dxa"/>
+          </w:tcPr>
+          <w:p>
+            <w:pPr/>
+            <w:r>
+              <w:rPr>
+                <w:b/>
+              </w:rPr>
+              <w:t xml:space="preserve">Requirement ID</w:t>
+            </w:r>
+          </w:p>
+        </w:tc>
+        <w:tc>
+          <w:tcPr>
+            <w:tcW w:w="2340" w:type="dxa"/>
+          </w:tcPr>
+          <w:p>
+            <w:pPr/>
+            <w:r>
+              <w:t xml:space="preserve">REQ_IO_A8.64.4</w:t>
+            </w:r>
+          </w:p>
+        </w:tc>
+        <w:tc>
+          <w:tcPr>
+            <w:tcW w:w="2340" w:type="dxa"/>
+          </w:tcPr>
+          <w:p>
+            <w:pPr/>
+            <w:r>
+              <w:rPr>
+                <w:b/>
+              </w:rPr>
+              <w:t xml:space="preserve">Version</w:t>
+            </w:r>
+          </w:p>
+        </w:tc>
+        <w:tc>
+          <w:tcPr>
+            <w:tcW w:w="2340" w:type="dxa"/>
+          </w:tcPr>
+          <w:p>
+            <w:pPr/>
+            <w:r>
+              <w:t xml:space="preserve">1.0</w:t>
+            </w:r>
+          </w:p>
+        </w:tc>
+      </w:tr>
+      <w:tr>
+        <w:tc>
+          <w:tcPr>
+            <w:tcW w:w="2340" w:type="dxa"/>
+          </w:tcPr>
+          <w:p>
+            <w:pPr/>
+            <w:r>
+              <w:rPr>
+                <w:b/>
+              </w:rPr>
+              <w:t xml:space="preserve">Item</w:t>
+            </w:r>
+          </w:p>
+        </w:tc>
+        <w:tc>
+          <w:tcPr>
+            <w:tcW w:w="7020" w:type="dxa"/>
+            <w:gridSpan w:val="3"/>
+          </w:tcPr>
+          <w:p>
+            <w:pPr/>
+            <w:r>
+              <w:t xml:space="preserve">Full Access (Checkbox)</w:t>
+            </w:r>
+          </w:p>
+        </w:tc>
+      </w:tr>
+      <w:tr>
+        <w:tc>
+          <w:tcPr>
+            <w:tcW w:w="2340" w:type="dxa"/>
+          </w:tcPr>
+          <w:p>
+            <w:pPr/>
+            <w:r>
+              <w:rPr>
+                <w:b/>
+              </w:rPr>
+              <w:t xml:space="preserve">Description</w:t>
+            </w:r>
+          </w:p>
+        </w:tc>
+        <w:tc>
+          <w:tcPr>
+            <w:tcW w:w="7020" w:type="dxa"/>
+            <w:gridSpan w:val="3"/>
+          </w:tcPr>
+          <w:p>
+            <w:pPr/>
+            <w:r>
+              <w:t xml:space="preserve">全權</w:t>
+            </w:r>
+          </w:p>
+        </w:tc>
+      </w:tr>
+      <w:tr>
+        <w:tc>
+          <w:tcPr>
+            <w:tcW w:w="2340" w:type="dxa"/>
+          </w:tcPr>
+          <w:p>
+            <w:pPr/>
+            <w:r>
+              <w:rPr>
+                <w:b/>
+              </w:rPr>
+              <w:t xml:space="preserve">Purpose</w:t>
+            </w:r>
+          </w:p>
+        </w:tc>
+        <w:tc>
+          <w:tcPr>
+            <w:tcW w:w="7020" w:type="dxa"/>
+            <w:gridSpan w:val="3"/>
+          </w:tcPr>
+          <w:p>
+            <w:pPr/>
+            <w:r>
+              <w:t xml:space="preserve">擁有全部權限</w:t>
+            </w:r>
+          </w:p>
+        </w:tc>
+      </w:tr>
+      <w:tr>
+        <w:tc>
+          <w:tcPr>
+            <w:tcW w:w="2340" w:type="dxa"/>
+          </w:tcPr>
+          <w:p>
+            <w:pPr/>
+            <w:r>
+              <w:rPr>
+                <w:b/>
+              </w:rPr>
+              <w:t xml:space="preserve">Format</w:t>
+            </w:r>
+          </w:p>
+        </w:tc>
+        <w:tc>
+          <w:tcPr>
+            <w:tcW w:w="2340" w:type="dxa"/>
+          </w:tcPr>
+          <w:p>
+            <w:pPr/>
+            <w:r>
+              <w:t xml:space="preserve">Boolean</w:t>
+            </w:r>
+          </w:p>
+        </w:tc>
+        <w:tc>
+          <w:tcPr>
+            <w:tcW w:w="2340" w:type="dxa"/>
+          </w:tcPr>
+          <w:p>
+            <w:pPr/>
+            <w:r>
+              <w:rPr>
+                <w:b/>
+              </w:rPr>
+              <w:t xml:space="preserve">Valid Range</w:t>
+            </w:r>
+          </w:p>
+        </w:tc>
+        <w:tc>
+          <w:tcPr>
+            <w:tcW w:w="2340" w:type="dxa"/>
+          </w:tcPr>
+          <w:p>
+            <w:pPr/>
+            <w:r>
+              <w:t xml:space="preserve">勾選時權限清單停用</w:t>
+            </w:r>
+          </w:p>
+        </w:tc>
+      </w:tr>
+      <w:tr>
+        <w:tc>
+          <w:tcPr>
+            <w:tcW w:w="2340" w:type="dxa"/>
+          </w:tcPr>
+          <w:p>
+            <w:pPr/>
+            <w:r>
+              <w:rPr>
+                <w:b/>
+              </w:rPr>
+              <w:t xml:space="preserve">Related I/O</w:t>
+            </w:r>
+          </w:p>
+        </w:tc>
+        <w:tc>
+          <w:tcPr>
+            <w:tcW w:w="7020" w:type="dxa"/>
+            <w:gridSpan w:val="3"/>
+          </w:tcPr>
+          <w:p>
+            <w:pPr/>
+            <w:r>
+              <w:t xml:space="preserve">REQ_IO_A8.64.5</w:t>
+            </w:r>
+          </w:p>
+        </w:tc>
+      </w:tr>
+      <w:tr>
+        <w:tc>
+          <w:tcPr>
+            <w:tcW w:w="2340" w:type="dxa"/>
+          </w:tcPr>
+          <w:p>
+            <w:pPr/>
+            <w:r>
+              <w:rPr>
+                <w:b/>
+              </w:rPr>
+              <w:t xml:space="preserve">Author</w:t>
+            </w:r>
+          </w:p>
+        </w:tc>
+        <w:tc>
+          <w:tcPr>
+            <w:tcW w:w="7020" w:type="dxa"/>
+            <w:gridSpan w:val="3"/>
+          </w:tcPr>
+          <w:p>
+            <w:pPr/>
+            <w:r>
+              <w:t xml:space="preserve">Developer</w:t>
+            </w:r>
+          </w:p>
+        </w:tc>
+      </w:tr>
+    </w:tbl>
+    <w:p/>
+    <w:tbl>
+      <w:tblPr>
+        <w:tblStyle w:val="TableGrid"/>
+        <w:tblW w:w="9360" w:type="dxa"/>
+        <w:jc w:val="left"/>
+        <w:tblBorders>
+          <w:top w:val="single" w:color="000000" w:sz="6" w:space="0"/>
+          <w:left w:val="single" w:color="000000" w:sz="6" w:space="0"/>
+          <w:bottom w:val="single" w:color="000000" w:sz="6" w:space="0"/>
+          <w:right w:val="single" w:color="000000" w:sz="6" w:space="0"/>
+          <w:insideH w:val="single" w:color="000000" w:sz="6" w:space="0"/>
+          <w:insideV w:val="single" w:color="000000" w:sz="6" w:space="0"/>
+        </w:tblBorders>
+        <w:tblLayout w:type="fixed"/>
+        <w:tblCellMar>
+          <w:top w:w="100" w:type="dxa"/>
+          <w:left w:w="100" w:type="dxa"/>
+          <w:bottom w:w="100" w:type="dxa"/>
+          <w:right w:w="100" w:type="dxa"/>
+        </w:tblCellMar>
+      </w:tblPr>
+      <w:tblGrid>
+        <w:gridCol w:w="2340"/>
+        <w:gridCol w:w="2340"/>
+        <w:gridCol w:w="2340"/>
+        <w:gridCol w:w="2340"/>
+      </w:tblGrid>
+      <w:tr>
+        <w:tc>
+          <w:tcPr>
+            <w:tcW w:w="2340" w:type="dxa"/>
+          </w:tcPr>
+          <w:p>
+            <w:pPr/>
+            <w:r>
+              <w:rPr>
+                <w:b/>
+              </w:rPr>
+              <w:t xml:space="preserve">Requirement ID</w:t>
+            </w:r>
+          </w:p>
+        </w:tc>
+        <w:tc>
+          <w:tcPr>
+            <w:tcW w:w="2340" w:type="dxa"/>
+          </w:tcPr>
+          <w:p>
+            <w:pPr/>
+            <w:r>
+              <w:t xml:space="preserve">REQ_IO_A8.64.5</w:t>
+            </w:r>
+          </w:p>
+        </w:tc>
+        <w:tc>
+          <w:tcPr>
+            <w:tcW w:w="2340" w:type="dxa"/>
+          </w:tcPr>
+          <w:p>
+            <w:pPr/>
+            <w:r>
+              <w:rPr>
+                <w:b/>
+              </w:rPr>
+              <w:t xml:space="preserve">Version</w:t>
+            </w:r>
+          </w:p>
+        </w:tc>
+        <w:tc>
+          <w:tcPr>
+            <w:tcW w:w="2340" w:type="dxa"/>
+          </w:tcPr>
+          <w:p>
+            <w:pPr/>
+            <w:r>
+              <w:t xml:space="preserve">1.0</w:t>
+            </w:r>
+          </w:p>
+        </w:tc>
+      </w:tr>
+      <w:tr>
+        <w:tc>
+          <w:tcPr>
+            <w:tcW w:w="2340" w:type="dxa"/>
+          </w:tcPr>
+          <w:p>
+            <w:pPr/>
+            <w:r>
+              <w:rPr>
+                <w:b/>
+              </w:rPr>
+              <w:t xml:space="preserve">Item</w:t>
+            </w:r>
+          </w:p>
+        </w:tc>
+        <w:tc>
+          <w:tcPr>
+            <w:tcW w:w="7020" w:type="dxa"/>
+            <w:gridSpan w:val="3"/>
+          </w:tcPr>
+          <w:p>
+            <w:pPr/>
+            <w:r>
+              <w:t xml:space="preserve">Permissions (Checkbox group)</w:t>
+            </w:r>
+          </w:p>
+        </w:tc>
+      </w:tr>
+      <w:tr>
+        <w:tc>
+          <w:tcPr>
+            <w:tcW w:w="2340" w:type="dxa"/>
+          </w:tcPr>
+          <w:p>
+            <w:pPr/>
+            <w:r>
+              <w:rPr>
+                <w:b/>
+              </w:rPr>
+              <w:t xml:space="preserve">Description</w:t>
+            </w:r>
+          </w:p>
+        </w:tc>
+        <w:tc>
+          <w:tcPr>
+            <w:tcW w:w="7020" w:type="dxa"/>
+            <w:gridSpan w:val="3"/>
+          </w:tcPr>
+          <w:p>
+            <w:pPr/>
+            <w:r>
+              <w:t xml:space="preserve">權限</w:t>
+            </w:r>
+          </w:p>
+        </w:tc>
+      </w:tr>
+      <w:tr>
+        <w:tc>
+          <w:tcPr>
+            <w:tcW w:w="2340" w:type="dxa"/>
+          </w:tcPr>
+          <w:p>
+            <w:pPr/>
+            <w:r>
+              <w:rPr>
+                <w:b/>
+              </w:rPr>
+              <w:t xml:space="preserve">Purpose</w:t>
+            </w:r>
+          </w:p>
+        </w:tc>
+        <w:tc>
+          <w:tcPr>
+            <w:tcW w:w="7020" w:type="dxa"/>
+            <w:gridSpan w:val="3"/>
+          </w:tcPr>
+          <w:p>
+            <w:pPr/>
+            <w:r>
+              <w:t xml:space="preserve">依模組勾選權限代碼</w:t>
+            </w:r>
+          </w:p>
+        </w:tc>
+      </w:tr>
+      <w:tr>
+        <w:tc>
+          <w:tcPr>
+            <w:tcW w:w="2340" w:type="dxa"/>
+          </w:tcPr>
+          <w:p>
+            <w:pPr/>
+            <w:r>
+              <w:rPr>
+                <w:b/>
+              </w:rPr>
+              <w:t xml:space="preserve">Format</w:t>
+            </w:r>
+          </w:p>
+        </w:tc>
+        <w:tc>
+          <w:tcPr>
+            <w:tcW w:w="2340" w:type="dxa"/>
+          </w:tcPr>
+          <w:p>
+            <w:pPr/>
+            <w:r>
+              <w:t xml:space="preserve">模組.資源.動作</w:t>
+            </w:r>
+          </w:p>
+        </w:tc>
+        <w:tc>
+          <w:tcPr>
+            <w:tcW w:w="2340" w:type="dxa"/>
+          </w:tcPr>
+          <w:p>
+            <w:pPr/>
+            <w:r>
+              <w:rPr>
+                <w:b/>
+              </w:rPr>
+              <w:t xml:space="preserve">Valid Range</w:t>
+            </w:r>
+          </w:p>
+        </w:tc>
+        <w:tc>
+          <w:tcPr>
+            <w:tcW w:w="2340" w:type="dxa"/>
+          </w:tcPr>
+          <w:p>
+            <w:pPr/>
+            <w:r>
+              <w:t xml:space="preserve">只可選權限目錄內的代碼；模組可全選</w:t>
+            </w:r>
+          </w:p>
+        </w:tc>
+      </w:tr>
+      <w:tr>
+        <w:tc>
+          <w:tcPr>
+            <w:tcW w:w="2340" w:type="dxa"/>
+          </w:tcPr>
+          <w:p>
+            <w:pPr/>
+            <w:r>
+              <w:rPr>
+                <w:b/>
+              </w:rPr>
+              <w:t xml:space="preserve">Related I/O</w:t>
+            </w:r>
+          </w:p>
+        </w:tc>
+        <w:tc>
+          <w:tcPr>
+            <w:tcW w:w="7020" w:type="dxa"/>
+            <w:gridSpan w:val="3"/>
+          </w:tcPr>
+          <w:p>
+            <w:pPr/>
+            <w:r>
+              <w:t xml:space="preserve">REQ_IO_A8.64.4</w:t>
+            </w:r>
+          </w:p>
+        </w:tc>
+      </w:tr>
+      <w:tr>
+        <w:tc>
+          <w:tcPr>
+            <w:tcW w:w="2340" w:type="dxa"/>
+          </w:tcPr>
+          <w:p>
+            <w:pPr/>
+            <w:r>
+              <w:rPr>
+                <w:b/>
+              </w:rPr>
+              <w:t xml:space="preserve">Author</w:t>
+            </w:r>
+          </w:p>
+        </w:tc>
+        <w:tc>
+          <w:tcPr>
+            <w:tcW w:w="7020" w:type="dxa"/>
+            <w:gridSpan w:val="3"/>
+          </w:tcPr>
+          <w:p>
+            <w:pPr/>
+            <w:r>
+              <w:t xml:space="preserve">Developer</w:t>
+            </w:r>
+          </w:p>
+        </w:tc>
+      </w:tr>
+    </w:tbl>
+    <w:p/>
+    <w:tbl>
+      <w:tblPr>
+        <w:tblStyle w:val="TableGrid"/>
+        <w:tblW w:w="9360" w:type="dxa"/>
+        <w:jc w:val="left"/>
+        <w:tblBorders>
+          <w:top w:val="single" w:color="000000" w:sz="6" w:space="0"/>
+          <w:left w:val="single" w:color="000000" w:sz="6" w:space="0"/>
+          <w:bottom w:val="single" w:color="000000" w:sz="6" w:space="0"/>
+          <w:right w:val="single" w:color="000000" w:sz="6" w:space="0"/>
+          <w:insideH w:val="single" w:color="000000" w:sz="6" w:space="0"/>
+          <w:insideV w:val="single" w:color="000000" w:sz="6" w:space="0"/>
+        </w:tblBorders>
+        <w:tblLayout w:type="fixed"/>
+        <w:tblCellMar>
+          <w:top w:w="100" w:type="dxa"/>
+          <w:left w:w="100" w:type="dxa"/>
+          <w:bottom w:w="100" w:type="dxa"/>
+          <w:right w:w="100" w:type="dxa"/>
+        </w:tblCellMar>
+      </w:tblPr>
+      <w:tblGrid>
+        <w:gridCol w:w="2340"/>
+        <w:gridCol w:w="2340"/>
+        <w:gridCol w:w="2340"/>
+        <w:gridCol w:w="2340"/>
+      </w:tblGrid>
+      <w:tr>
+        <w:tc>
+          <w:tcPr>
+            <w:tcW w:w="2340" w:type="dxa"/>
+          </w:tcPr>
+          <w:p>
+            <w:pPr/>
+            <w:r>
+              <w:rPr>
+                <w:b/>
+              </w:rPr>
+              <w:t xml:space="preserve">Requirement ID</w:t>
+            </w:r>
+          </w:p>
+        </w:tc>
+        <w:tc>
+          <w:tcPr>
+            <w:tcW w:w="2340" w:type="dxa"/>
+          </w:tcPr>
+          <w:p>
+            <w:pPr/>
+            <w:r>
+              <w:t xml:space="preserve">REQ_IO_A8.64.6</w:t>
+            </w:r>
+          </w:p>
+        </w:tc>
+        <w:tc>
+          <w:tcPr>
+            <w:tcW w:w="2340" w:type="dxa"/>
+          </w:tcPr>
+          <w:p>
+            <w:pPr/>
+            <w:r>
+              <w:rPr>
+                <w:b/>
+              </w:rPr>
+              <w:t xml:space="preserve">Version</w:t>
+            </w:r>
+          </w:p>
+        </w:tc>
+        <w:tc>
+          <w:tcPr>
+            <w:tcW w:w="2340" w:type="dxa"/>
+          </w:tcPr>
+          <w:p>
+            <w:pPr/>
+            <w:r>
+              <w:t xml:space="preserve">1.0</w:t>
+            </w:r>
+          </w:p>
+        </w:tc>
+      </w:tr>
+      <w:tr>
+        <w:tc>
+          <w:tcPr>
+            <w:tcW w:w="2340" w:type="dxa"/>
+          </w:tcPr>
+          <w:p>
+            <w:pPr/>
+            <w:r>
+              <w:rPr>
+                <w:b/>
+              </w:rPr>
+              <w:t xml:space="preserve">Item</w:t>
+            </w:r>
+          </w:p>
+        </w:tc>
+        <w:tc>
+          <w:tcPr>
+            <w:tcW w:w="7020" w:type="dxa"/>
+            <w:gridSpan w:val="3"/>
+          </w:tcPr>
+          <w:p>
+            <w:pPr/>
+            <w:r>
+              <w:t xml:space="preserve">Delete (Button)</w:t>
+            </w:r>
+          </w:p>
+        </w:tc>
+      </w:tr>
+      <w:tr>
+        <w:tc>
+          <w:tcPr>
+            <w:tcW w:w="2340" w:type="dxa"/>
+          </w:tcPr>
+          <w:p>
+            <w:pPr/>
+            <w:r>
+              <w:rPr>
+                <w:b/>
+              </w:rPr>
+              <w:t xml:space="preserve">Description</w:t>
+            </w:r>
+          </w:p>
+        </w:tc>
+        <w:tc>
+          <w:tcPr>
+            <w:tcW w:w="7020" w:type="dxa"/>
+            <w:gridSpan w:val="3"/>
+          </w:tcPr>
+          <w:p>
+            <w:pPr/>
+            <w:r>
+              <w:t xml:space="preserve">刪除</w:t>
+            </w:r>
+          </w:p>
+        </w:tc>
+      </w:tr>
+      <w:tr>
+        <w:tc>
+          <w:tcPr>
+            <w:tcW w:w="2340" w:type="dxa"/>
+          </w:tcPr>
+          <w:p>
+            <w:pPr/>
+            <w:r>
+              <w:rPr>
+                <w:b/>
+              </w:rPr>
+              <w:t xml:space="preserve">Purpose</w:t>
+            </w:r>
+          </w:p>
+        </w:tc>
+        <w:tc>
+          <w:tcPr>
+            <w:tcW w:w="7020" w:type="dxa"/>
+            <w:gridSpan w:val="3"/>
+          </w:tcPr>
+          <w:p>
+            <w:pPr/>
+            <w:r>
+              <w:t xml:space="preserve">軟刪除未使用的角色</w:t>
+            </w:r>
+          </w:p>
+        </w:tc>
+      </w:tr>
+      <w:tr>
+        <w:tc>
+          <w:tcPr>
+            <w:tcW w:w="2340" w:type="dxa"/>
+          </w:tcPr>
+          <w:p>
+            <w:pPr/>
+            <w:r>
+              <w:rPr>
+                <w:b/>
+              </w:rPr>
+              <w:t xml:space="preserve">Format</w:t>
+            </w:r>
+          </w:p>
+        </w:tc>
+        <w:tc>
+          <w:tcPr>
+            <w:tcW w:w="2340" w:type="dxa"/>
+          </w:tcPr>
+          <w:p>
+            <w:pPr/>
+            <w:r>
+              <w:t xml:space="preserve">Button + popconfirm</w:t>
+            </w:r>
+          </w:p>
+        </w:tc>
+        <w:tc>
+          <w:tcPr>
+            <w:tcW w:w="2340" w:type="dxa"/>
+          </w:tcPr>
+          <w:p>
+            <w:pPr/>
+            <w:r>
+              <w:rPr>
+                <w:b/>
+              </w:rPr>
+              <w:t xml:space="preserve">Valid Range</w:t>
+            </w:r>
+          </w:p>
+        </w:tc>
+        <w:tc>
+          <w:tcPr>
+            <w:tcW w:w="2340" w:type="dxa"/>
+          </w:tcPr>
+          <w:p>
+            <w:pPr/>
+            <w:r>
+              <w:t xml:space="preserve">帶 version；使用中回 SYS.ROLE.IN_USE</w:t>
+            </w:r>
+          </w:p>
+        </w:tc>
+      </w:tr>
+      <w:tr>
+        <w:tc>
+          <w:tcPr>
+            <w:tcW w:w="2340" w:type="dxa"/>
+          </w:tcPr>
+          <w:p>
+            <w:pPr/>
+            <w:r>
+              <w:rPr>
+                <w:b/>
+              </w:rPr>
+              <w:t xml:space="preserve">Related I/O</w:t>
+            </w:r>
+          </w:p>
+        </w:tc>
+        <w:tc>
+          <w:tcPr>
+            <w:tcW w:w="7020" w:type="dxa"/>
+            <w:gridSpan w:val="3"/>
+          </w:tcPr>
+          <w:p>
+            <w:pPr/>
+            <w:r>
+              <w:t xml:space="preserve">None</w:t>
+            </w:r>
+          </w:p>
+        </w:tc>
+      </w:tr>
+      <w:tr>
+        <w:tc>
+          <w:tcPr>
+            <w:tcW w:w="2340" w:type="dxa"/>
+          </w:tcPr>
+          <w:p>
+            <w:pPr/>
+            <w:r>
+              <w:rPr>
+                <w:b/>
+              </w:rPr>
+              <w:t xml:space="preserve">Author</w:t>
+            </w:r>
+          </w:p>
+        </w:tc>
+        <w:tc>
+          <w:tcPr>
+            <w:tcW w:w="7020" w:type="dxa"/>
+            <w:gridSpan w:val="3"/>
+          </w:tcPr>
+          <w:p>
+            <w:pPr/>
+            <w:r>
+              <w:t xml:space="preserve">Developer</w:t>
+            </w:r>
+          </w:p>
+        </w:tc>
+      </w:tr>
+    </w:tbl>
+    <w:p/>
+    <w:p>
+      <w:pPr>
+        <w:pStyle w:val="Heading5"/>
+      </w:pPr>
+      <w:r>
+        <w:t xml:space="preserve">4.4.1.8.65 User Permission Edit Interface（BlueWhale 4.4.1.8.26）</w:t>
+      </w:r>
+    </w:p>
+    <w:tbl>
+      <w:tblPr>
+        <w:tblStyle w:val="TableGrid"/>
+        <w:tblW w:w="9360" w:type="dxa"/>
+        <w:jc w:val="left"/>
+        <w:tblBorders>
+          <w:top w:val="single" w:color="000000" w:sz="6" w:space="0"/>
+          <w:left w:val="single" w:color="000000" w:sz="6" w:space="0"/>
+          <w:bottom w:val="single" w:color="000000" w:sz="6" w:space="0"/>
+          <w:right w:val="single" w:color="000000" w:sz="6" w:space="0"/>
+          <w:insideH w:val="single" w:color="000000" w:sz="6" w:space="0"/>
+          <w:insideV w:val="single" w:color="000000" w:sz="6" w:space="0"/>
+        </w:tblBorders>
+        <w:tblLayout w:type="fixed"/>
+        <w:tblCellMar>
+          <w:top w:w="100" w:type="dxa"/>
+          <w:left w:w="100" w:type="dxa"/>
+          <w:bottom w:w="100" w:type="dxa"/>
+          <w:right w:w="100" w:type="dxa"/>
+        </w:tblCellMar>
+      </w:tblPr>
+      <w:tblGrid>
+        <w:gridCol w:w="2340"/>
+        <w:gridCol w:w="2340"/>
+        <w:gridCol w:w="2340"/>
+        <w:gridCol w:w="2340"/>
+      </w:tblGrid>
+      <w:tr>
+        <w:tc>
+          <w:tcPr>
+            <w:tcW w:w="2340" w:type="dxa"/>
+          </w:tcPr>
+          <w:p>
+            <w:pPr/>
+            <w:r>
+              <w:rPr>
+                <w:b/>
+              </w:rPr>
+              <w:t xml:space="preserve">Requirement ID</w:t>
+            </w:r>
+          </w:p>
+        </w:tc>
+        <w:tc>
+          <w:tcPr>
+            <w:tcW w:w="2340" w:type="dxa"/>
+          </w:tcPr>
+          <w:p>
+            <w:pPr/>
+            <w:r>
+              <w:t xml:space="preserve">REQ_IO_A8.65.1</w:t>
+            </w:r>
+          </w:p>
+        </w:tc>
+        <w:tc>
+          <w:tcPr>
+            <w:tcW w:w="2340" w:type="dxa"/>
+          </w:tcPr>
+          <w:p>
+            <w:pPr/>
+            <w:r>
+              <w:rPr>
+                <w:b/>
+              </w:rPr>
+              <w:t xml:space="preserve">Version</w:t>
+            </w:r>
+          </w:p>
+        </w:tc>
+        <w:tc>
+          <w:tcPr>
+            <w:tcW w:w="2340" w:type="dxa"/>
+          </w:tcPr>
+          <w:p>
+            <w:pPr/>
+            <w:r>
+              <w:t xml:space="preserve">1.0</w:t>
+            </w:r>
+          </w:p>
+        </w:tc>
+      </w:tr>
+      <w:tr>
+        <w:tc>
+          <w:tcPr>
+            <w:tcW w:w="2340" w:type="dxa"/>
+          </w:tcPr>
+          <w:p>
+            <w:pPr/>
+            <w:r>
+              <w:rPr>
+                <w:b/>
+              </w:rPr>
+              <w:t xml:space="preserve">Item</w:t>
+            </w:r>
+          </w:p>
+        </w:tc>
+        <w:tc>
+          <w:tcPr>
+            <w:tcW w:w="7020" w:type="dxa"/>
+            <w:gridSpan w:val="3"/>
+          </w:tcPr>
+          <w:p>
+            <w:pPr/>
+            <w:r>
+              <w:t xml:space="preserve">Company (Dropdown)</w:t>
+            </w:r>
+          </w:p>
+        </w:tc>
+      </w:tr>
+      <w:tr>
+        <w:tc>
+          <w:tcPr>
+            <w:tcW w:w="2340" w:type="dxa"/>
+          </w:tcPr>
+          <w:p>
+            <w:pPr/>
+            <w:r>
+              <w:rPr>
+                <w:b/>
+              </w:rPr>
+              <w:t xml:space="preserve">Description</w:t>
+            </w:r>
+          </w:p>
+        </w:tc>
+        <w:tc>
+          <w:tcPr>
+            <w:tcW w:w="7020" w:type="dxa"/>
+            <w:gridSpan w:val="3"/>
+          </w:tcPr>
+          <w:p>
+            <w:pPr/>
+            <w:r>
+              <w:t xml:space="preserve">公司</w:t>
+            </w:r>
+          </w:p>
+        </w:tc>
+      </w:tr>
+      <w:tr>
+        <w:tc>
+          <w:tcPr>
+            <w:tcW w:w="2340" w:type="dxa"/>
+          </w:tcPr>
+          <w:p>
+            <w:pPr/>
+            <w:r>
+              <w:rPr>
+                <w:b/>
+              </w:rPr>
+              <w:t xml:space="preserve">Purpose</w:t>
+            </w:r>
+          </w:p>
+        </w:tc>
+        <w:tc>
+          <w:tcPr>
+            <w:tcW w:w="7020" w:type="dxa"/>
+            <w:gridSpan w:val="3"/>
+          </w:tcPr>
+          <w:p>
+            <w:pPr/>
+            <w:r>
+              <w:t xml:space="preserve">選擇要設定的公司</w:t>
+            </w:r>
+          </w:p>
+        </w:tc>
+      </w:tr>
+      <w:tr>
+        <w:tc>
+          <w:tcPr>
+            <w:tcW w:w="2340" w:type="dxa"/>
+          </w:tcPr>
+          <w:p>
+            <w:pPr/>
+            <w:r>
+              <w:rPr>
+                <w:b/>
+              </w:rPr>
+              <w:t xml:space="preserve">Format</w:t>
+            </w:r>
+          </w:p>
+        </w:tc>
+        <w:tc>
+          <w:tcPr>
+            <w:tcW w:w="2340" w:type="dxa"/>
+          </w:tcPr>
+          <w:p>
+            <w:pPr/>
+            <w:r>
+              <w:t xml:space="preserve">bigint ID</w:t>
+            </w:r>
+          </w:p>
+        </w:tc>
+        <w:tc>
+          <w:tcPr>
+            <w:tcW w:w="2340" w:type="dxa"/>
+          </w:tcPr>
+          <w:p>
+            <w:pPr/>
+            <w:r>
+              <w:rPr>
+                <w:b/>
+              </w:rPr>
+              <w:t xml:space="preserve">Valid Range</w:t>
+            </w:r>
+          </w:p>
+        </w:tc>
+        <w:tc>
+          <w:tcPr>
+            <w:tcW w:w="2340" w:type="dxa"/>
+          </w:tcPr>
+          <w:p>
+            <w:pPr/>
+            <w:r>
+              <w:t xml:space="preserve">操作者可切換的公司</w:t>
+            </w:r>
+          </w:p>
+        </w:tc>
+      </w:tr>
+      <w:tr>
+        <w:tc>
+          <w:tcPr>
+            <w:tcW w:w="2340" w:type="dxa"/>
+          </w:tcPr>
+          <w:p>
+            <w:pPr/>
+            <w:r>
+              <w:rPr>
+                <w:b/>
+              </w:rPr>
+              <w:t xml:space="preserve">Related I/O</w:t>
+            </w:r>
+          </w:p>
+        </w:tc>
+        <w:tc>
+          <w:tcPr>
+            <w:tcW w:w="7020" w:type="dxa"/>
+            <w:gridSpan w:val="3"/>
+          </w:tcPr>
+          <w:p>
+            <w:pPr/>
+            <w:r>
+              <w:t xml:space="preserve">REQ_IO_A8.65.2</w:t>
+            </w:r>
+          </w:p>
+        </w:tc>
+      </w:tr>
+      <w:tr>
+        <w:tc>
+          <w:tcPr>
+            <w:tcW w:w="2340" w:type="dxa"/>
+          </w:tcPr>
+          <w:p>
+            <w:pPr/>
+            <w:r>
+              <w:rPr>
+                <w:b/>
+              </w:rPr>
+              <w:t xml:space="preserve">Author</w:t>
+            </w:r>
+          </w:p>
+        </w:tc>
+        <w:tc>
+          <w:tcPr>
+            <w:tcW w:w="7020" w:type="dxa"/>
+            <w:gridSpan w:val="3"/>
+          </w:tcPr>
+          <w:p>
+            <w:pPr/>
+            <w:r>
+              <w:t xml:space="preserve">Developer</w:t>
+            </w:r>
+          </w:p>
+        </w:tc>
+      </w:tr>
+    </w:tbl>
+    <w:p/>
+    <w:tbl>
+      <w:tblPr>
+        <w:tblStyle w:val="TableGrid"/>
+        <w:tblW w:w="9360" w:type="dxa"/>
+        <w:jc w:val="left"/>
+        <w:tblBorders>
+          <w:top w:val="single" w:color="000000" w:sz="6" w:space="0"/>
+          <w:left w:val="single" w:color="000000" w:sz="6" w:space="0"/>
+          <w:bottom w:val="single" w:color="000000" w:sz="6" w:space="0"/>
+          <w:right w:val="single" w:color="000000" w:sz="6" w:space="0"/>
+          <w:insideH w:val="single" w:color="000000" w:sz="6" w:space="0"/>
+          <w:insideV w:val="single" w:color="000000" w:sz="6" w:space="0"/>
+        </w:tblBorders>
+        <w:tblLayout w:type="fixed"/>
+        <w:tblCellMar>
+          <w:top w:w="100" w:type="dxa"/>
+          <w:left w:w="100" w:type="dxa"/>
+          <w:bottom w:w="100" w:type="dxa"/>
+          <w:right w:w="100" w:type="dxa"/>
+        </w:tblCellMar>
+      </w:tblPr>
+      <w:tblGrid>
+        <w:gridCol w:w="2340"/>
+        <w:gridCol w:w="2340"/>
+        <w:gridCol w:w="2340"/>
+        <w:gridCol w:w="2340"/>
+      </w:tblGrid>
+      <w:tr>
+        <w:tc>
+          <w:tcPr>
+            <w:tcW w:w="2340" w:type="dxa"/>
+          </w:tcPr>
+          <w:p>
+            <w:pPr/>
+            <w:r>
+              <w:rPr>
+                <w:b/>
+              </w:rPr>
+              <w:t xml:space="preserve">Requirement ID</w:t>
+            </w:r>
+          </w:p>
+        </w:tc>
+        <w:tc>
+          <w:tcPr>
+            <w:tcW w:w="2340" w:type="dxa"/>
+          </w:tcPr>
+          <w:p>
+            <w:pPr/>
+            <w:r>
+              <w:t xml:space="preserve">REQ_IO_A8.65.2</w:t>
+            </w:r>
+          </w:p>
+        </w:tc>
+        <w:tc>
+          <w:tcPr>
+            <w:tcW w:w="2340" w:type="dxa"/>
+          </w:tcPr>
+          <w:p>
+            <w:pPr/>
+            <w:r>
+              <w:rPr>
+                <w:b/>
+              </w:rPr>
+              <w:t xml:space="preserve">Version</w:t>
+            </w:r>
+          </w:p>
+        </w:tc>
+        <w:tc>
+          <w:tcPr>
+            <w:tcW w:w="2340" w:type="dxa"/>
+          </w:tcPr>
+          <w:p>
+            <w:pPr/>
+            <w:r>
+              <w:t xml:space="preserve">1.0</w:t>
+            </w:r>
+          </w:p>
+        </w:tc>
+      </w:tr>
+      <w:tr>
+        <w:tc>
+          <w:tcPr>
+            <w:tcW w:w="2340" w:type="dxa"/>
+          </w:tcPr>
+          <w:p>
+            <w:pPr/>
+            <w:r>
+              <w:rPr>
+                <w:b/>
+              </w:rPr>
+              <w:t xml:space="preserve">Item</w:t>
+            </w:r>
+          </w:p>
+        </w:tc>
+        <w:tc>
+          <w:tcPr>
+            <w:tcW w:w="7020" w:type="dxa"/>
+            <w:gridSpan w:val="3"/>
+          </w:tcPr>
+          <w:p>
+            <w:pPr/>
+            <w:r>
+              <w:t xml:space="preserve">Branch / Department (Dropdown)</w:t>
+            </w:r>
+          </w:p>
+        </w:tc>
+      </w:tr>
+      <w:tr>
+        <w:tc>
+          <w:tcPr>
+            <w:tcW w:w="2340" w:type="dxa"/>
+          </w:tcPr>
+          <w:p>
+            <w:pPr/>
+            <w:r>
+              <w:rPr>
+                <w:b/>
+              </w:rPr>
+              <w:t xml:space="preserve">Description</w:t>
+            </w:r>
+          </w:p>
+        </w:tc>
+        <w:tc>
+          <w:tcPr>
+            <w:tcW w:w="7020" w:type="dxa"/>
+            <w:gridSpan w:val="3"/>
+          </w:tcPr>
+          <w:p>
+            <w:pPr/>
+            <w:r>
+              <w:t xml:space="preserve">分店／部門</w:t>
+            </w:r>
+          </w:p>
+        </w:tc>
+      </w:tr>
+      <w:tr>
+        <w:tc>
+          <w:tcPr>
+            <w:tcW w:w="2340" w:type="dxa"/>
+          </w:tcPr>
+          <w:p>
+            <w:pPr/>
+            <w:r>
+              <w:rPr>
+                <w:b/>
+              </w:rPr>
+              <w:t xml:space="preserve">Purpose</w:t>
+            </w:r>
+          </w:p>
+        </w:tc>
+        <w:tc>
+          <w:tcPr>
+            <w:tcW w:w="7020" w:type="dxa"/>
+            <w:gridSpan w:val="3"/>
+          </w:tcPr>
+          <w:p>
+            <w:pPr/>
+            <w:r>
+              <w:t xml:space="preserve">組織歸屬（資料範圍用）</w:t>
+            </w:r>
+          </w:p>
+        </w:tc>
+      </w:tr>
+      <w:tr>
+        <w:tc>
+          <w:tcPr>
+            <w:tcW w:w="2340" w:type="dxa"/>
+          </w:tcPr>
+          <w:p>
+            <w:pPr/>
+            <w:r>
+              <w:rPr>
+                <w:b/>
+              </w:rPr>
+              <w:t xml:space="preserve">Format</w:t>
+            </w:r>
+          </w:p>
+        </w:tc>
+        <w:tc>
+          <w:tcPr>
+            <w:tcW w:w="2340" w:type="dxa"/>
+          </w:tcPr>
+          <w:p>
+            <w:pPr/>
+            <w:r>
+              <w:t xml:space="preserve">bigint ID，可清空</w:t>
+            </w:r>
+          </w:p>
+        </w:tc>
+        <w:tc>
+          <w:tcPr>
+            <w:tcW w:w="2340" w:type="dxa"/>
+          </w:tcPr>
+          <w:p>
+            <w:pPr/>
+            <w:r>
+              <w:rPr>
+                <w:b/>
+              </w:rPr>
+              <w:t xml:space="preserve">Valid Range</w:t>
+            </w:r>
+          </w:p>
+        </w:tc>
+        <w:tc>
+          <w:tcPr>
+            <w:tcW w:w="2340" w:type="dxa"/>
+          </w:tcPr>
+          <w:p>
+            <w:pPr/>
+            <w:r>
+              <w:t xml:space="preserve">所選公司的啟用分店／部門</w:t>
+            </w:r>
+          </w:p>
+        </w:tc>
+      </w:tr>
+      <w:tr>
+        <w:tc>
+          <w:tcPr>
+            <w:tcW w:w="2340" w:type="dxa"/>
+          </w:tcPr>
+          <w:p>
+            <w:pPr/>
+            <w:r>
+              <w:rPr>
+                <w:b/>
+              </w:rPr>
+              <w:t xml:space="preserve">Related I/O</w:t>
+            </w:r>
+          </w:p>
+        </w:tc>
+        <w:tc>
+          <w:tcPr>
+            <w:tcW w:w="7020" w:type="dxa"/>
+            <w:gridSpan w:val="3"/>
+          </w:tcPr>
+          <w:p>
+            <w:pPr/>
+            <w:r>
+              <w:t xml:space="preserve">REQ_IO_A8.65.1</w:t>
+            </w:r>
+          </w:p>
+        </w:tc>
+      </w:tr>
+      <w:tr>
+        <w:tc>
+          <w:tcPr>
+            <w:tcW w:w="2340" w:type="dxa"/>
+          </w:tcPr>
+          <w:p>
+            <w:pPr/>
+            <w:r>
+              <w:rPr>
+                <w:b/>
+              </w:rPr>
+              <w:t xml:space="preserve">Author</w:t>
+            </w:r>
+          </w:p>
+        </w:tc>
+        <w:tc>
+          <w:tcPr>
+            <w:tcW w:w="7020" w:type="dxa"/>
+            <w:gridSpan w:val="3"/>
+          </w:tcPr>
+          <w:p>
+            <w:pPr/>
+            <w:r>
+              <w:t xml:space="preserve">Developer</w:t>
+            </w:r>
+          </w:p>
+        </w:tc>
+      </w:tr>
+    </w:tbl>
+    <w:p/>
+    <w:tbl>
+      <w:tblPr>
+        <w:tblStyle w:val="TableGrid"/>
+        <w:tblW w:w="9360" w:type="dxa"/>
+        <w:jc w:val="left"/>
+        <w:tblBorders>
+          <w:top w:val="single" w:color="000000" w:sz="6" w:space="0"/>
+          <w:left w:val="single" w:color="000000" w:sz="6" w:space="0"/>
+          <w:bottom w:val="single" w:color="000000" w:sz="6" w:space="0"/>
+          <w:right w:val="single" w:color="000000" w:sz="6" w:space="0"/>
+          <w:insideH w:val="single" w:color="000000" w:sz="6" w:space="0"/>
+          <w:insideV w:val="single" w:color="000000" w:sz="6" w:space="0"/>
+        </w:tblBorders>
+        <w:tblLayout w:type="fixed"/>
+        <w:tblCellMar>
+          <w:top w:w="100" w:type="dxa"/>
+          <w:left w:w="100" w:type="dxa"/>
+          <w:bottom w:w="100" w:type="dxa"/>
+          <w:right w:w="100" w:type="dxa"/>
+        </w:tblCellMar>
+      </w:tblPr>
+      <w:tblGrid>
+        <w:gridCol w:w="2340"/>
+        <w:gridCol w:w="2340"/>
+        <w:gridCol w:w="2340"/>
+        <w:gridCol w:w="2340"/>
+      </w:tblGrid>
+      <w:tr>
+        <w:tc>
+          <w:tcPr>
+            <w:tcW w:w="2340" w:type="dxa"/>
+          </w:tcPr>
+          <w:p>
+            <w:pPr/>
+            <w:r>
+              <w:rPr>
+                <w:b/>
+              </w:rPr>
+              <w:t xml:space="preserve">Requirement ID</w:t>
+            </w:r>
+          </w:p>
+        </w:tc>
+        <w:tc>
+          <w:tcPr>
+            <w:tcW w:w="2340" w:type="dxa"/>
+          </w:tcPr>
+          <w:p>
+            <w:pPr/>
+            <w:r>
+              <w:t xml:space="preserve">REQ_IO_A8.65.3</w:t>
+            </w:r>
+          </w:p>
+        </w:tc>
+        <w:tc>
+          <w:tcPr>
+            <w:tcW w:w="2340" w:type="dxa"/>
+          </w:tcPr>
+          <w:p>
+            <w:pPr/>
+            <w:r>
+              <w:rPr>
+                <w:b/>
+              </w:rPr>
+              <w:t xml:space="preserve">Version</w:t>
+            </w:r>
+          </w:p>
+        </w:tc>
+        <w:tc>
+          <w:tcPr>
+            <w:tcW w:w="2340" w:type="dxa"/>
+          </w:tcPr>
+          <w:p>
+            <w:pPr/>
+            <w:r>
+              <w:t xml:space="preserve">1.0</w:t>
+            </w:r>
+          </w:p>
+        </w:tc>
+      </w:tr>
+      <w:tr>
+        <w:tc>
+          <w:tcPr>
+            <w:tcW w:w="2340" w:type="dxa"/>
+          </w:tcPr>
+          <w:p>
+            <w:pPr/>
+            <w:r>
+              <w:rPr>
+                <w:b/>
+              </w:rPr>
+              <w:t xml:space="preserve">Item</w:t>
+            </w:r>
+          </w:p>
+        </w:tc>
+        <w:tc>
+          <w:tcPr>
+            <w:tcW w:w="7020" w:type="dxa"/>
+            <w:gridSpan w:val="3"/>
+          </w:tcPr>
+          <w:p>
+            <w:pPr/>
+            <w:r>
+              <w:t xml:space="preserve">Roles (Multi-select)</w:t>
+            </w:r>
+          </w:p>
+        </w:tc>
+      </w:tr>
+      <w:tr>
+        <w:tc>
+          <w:tcPr>
+            <w:tcW w:w="2340" w:type="dxa"/>
+          </w:tcPr>
+          <w:p>
+            <w:pPr/>
+            <w:r>
+              <w:rPr>
+                <w:b/>
+              </w:rPr>
+              <w:t xml:space="preserve">Description</w:t>
+            </w:r>
+          </w:p>
+        </w:tc>
+        <w:tc>
+          <w:tcPr>
+            <w:tcW w:w="7020" w:type="dxa"/>
+            <w:gridSpan w:val="3"/>
+          </w:tcPr>
+          <w:p>
+            <w:pPr/>
+            <w:r>
+              <w:t xml:space="preserve">角色</w:t>
+            </w:r>
+          </w:p>
+        </w:tc>
+      </w:tr>
+      <w:tr>
+        <w:tc>
+          <w:tcPr>
+            <w:tcW w:w="2340" w:type="dxa"/>
+          </w:tcPr>
+          <w:p>
+            <w:pPr/>
+            <w:r>
+              <w:rPr>
+                <w:b/>
+              </w:rPr>
+              <w:t xml:space="preserve">Purpose</w:t>
+            </w:r>
+          </w:p>
+        </w:tc>
+        <w:tc>
+          <w:tcPr>
+            <w:tcW w:w="7020" w:type="dxa"/>
+            <w:gridSpan w:val="3"/>
+          </w:tcPr>
+          <w:p>
+            <w:pPr/>
+            <w:r>
+              <w:t xml:space="preserve">整組取代該公司的角色</w:t>
+            </w:r>
+          </w:p>
+        </w:tc>
+      </w:tr>
+      <w:tr>
+        <w:tc>
+          <w:tcPr>
+            <w:tcW w:w="2340" w:type="dxa"/>
+          </w:tcPr>
+          <w:p>
+            <w:pPr/>
+            <w:r>
+              <w:rPr>
+                <w:b/>
+              </w:rPr>
+              <w:t xml:space="preserve">Format</w:t>
+            </w:r>
+          </w:p>
+        </w:tc>
+        <w:tc>
+          <w:tcPr>
+            <w:tcW w:w="2340" w:type="dxa"/>
+          </w:tcPr>
+          <w:p>
+            <w:pPr/>
+            <w:r>
+              <w:t xml:space="preserve">bigint ID 陣列</w:t>
+            </w:r>
+          </w:p>
+        </w:tc>
+        <w:tc>
+          <w:tcPr>
+            <w:tcW w:w="2340" w:type="dxa"/>
+          </w:tcPr>
+          <w:p>
+            <w:pPr/>
+            <w:r>
+              <w:rPr>
+                <w:b/>
+              </w:rPr>
+              <w:t xml:space="preserve">Valid Range</w:t>
+            </w:r>
+          </w:p>
+        </w:tc>
+        <w:tc>
+          <w:tcPr>
+            <w:tcW w:w="2340" w:type="dxa"/>
+          </w:tcPr>
+          <w:p>
+            <w:pPr/>
+            <w:r>
+              <w:t xml:space="preserve">啟用角色；可為空（無權限）</w:t>
+            </w:r>
+          </w:p>
+        </w:tc>
+      </w:tr>
+      <w:tr>
+        <w:tc>
+          <w:tcPr>
+            <w:tcW w:w="2340" w:type="dxa"/>
+          </w:tcPr>
+          <w:p>
+            <w:pPr/>
+            <w:r>
+              <w:rPr>
+                <w:b/>
+              </w:rPr>
+              <w:t xml:space="preserve">Related I/O</w:t>
+            </w:r>
+          </w:p>
+        </w:tc>
+        <w:tc>
+          <w:tcPr>
+            <w:tcW w:w="7020" w:type="dxa"/>
+            <w:gridSpan w:val="3"/>
+          </w:tcPr>
+          <w:p>
+            <w:pPr/>
+            <w:r>
+              <w:t xml:space="preserve">None</w:t>
+            </w:r>
+          </w:p>
+        </w:tc>
+      </w:tr>
+      <w:tr>
+        <w:tc>
+          <w:tcPr>
+            <w:tcW w:w="2340" w:type="dxa"/>
+          </w:tcPr>
+          <w:p>
+            <w:pPr/>
+            <w:r>
+              <w:rPr>
+                <w:b/>
+              </w:rPr>
+              <w:t xml:space="preserve">Author</w:t>
+            </w:r>
+          </w:p>
+        </w:tc>
+        <w:tc>
+          <w:tcPr>
+            <w:tcW w:w="7020" w:type="dxa"/>
+            <w:gridSpan w:val="3"/>
+          </w:tcPr>
+          <w:p>
+            <w:pPr/>
+            <w:r>
+              <w:t xml:space="preserve">Developer</w:t>
+            </w:r>
+          </w:p>
+        </w:tc>
+      </w:tr>
+    </w:tbl>
+    <w:p/>
+    <w:tbl>
+      <w:tblPr>
+        <w:tblStyle w:val="TableGrid"/>
+        <w:tblW w:w="9360" w:type="dxa"/>
+        <w:jc w:val="left"/>
+        <w:tblBorders>
+          <w:top w:val="single" w:color="000000" w:sz="6" w:space="0"/>
+          <w:left w:val="single" w:color="000000" w:sz="6" w:space="0"/>
+          <w:bottom w:val="single" w:color="000000" w:sz="6" w:space="0"/>
+          <w:right w:val="single" w:color="000000" w:sz="6" w:space="0"/>
+          <w:insideH w:val="single" w:color="000000" w:sz="6" w:space="0"/>
+          <w:insideV w:val="single" w:color="000000" w:sz="6" w:space="0"/>
+        </w:tblBorders>
+        <w:tblLayout w:type="fixed"/>
+        <w:tblCellMar>
+          <w:top w:w="100" w:type="dxa"/>
+          <w:left w:w="100" w:type="dxa"/>
+          <w:bottom w:w="100" w:type="dxa"/>
+          <w:right w:w="100" w:type="dxa"/>
+        </w:tblCellMar>
+      </w:tblPr>
+      <w:tblGrid>
+        <w:gridCol w:w="2340"/>
+        <w:gridCol w:w="2340"/>
+        <w:gridCol w:w="2340"/>
+        <w:gridCol w:w="2340"/>
+      </w:tblGrid>
+      <w:tr>
+        <w:tc>
+          <w:tcPr>
+            <w:tcW w:w="2340" w:type="dxa"/>
+          </w:tcPr>
+          <w:p>
+            <w:pPr/>
+            <w:r>
+              <w:rPr>
+                <w:b/>
+              </w:rPr>
+              <w:t xml:space="preserve">Requirement ID</w:t>
+            </w:r>
+          </w:p>
+        </w:tc>
+        <w:tc>
+          <w:tcPr>
+            <w:tcW w:w="2340" w:type="dxa"/>
+          </w:tcPr>
+          <w:p>
+            <w:pPr/>
+            <w:r>
+              <w:t xml:space="preserve">REQ_IO_A8.65.4</w:t>
+            </w:r>
+          </w:p>
+        </w:tc>
+        <w:tc>
+          <w:tcPr>
+            <w:tcW w:w="2340" w:type="dxa"/>
+          </w:tcPr>
+          <w:p>
+            <w:pPr/>
+            <w:r>
+              <w:rPr>
+                <w:b/>
+              </w:rPr>
+              <w:t xml:space="preserve">Version</w:t>
+            </w:r>
+          </w:p>
+        </w:tc>
+        <w:tc>
+          <w:tcPr>
+            <w:tcW w:w="2340" w:type="dxa"/>
+          </w:tcPr>
+          <w:p>
+            <w:pPr/>
+            <w:r>
+              <w:t xml:space="preserve">1.0</w:t>
+            </w:r>
+          </w:p>
+        </w:tc>
+      </w:tr>
+      <w:tr>
+        <w:tc>
+          <w:tcPr>
+            <w:tcW w:w="2340" w:type="dxa"/>
+          </w:tcPr>
+          <w:p>
+            <w:pPr/>
+            <w:r>
+              <w:rPr>
+                <w:b/>
+              </w:rPr>
+              <w:t xml:space="preserve">Item</w:t>
+            </w:r>
+          </w:p>
+        </w:tc>
+        <w:tc>
+          <w:tcPr>
+            <w:tcW w:w="7020" w:type="dxa"/>
+            <w:gridSpan w:val="3"/>
+          </w:tcPr>
+          <w:p>
+            <w:pPr/>
+            <w:r>
+              <w:t xml:space="preserve">Default Company (Checkbox)</w:t>
+            </w:r>
+          </w:p>
+        </w:tc>
+      </w:tr>
+      <w:tr>
+        <w:tc>
+          <w:tcPr>
+            <w:tcW w:w="2340" w:type="dxa"/>
+          </w:tcPr>
+          <w:p>
+            <w:pPr/>
+            <w:r>
+              <w:rPr>
+                <w:b/>
+              </w:rPr>
+              <w:t xml:space="preserve">Description</w:t>
+            </w:r>
+          </w:p>
+        </w:tc>
+        <w:tc>
+          <w:tcPr>
+            <w:tcW w:w="7020" w:type="dxa"/>
+            <w:gridSpan w:val="3"/>
+          </w:tcPr>
+          <w:p>
+            <w:pPr/>
+            <w:r>
+              <w:t xml:space="preserve">預設公司</w:t>
+            </w:r>
+          </w:p>
+        </w:tc>
+      </w:tr>
+      <w:tr>
+        <w:tc>
+          <w:tcPr>
+            <w:tcW w:w="2340" w:type="dxa"/>
+          </w:tcPr>
+          <w:p>
+            <w:pPr/>
+            <w:r>
+              <w:rPr>
+                <w:b/>
+              </w:rPr>
+              <w:t xml:space="preserve">Purpose</w:t>
+            </w:r>
+          </w:p>
+        </w:tc>
+        <w:tc>
+          <w:tcPr>
+            <w:tcW w:w="7020" w:type="dxa"/>
+            <w:gridSpan w:val="3"/>
+          </w:tcPr>
+          <w:p>
+            <w:pPr/>
+            <w:r>
+              <w:t xml:space="preserve">登入後預設的操作公司</w:t>
+            </w:r>
+          </w:p>
+        </w:tc>
+      </w:tr>
+      <w:tr>
+        <w:tc>
+          <w:tcPr>
+            <w:tcW w:w="2340" w:type="dxa"/>
+          </w:tcPr>
+          <w:p>
+            <w:pPr/>
+            <w:r>
+              <w:rPr>
+                <w:b/>
+              </w:rPr>
+              <w:t xml:space="preserve">Format</w:t>
+            </w:r>
+          </w:p>
+        </w:tc>
+        <w:tc>
+          <w:tcPr>
+            <w:tcW w:w="2340" w:type="dxa"/>
+          </w:tcPr>
+          <w:p>
+            <w:pPr/>
+            <w:r>
+              <w:t xml:space="preserve">Boolean</w:t>
+            </w:r>
+          </w:p>
+        </w:tc>
+        <w:tc>
+          <w:tcPr>
+            <w:tcW w:w="2340" w:type="dxa"/>
+          </w:tcPr>
+          <w:p>
+            <w:pPr/>
+            <w:r>
+              <w:rPr>
+                <w:b/>
+              </w:rPr>
+              <w:t xml:space="preserve">Valid Range</w:t>
+            </w:r>
+          </w:p>
+        </w:tc>
+        <w:tc>
+          <w:tcPr>
+            <w:tcW w:w="2340" w:type="dxa"/>
+          </w:tcPr>
+          <w:p>
+            <w:pPr/>
+            <w:r>
+              <w:t xml:space="preserve">設定後取消其他預設</w:t>
+            </w:r>
+          </w:p>
+        </w:tc>
+      </w:tr>
+      <w:tr>
+        <w:tc>
+          <w:tcPr>
+            <w:tcW w:w="2340" w:type="dxa"/>
+          </w:tcPr>
+          <w:p>
+            <w:pPr/>
+            <w:r>
+              <w:rPr>
+                <w:b/>
+              </w:rPr>
+              <w:t xml:space="preserve">Related I/O</w:t>
+            </w:r>
+          </w:p>
+        </w:tc>
+        <w:tc>
+          <w:tcPr>
+            <w:tcW w:w="7020" w:type="dxa"/>
+            <w:gridSpan w:val="3"/>
+          </w:tcPr>
+          <w:p>
+            <w:pPr/>
+            <w:r>
+              <w:t xml:space="preserve">None</w:t>
+            </w:r>
+          </w:p>
+        </w:tc>
+      </w:tr>
+      <w:tr>
+        <w:tc>
+          <w:tcPr>
+            <w:tcW w:w="2340" w:type="dxa"/>
+          </w:tcPr>
+          <w:p>
+            <w:pPr/>
+            <w:r>
+              <w:rPr>
+                <w:b/>
+              </w:rPr>
+              <w:t xml:space="preserve">Author</w:t>
+            </w:r>
+          </w:p>
+        </w:tc>
+        <w:tc>
+          <w:tcPr>
+            <w:tcW w:w="7020" w:type="dxa"/>
+            <w:gridSpan w:val="3"/>
+          </w:tcPr>
+          <w:p>
+            <w:pPr/>
+            <w:r>
+              <w:t xml:space="preserve">Developer</w:t>
+            </w:r>
+          </w:p>
+        </w:tc>
+      </w:tr>
+    </w:tbl>
+    <w:p/>
+    <w:tbl>
+      <w:tblPr>
+        <w:tblStyle w:val="TableGrid"/>
+        <w:tblW w:w="9360" w:type="dxa"/>
+        <w:jc w:val="left"/>
+        <w:tblBorders>
+          <w:top w:val="single" w:color="000000" w:sz="6" w:space="0"/>
+          <w:left w:val="single" w:color="000000" w:sz="6" w:space="0"/>
+          <w:bottom w:val="single" w:color="000000" w:sz="6" w:space="0"/>
+          <w:right w:val="single" w:color="000000" w:sz="6" w:space="0"/>
+          <w:insideH w:val="single" w:color="000000" w:sz="6" w:space="0"/>
+          <w:insideV w:val="single" w:color="000000" w:sz="6" w:space="0"/>
+        </w:tblBorders>
+        <w:tblLayout w:type="fixed"/>
+        <w:tblCellMar>
+          <w:top w:w="100" w:type="dxa"/>
+          <w:left w:w="100" w:type="dxa"/>
+          <w:bottom w:w="100" w:type="dxa"/>
+          <w:right w:w="100" w:type="dxa"/>
+        </w:tblCellMar>
+      </w:tblPr>
+      <w:tblGrid>
+        <w:gridCol w:w="2340"/>
+        <w:gridCol w:w="2340"/>
+        <w:gridCol w:w="2340"/>
+        <w:gridCol w:w="2340"/>
+      </w:tblGrid>
+      <w:tr>
+        <w:tc>
+          <w:tcPr>
+            <w:tcW w:w="2340" w:type="dxa"/>
+          </w:tcPr>
+          <w:p>
+            <w:pPr/>
+            <w:r>
+              <w:rPr>
+                <w:b/>
+              </w:rPr>
+              <w:t xml:space="preserve">Requirement ID</w:t>
+            </w:r>
+          </w:p>
+        </w:tc>
+        <w:tc>
+          <w:tcPr>
+            <w:tcW w:w="2340" w:type="dxa"/>
+          </w:tcPr>
+          <w:p>
+            <w:pPr/>
+            <w:r>
+              <w:t xml:space="preserve">REQ_IO_A8.65.5</w:t>
+            </w:r>
+          </w:p>
+        </w:tc>
+        <w:tc>
+          <w:tcPr>
+            <w:tcW w:w="2340" w:type="dxa"/>
+          </w:tcPr>
+          <w:p>
+            <w:pPr/>
+            <w:r>
+              <w:rPr>
+                <w:b/>
+              </w:rPr>
+              <w:t xml:space="preserve">Version</w:t>
+            </w:r>
+          </w:p>
+        </w:tc>
+        <w:tc>
+          <w:tcPr>
+            <w:tcW w:w="2340" w:type="dxa"/>
+          </w:tcPr>
+          <w:p>
+            <w:pPr/>
+            <w:r>
+              <w:t xml:space="preserve">1.0</w:t>
+            </w:r>
+          </w:p>
+        </w:tc>
+      </w:tr>
+      <w:tr>
+        <w:tc>
+          <w:tcPr>
+            <w:tcW w:w="2340" w:type="dxa"/>
+          </w:tcPr>
+          <w:p>
+            <w:pPr/>
+            <w:r>
+              <w:rPr>
+                <w:b/>
+              </w:rPr>
+              <w:t xml:space="preserve">Item</w:t>
+            </w:r>
+          </w:p>
+        </w:tc>
+        <w:tc>
+          <w:tcPr>
+            <w:tcW w:w="7020" w:type="dxa"/>
+            <w:gridSpan w:val="3"/>
+          </w:tcPr>
+          <w:p>
+            <w:pPr/>
+            <w:r>
+              <w:t xml:space="preserve">Access Active (Checkbox)</w:t>
+            </w:r>
+          </w:p>
+        </w:tc>
+      </w:tr>
+      <w:tr>
+        <w:tc>
+          <w:tcPr>
+            <w:tcW w:w="2340" w:type="dxa"/>
+          </w:tcPr>
+          <w:p>
+            <w:pPr/>
+            <w:r>
+              <w:rPr>
+                <w:b/>
+              </w:rPr>
+              <w:t xml:space="preserve">Description</w:t>
+            </w:r>
+          </w:p>
+        </w:tc>
+        <w:tc>
+          <w:tcPr>
+            <w:tcW w:w="7020" w:type="dxa"/>
+            <w:gridSpan w:val="3"/>
+          </w:tcPr>
+          <w:p>
+            <w:pPr/>
+            <w:r>
+              <w:t xml:space="preserve">啟用存取</w:t>
+            </w:r>
+          </w:p>
+        </w:tc>
+      </w:tr>
+      <w:tr>
+        <w:tc>
+          <w:tcPr>
+            <w:tcW w:w="2340" w:type="dxa"/>
+          </w:tcPr>
+          <w:p>
+            <w:pPr/>
+            <w:r>
+              <w:rPr>
+                <w:b/>
+              </w:rPr>
+              <w:t xml:space="preserve">Purpose</w:t>
+            </w:r>
+          </w:p>
+        </w:tc>
+        <w:tc>
+          <w:tcPr>
+            <w:tcW w:w="7020" w:type="dxa"/>
+            <w:gridSpan w:val="3"/>
+          </w:tcPr>
+          <w:p>
+            <w:pPr/>
+            <w:r>
+              <w:t xml:space="preserve">停用後該公司不授權</w:t>
+            </w:r>
+          </w:p>
+        </w:tc>
+      </w:tr>
+      <w:tr>
+        <w:tc>
+          <w:tcPr>
+            <w:tcW w:w="2340" w:type="dxa"/>
+          </w:tcPr>
+          <w:p>
+            <w:pPr/>
+            <w:r>
+              <w:rPr>
+                <w:b/>
+              </w:rPr>
+              <w:t xml:space="preserve">Format</w:t>
+            </w:r>
+          </w:p>
+        </w:tc>
+        <w:tc>
+          <w:tcPr>
+            <w:tcW w:w="2340" w:type="dxa"/>
+          </w:tcPr>
+          <w:p>
+            <w:pPr/>
+            <w:r>
+              <w:t xml:space="preserve">Boolean</w:t>
+            </w:r>
+          </w:p>
+        </w:tc>
+        <w:tc>
+          <w:tcPr>
+            <w:tcW w:w="2340" w:type="dxa"/>
+          </w:tcPr>
+          <w:p>
+            <w:pPr/>
+            <w:r>
+              <w:rPr>
+                <w:b/>
+              </w:rPr>
+              <w:t xml:space="preserve">Valid Range</w:t>
+            </w:r>
+          </w:p>
+        </w:tc>
+        <w:tc>
+          <w:tcPr>
+            <w:tcW w:w="2340" w:type="dxa"/>
+          </w:tcPr>
+          <w:p>
+            <w:pPr/>
+            <w:r>
+              <w:t xml:space="preserve">不可停用自己</w:t>
+            </w:r>
+          </w:p>
+        </w:tc>
+      </w:tr>
+      <w:tr>
+        <w:tc>
+          <w:tcPr>
+            <w:tcW w:w="2340" w:type="dxa"/>
+          </w:tcPr>
+          <w:p>
+            <w:pPr/>
+            <w:r>
+              <w:rPr>
+                <w:b/>
+              </w:rPr>
+              <w:t xml:space="preserve">Related I/O</w:t>
+            </w:r>
+          </w:p>
+        </w:tc>
+        <w:tc>
+          <w:tcPr>
+            <w:tcW w:w="7020" w:type="dxa"/>
+            <w:gridSpan w:val="3"/>
+          </w:tcPr>
+          <w:p>
+            <w:pPr/>
+            <w:r>
+              <w:t xml:space="preserve">None</w:t>
             </w:r>
           </w:p>
         </w:tc>
@@ -12293,6 +16488,44 @@
     </w:p>
     <w:p>
       <w:pPr>
+        <w:pStyle w:val="Heading5"/>
+      </w:pPr>
+      <w:r>
+        <w:t xml:space="preserve">4.5.1.8.64 Role Maintenance Interface</w:t>
+      </w:r>
+    </w:p>
+    <w:p>
+      <w:pPr>
+        <w:jc w:val="center"/>
+      </w:pPr>
+      <w:r>
+        <w:rPr>
+          <w:i/>
+        </w:rPr>
+        <w:t xml:space="preserve">[Pending] Prototype screenshot of Role Maintenance Interface.</w:t>
+      </w:r>
+    </w:p>
+    <w:p>
+      <w:pPr>
+        <w:pStyle w:val="Heading5"/>
+      </w:pPr>
+      <w:r>
+        <w:t xml:space="preserve">4.5.1.8.65 User Permission Edit Interface（BlueWhale 4.4.1.8.26）</w:t>
+      </w:r>
+    </w:p>
+    <w:p>
+      <w:pPr>
+        <w:jc w:val="center"/>
+      </w:pPr>
+      <w:r>
+        <w:rPr>
+          <w:i/>
+        </w:rPr>
+        <w:t xml:space="preserve">[Pending] Prototype screenshot of User Permission Edit Interface（BlueWhale 4.4.1.8.26）.</w:t>
+      </w:r>
+    </w:p>
+    <w:p>
+      <w:pPr>
         <w:pStyle w:val="Heading2"/>
       </w:pPr>
       <w:r>
@@ -12385,7 +16618,7 @@
       </w:r>
     </w:p>
     <w:sectPr>
-      <w:footerReference xmlns:r="http://schemas.openxmlformats.org/officeDocument/2006/relationships" w:type="default" r:id="Re46990307fc0405c"/>
+      <w:footerReference xmlns:r="http://schemas.openxmlformats.org/officeDocument/2006/relationships" w:type="default" r:id="Rcfe47a637e1441b6"/>
       <w:pgSz w:w="11906" w:h="16838"/>
       <w:pgMar w:top="1440" w:right="1440" w:bottom="1440" w:left="1440" w:header="720" w:footer="720" w:gutter="0"/>
     </w:sectPr>

</xml_diff>

<commit_message>
docs(sys): document audit log backend (ADR-019) for WU-SYS-007 part 1
Adds ADR-019, REQ_F4118.27.1-6, REQ_DS43.94 sys_audit_log, audit API docs,
SYS-AUDIT test plan, optimization log entries, and updates backlog,
progress and state (audit page remains for part 2).

Co-Authored-By: Claude Opus 5.5 <noreply@anthropic.com>
</commit_message>
<xml_diff>
--- a/docs/99-output/MyERP_SRS.docx
+++ b/docs/99-output/MyERP_SRS.docx
@@ -6633,6 +6633,890 @@
     <w:p/>
     <w:p>
       <w:pPr>
+        <w:pStyle w:val="Heading5"/>
+      </w:pPr>
+      <w:r>
+        <w:t xml:space="preserve">4.1.1.8.27 Audit Log</w:t>
+      </w:r>
+    </w:p>
+    <w:tbl>
+      <w:tblPr>
+        <w:tblStyle w:val="TableGrid"/>
+        <w:tblW w:w="9345" w:type="dxa"/>
+        <w:jc w:val="left"/>
+        <w:tblBorders>
+          <w:top w:val="single" w:color="000000" w:sz="8" w:space="0"/>
+          <w:left w:val="single" w:color="000000" w:sz="8" w:space="0"/>
+          <w:bottom w:val="single" w:color="000000" w:sz="8" w:space="0"/>
+          <w:right w:val="single" w:color="000000" w:sz="8" w:space="0"/>
+          <w:insideH w:val="single" w:color="000000" w:sz="8" w:space="0"/>
+          <w:insideV w:val="single" w:color="000000" w:sz="8" w:space="0"/>
+        </w:tblBorders>
+        <w:tblLayout w:type="fixed"/>
+        <w:tblCellMar>
+          <w:top w:w="100" w:type="dxa"/>
+          <w:left w:w="100" w:type="dxa"/>
+          <w:bottom w:w="100" w:type="dxa"/>
+          <w:right w:w="100" w:type="dxa"/>
+        </w:tblCellMar>
+      </w:tblPr>
+      <w:tblGrid>
+        <w:gridCol w:w="2220"/>
+        <w:gridCol w:w="3525"/>
+        <w:gridCol w:w="2370"/>
+        <w:gridCol w:w="1230"/>
+      </w:tblGrid>
+      <w:tr>
+        <w:trPr>
+          <w:trHeight w:val="465" w:hRule="atLeast"/>
+        </w:trPr>
+        <w:tc>
+          <w:tcPr>
+            <w:tcW w:w="2220" w:type="dxa"/>
+          </w:tcPr>
+          <w:p>
+            <w:pPr/>
+            <w:r>
+              <w:rPr>
+                <w:b/>
+              </w:rPr>
+              <w:t xml:space="preserve">Requirement ID</w:t>
+            </w:r>
+          </w:p>
+        </w:tc>
+        <w:tc>
+          <w:tcPr>
+            <w:tcW w:w="3525" w:type="dxa"/>
+          </w:tcPr>
+          <w:p>
+            <w:pPr/>
+            <w:r>
+              <w:t xml:space="preserve">REQ_F4118.27.1</w:t>
+            </w:r>
+          </w:p>
+        </w:tc>
+        <w:tc>
+          <w:tcPr>
+            <w:tcW w:w="2370" w:type="dxa"/>
+          </w:tcPr>
+          <w:p>
+            <w:pPr/>
+            <w:r>
+              <w:rPr>
+                <w:b/>
+              </w:rPr>
+              <w:t xml:space="preserve">Version</w:t>
+            </w:r>
+          </w:p>
+        </w:tc>
+        <w:tc>
+          <w:tcPr>
+            <w:tcW w:w="1230" w:type="dxa"/>
+          </w:tcPr>
+          <w:p>
+            <w:pPr/>
+            <w:r>
+              <w:t xml:space="preserve">1.0</w:t>
+            </w:r>
+          </w:p>
+        </w:tc>
+      </w:tr>
+      <w:tr>
+        <w:trPr>
+          <w:trHeight w:val="465" w:hRule="atLeast"/>
+        </w:trPr>
+        <w:tc>
+          <w:tcPr>
+            <w:tcW w:w="2220" w:type="dxa"/>
+          </w:tcPr>
+          <w:p>
+            <w:pPr/>
+            <w:r>
+              <w:rPr>
+                <w:b/>
+              </w:rPr>
+              <w:t xml:space="preserve">Description</w:t>
+            </w:r>
+          </w:p>
+        </w:tc>
+        <w:tc>
+          <w:tcPr>
+            <w:tcW w:w="7125" w:type="dxa"/>
+            <w:gridSpan w:val="3"/>
+          </w:tcPr>
+          <w:p>
+            <w:pPr/>
+            <w:r>
+              <w:t xml:space="preserve">System should record every data change in sys_audit_log within the same transaction.</w:t>
+            </w:r>
+          </w:p>
+        </w:tc>
+      </w:tr>
+      <w:tr>
+        <w:trPr>
+          <w:trHeight w:val="465" w:hRule="atLeast"/>
+        </w:trPr>
+        <w:tc>
+          <w:tcPr>
+            <w:tcW w:w="2220" w:type="dxa"/>
+          </w:tcPr>
+          <w:p>
+            <w:pPr/>
+            <w:r>
+              <w:rPr>
+                <w:b/>
+              </w:rPr>
+              <w:t xml:space="preserve">Author</w:t>
+            </w:r>
+          </w:p>
+        </w:tc>
+        <w:tc>
+          <w:tcPr>
+            <w:tcW w:w="7125" w:type="dxa"/>
+            <w:gridSpan w:val="3"/>
+          </w:tcPr>
+          <w:p>
+            <w:pPr/>
+            <w:r>
+              <w:t xml:space="preserve">Developer</w:t>
+            </w:r>
+          </w:p>
+        </w:tc>
+      </w:tr>
+    </w:tbl>
+    <w:p/>
+    <w:tbl>
+      <w:tblPr>
+        <w:tblStyle w:val="TableGrid"/>
+        <w:tblW w:w="9345" w:type="dxa"/>
+        <w:jc w:val="left"/>
+        <w:tblBorders>
+          <w:top w:val="single" w:color="000000" w:sz="8" w:space="0"/>
+          <w:left w:val="single" w:color="000000" w:sz="8" w:space="0"/>
+          <w:bottom w:val="single" w:color="000000" w:sz="8" w:space="0"/>
+          <w:right w:val="single" w:color="000000" w:sz="8" w:space="0"/>
+          <w:insideH w:val="single" w:color="000000" w:sz="8" w:space="0"/>
+          <w:insideV w:val="single" w:color="000000" w:sz="8" w:space="0"/>
+        </w:tblBorders>
+        <w:tblLayout w:type="fixed"/>
+        <w:tblCellMar>
+          <w:top w:w="100" w:type="dxa"/>
+          <w:left w:w="100" w:type="dxa"/>
+          <w:bottom w:w="100" w:type="dxa"/>
+          <w:right w:w="100" w:type="dxa"/>
+        </w:tblCellMar>
+      </w:tblPr>
+      <w:tblGrid>
+        <w:gridCol w:w="2220"/>
+        <w:gridCol w:w="3525"/>
+        <w:gridCol w:w="2370"/>
+        <w:gridCol w:w="1230"/>
+      </w:tblGrid>
+      <w:tr>
+        <w:trPr>
+          <w:trHeight w:val="465" w:hRule="atLeast"/>
+        </w:trPr>
+        <w:tc>
+          <w:tcPr>
+            <w:tcW w:w="2220" w:type="dxa"/>
+          </w:tcPr>
+          <w:p>
+            <w:pPr/>
+            <w:r>
+              <w:rPr>
+                <w:b/>
+              </w:rPr>
+              <w:t xml:space="preserve">Requirement ID</w:t>
+            </w:r>
+          </w:p>
+        </w:tc>
+        <w:tc>
+          <w:tcPr>
+            <w:tcW w:w="3525" w:type="dxa"/>
+          </w:tcPr>
+          <w:p>
+            <w:pPr/>
+            <w:r>
+              <w:t xml:space="preserve">REQ_F4118.27.2</w:t>
+            </w:r>
+          </w:p>
+        </w:tc>
+        <w:tc>
+          <w:tcPr>
+            <w:tcW w:w="2370" w:type="dxa"/>
+          </w:tcPr>
+          <w:p>
+            <w:pPr/>
+            <w:r>
+              <w:rPr>
+                <w:b/>
+              </w:rPr>
+              <w:t xml:space="preserve">Version</w:t>
+            </w:r>
+          </w:p>
+        </w:tc>
+        <w:tc>
+          <w:tcPr>
+            <w:tcW w:w="1230" w:type="dxa"/>
+          </w:tcPr>
+          <w:p>
+            <w:pPr/>
+            <w:r>
+              <w:t xml:space="preserve">1.0</w:t>
+            </w:r>
+          </w:p>
+        </w:tc>
+      </w:tr>
+      <w:tr>
+        <w:trPr>
+          <w:trHeight w:val="465" w:hRule="atLeast"/>
+        </w:trPr>
+        <w:tc>
+          <w:tcPr>
+            <w:tcW w:w="2220" w:type="dxa"/>
+          </w:tcPr>
+          <w:p>
+            <w:pPr/>
+            <w:r>
+              <w:rPr>
+                <w:b/>
+              </w:rPr>
+              <w:t xml:space="preserve">Description</w:t>
+            </w:r>
+          </w:p>
+        </w:tc>
+        <w:tc>
+          <w:tcPr>
+            <w:tcW w:w="7125" w:type="dxa"/>
+            <w:gridSpan w:val="3"/>
+          </w:tcPr>
+          <w:p>
+            <w:pPr/>
+            <w:r>
+              <w:t xml:space="preserve">System should protect audit records and sensitive values.</w:t>
+            </w:r>
+          </w:p>
+        </w:tc>
+      </w:tr>
+      <w:tr>
+        <w:trPr>
+          <w:trHeight w:val="465" w:hRule="atLeast"/>
+        </w:trPr>
+        <w:tc>
+          <w:tcPr>
+            <w:tcW w:w="2220" w:type="dxa"/>
+          </w:tcPr>
+          <w:p>
+            <w:pPr/>
+            <w:r>
+              <w:rPr>
+                <w:b/>
+              </w:rPr>
+              <w:t xml:space="preserve">Author</w:t>
+            </w:r>
+          </w:p>
+        </w:tc>
+        <w:tc>
+          <w:tcPr>
+            <w:tcW w:w="7125" w:type="dxa"/>
+            <w:gridSpan w:val="3"/>
+          </w:tcPr>
+          <w:p>
+            <w:pPr/>
+            <w:r>
+              <w:t xml:space="preserve">Developer</w:t>
+            </w:r>
+          </w:p>
+        </w:tc>
+      </w:tr>
+    </w:tbl>
+    <w:p/>
+    <w:tbl>
+      <w:tblPr>
+        <w:tblStyle w:val="TableGrid"/>
+        <w:tblW w:w="9345" w:type="dxa"/>
+        <w:jc w:val="left"/>
+        <w:tblBorders>
+          <w:top w:val="single" w:color="000000" w:sz="8" w:space="0"/>
+          <w:left w:val="single" w:color="000000" w:sz="8" w:space="0"/>
+          <w:bottom w:val="single" w:color="000000" w:sz="8" w:space="0"/>
+          <w:right w:val="single" w:color="000000" w:sz="8" w:space="0"/>
+          <w:insideH w:val="single" w:color="000000" w:sz="8" w:space="0"/>
+          <w:insideV w:val="single" w:color="000000" w:sz="8" w:space="0"/>
+        </w:tblBorders>
+        <w:tblLayout w:type="fixed"/>
+        <w:tblCellMar>
+          <w:top w:w="100" w:type="dxa"/>
+          <w:left w:w="100" w:type="dxa"/>
+          <w:bottom w:w="100" w:type="dxa"/>
+          <w:right w:w="100" w:type="dxa"/>
+        </w:tblCellMar>
+      </w:tblPr>
+      <w:tblGrid>
+        <w:gridCol w:w="2220"/>
+        <w:gridCol w:w="3525"/>
+        <w:gridCol w:w="2370"/>
+        <w:gridCol w:w="1230"/>
+      </w:tblGrid>
+      <w:tr>
+        <w:trPr>
+          <w:trHeight w:val="465" w:hRule="atLeast"/>
+        </w:trPr>
+        <w:tc>
+          <w:tcPr>
+            <w:tcW w:w="2220" w:type="dxa"/>
+          </w:tcPr>
+          <w:p>
+            <w:pPr/>
+            <w:r>
+              <w:rPr>
+                <w:b/>
+              </w:rPr>
+              <w:t xml:space="preserve">Requirement ID</w:t>
+            </w:r>
+          </w:p>
+        </w:tc>
+        <w:tc>
+          <w:tcPr>
+            <w:tcW w:w="3525" w:type="dxa"/>
+          </w:tcPr>
+          <w:p>
+            <w:pPr/>
+            <w:r>
+              <w:t xml:space="preserve">REQ_F4118.27.3</w:t>
+            </w:r>
+          </w:p>
+        </w:tc>
+        <w:tc>
+          <w:tcPr>
+            <w:tcW w:w="2370" w:type="dxa"/>
+          </w:tcPr>
+          <w:p>
+            <w:pPr/>
+            <w:r>
+              <w:rPr>
+                <w:b/>
+              </w:rPr>
+              <w:t xml:space="preserve">Version</w:t>
+            </w:r>
+          </w:p>
+        </w:tc>
+        <w:tc>
+          <w:tcPr>
+            <w:tcW w:w="1230" w:type="dxa"/>
+          </w:tcPr>
+          <w:p>
+            <w:pPr/>
+            <w:r>
+              <w:t xml:space="preserve">1.0</w:t>
+            </w:r>
+          </w:p>
+        </w:tc>
+      </w:tr>
+      <w:tr>
+        <w:trPr>
+          <w:trHeight w:val="465" w:hRule="atLeast"/>
+        </w:trPr>
+        <w:tc>
+          <w:tcPr>
+            <w:tcW w:w="2220" w:type="dxa"/>
+          </w:tcPr>
+          <w:p>
+            <w:pPr/>
+            <w:r>
+              <w:rPr>
+                <w:b/>
+              </w:rPr>
+              <w:t xml:space="preserve">Description</w:t>
+            </w:r>
+          </w:p>
+        </w:tc>
+        <w:tc>
+          <w:tcPr>
+            <w:tcW w:w="7125" w:type="dxa"/>
+            <w:gridSpan w:val="3"/>
+          </w:tcPr>
+          <w:p>
+            <w:pPr/>
+            <w:r>
+              <w:t xml:space="preserve">System should record login, failed login, logout and captcha master-code login as security events.</w:t>
+            </w:r>
+          </w:p>
+        </w:tc>
+      </w:tr>
+      <w:tr>
+        <w:trPr>
+          <w:trHeight w:val="465" w:hRule="atLeast"/>
+        </w:trPr>
+        <w:tc>
+          <w:tcPr>
+            <w:tcW w:w="2220" w:type="dxa"/>
+          </w:tcPr>
+          <w:p>
+            <w:pPr/>
+            <w:r>
+              <w:rPr>
+                <w:b/>
+              </w:rPr>
+              <w:t xml:space="preserve">Author</w:t>
+            </w:r>
+          </w:p>
+        </w:tc>
+        <w:tc>
+          <w:tcPr>
+            <w:tcW w:w="7125" w:type="dxa"/>
+            <w:gridSpan w:val="3"/>
+          </w:tcPr>
+          <w:p>
+            <w:pPr/>
+            <w:r>
+              <w:t xml:space="preserve">Developer</w:t>
+            </w:r>
+          </w:p>
+        </w:tc>
+      </w:tr>
+    </w:tbl>
+    <w:p/>
+    <w:tbl>
+      <w:tblPr>
+        <w:tblStyle w:val="TableGrid"/>
+        <w:tblW w:w="9345" w:type="dxa"/>
+        <w:jc w:val="left"/>
+        <w:tblBorders>
+          <w:top w:val="single" w:color="000000" w:sz="8" w:space="0"/>
+          <w:left w:val="single" w:color="000000" w:sz="8" w:space="0"/>
+          <w:bottom w:val="single" w:color="000000" w:sz="8" w:space="0"/>
+          <w:right w:val="single" w:color="000000" w:sz="8" w:space="0"/>
+          <w:insideH w:val="single" w:color="000000" w:sz="8" w:space="0"/>
+          <w:insideV w:val="single" w:color="000000" w:sz="8" w:space="0"/>
+        </w:tblBorders>
+        <w:tblLayout w:type="fixed"/>
+        <w:tblCellMar>
+          <w:top w:w="100" w:type="dxa"/>
+          <w:left w:w="100" w:type="dxa"/>
+          <w:bottom w:w="100" w:type="dxa"/>
+          <w:right w:w="100" w:type="dxa"/>
+        </w:tblCellMar>
+      </w:tblPr>
+      <w:tblGrid>
+        <w:gridCol w:w="2220"/>
+        <w:gridCol w:w="3525"/>
+        <w:gridCol w:w="2370"/>
+        <w:gridCol w:w="1230"/>
+      </w:tblGrid>
+      <w:tr>
+        <w:trPr>
+          <w:trHeight w:val="465" w:hRule="atLeast"/>
+        </w:trPr>
+        <w:tc>
+          <w:tcPr>
+            <w:tcW w:w="2220" w:type="dxa"/>
+          </w:tcPr>
+          <w:p>
+            <w:pPr/>
+            <w:r>
+              <w:rPr>
+                <w:b/>
+              </w:rPr>
+              <w:t xml:space="preserve">Requirement ID</w:t>
+            </w:r>
+          </w:p>
+        </w:tc>
+        <w:tc>
+          <w:tcPr>
+            <w:tcW w:w="3525" w:type="dxa"/>
+          </w:tcPr>
+          <w:p>
+            <w:pPr/>
+            <w:r>
+              <w:t xml:space="preserve">REQ_F4118.27.4</w:t>
+            </w:r>
+          </w:p>
+        </w:tc>
+        <w:tc>
+          <w:tcPr>
+            <w:tcW w:w="2370" w:type="dxa"/>
+          </w:tcPr>
+          <w:p>
+            <w:pPr/>
+            <w:r>
+              <w:rPr>
+                <w:b/>
+              </w:rPr>
+              <w:t xml:space="preserve">Version</w:t>
+            </w:r>
+          </w:p>
+        </w:tc>
+        <w:tc>
+          <w:tcPr>
+            <w:tcW w:w="1230" w:type="dxa"/>
+          </w:tcPr>
+          <w:p>
+            <w:pPr/>
+            <w:r>
+              <w:t xml:space="preserve">1.0</w:t>
+            </w:r>
+          </w:p>
+        </w:tc>
+      </w:tr>
+      <w:tr>
+        <w:trPr>
+          <w:trHeight w:val="465" w:hRule="atLeast"/>
+        </w:trPr>
+        <w:tc>
+          <w:tcPr>
+            <w:tcW w:w="2220" w:type="dxa"/>
+          </w:tcPr>
+          <w:p>
+            <w:pPr/>
+            <w:r>
+              <w:rPr>
+                <w:b/>
+              </w:rPr>
+              <w:t xml:space="preserve">Description</w:t>
+            </w:r>
+          </w:p>
+        </w:tc>
+        <w:tc>
+          <w:tcPr>
+            <w:tcW w:w="7125" w:type="dxa"/>
+            <w:gridSpan w:val="3"/>
+          </w:tcPr>
+          <w:p>
+            <w:pPr/>
+            <w:r>
+              <w:t xml:space="preserve">System should allow authorized users to query audit logs of the current company.</w:t>
+            </w:r>
+          </w:p>
+        </w:tc>
+      </w:tr>
+      <w:tr>
+        <w:trPr>
+          <w:trHeight w:val="465" w:hRule="atLeast"/>
+        </w:trPr>
+        <w:tc>
+          <w:tcPr>
+            <w:tcW w:w="2220" w:type="dxa"/>
+          </w:tcPr>
+          <w:p>
+            <w:pPr/>
+            <w:r>
+              <w:rPr>
+                <w:b/>
+              </w:rPr>
+              <w:t xml:space="preserve">Author</w:t>
+            </w:r>
+          </w:p>
+        </w:tc>
+        <w:tc>
+          <w:tcPr>
+            <w:tcW w:w="7125" w:type="dxa"/>
+            <w:gridSpan w:val="3"/>
+          </w:tcPr>
+          <w:p>
+            <w:pPr/>
+            <w:r>
+              <w:t xml:space="preserve">Developer</w:t>
+            </w:r>
+          </w:p>
+        </w:tc>
+      </w:tr>
+    </w:tbl>
+    <w:p/>
+    <w:tbl>
+      <w:tblPr>
+        <w:tblStyle w:val="TableGrid"/>
+        <w:tblW w:w="9345" w:type="dxa"/>
+        <w:jc w:val="left"/>
+        <w:tblBorders>
+          <w:top w:val="single" w:color="000000" w:sz="8" w:space="0"/>
+          <w:left w:val="single" w:color="000000" w:sz="8" w:space="0"/>
+          <w:bottom w:val="single" w:color="000000" w:sz="8" w:space="0"/>
+          <w:right w:val="single" w:color="000000" w:sz="8" w:space="0"/>
+          <w:insideH w:val="single" w:color="000000" w:sz="8" w:space="0"/>
+          <w:insideV w:val="single" w:color="000000" w:sz="8" w:space="0"/>
+        </w:tblBorders>
+        <w:tblLayout w:type="fixed"/>
+        <w:tblCellMar>
+          <w:top w:w="100" w:type="dxa"/>
+          <w:left w:w="100" w:type="dxa"/>
+          <w:bottom w:w="100" w:type="dxa"/>
+          <w:right w:w="100" w:type="dxa"/>
+        </w:tblCellMar>
+      </w:tblPr>
+      <w:tblGrid>
+        <w:gridCol w:w="2220"/>
+        <w:gridCol w:w="3525"/>
+        <w:gridCol w:w="2370"/>
+        <w:gridCol w:w="1230"/>
+      </w:tblGrid>
+      <w:tr>
+        <w:trPr>
+          <w:trHeight w:val="465" w:hRule="atLeast"/>
+        </w:trPr>
+        <w:tc>
+          <w:tcPr>
+            <w:tcW w:w="2220" w:type="dxa"/>
+          </w:tcPr>
+          <w:p>
+            <w:pPr/>
+            <w:r>
+              <w:rPr>
+                <w:b/>
+              </w:rPr>
+              <w:t xml:space="preserve">Requirement ID</w:t>
+            </w:r>
+          </w:p>
+        </w:tc>
+        <w:tc>
+          <w:tcPr>
+            <w:tcW w:w="3525" w:type="dxa"/>
+          </w:tcPr>
+          <w:p>
+            <w:pPr/>
+            <w:r>
+              <w:t xml:space="preserve">REQ_F4118.27.5</w:t>
+            </w:r>
+          </w:p>
+        </w:tc>
+        <w:tc>
+          <w:tcPr>
+            <w:tcW w:w="2370" w:type="dxa"/>
+          </w:tcPr>
+          <w:p>
+            <w:pPr/>
+            <w:r>
+              <w:rPr>
+                <w:b/>
+              </w:rPr>
+              <w:t xml:space="preserve">Version</w:t>
+            </w:r>
+          </w:p>
+        </w:tc>
+        <w:tc>
+          <w:tcPr>
+            <w:tcW w:w="1230" w:type="dxa"/>
+          </w:tcPr>
+          <w:p>
+            <w:pPr/>
+            <w:r>
+              <w:t xml:space="preserve">1.0</w:t>
+            </w:r>
+          </w:p>
+        </w:tc>
+      </w:tr>
+      <w:tr>
+        <w:trPr>
+          <w:trHeight w:val="465" w:hRule="atLeast"/>
+        </w:trPr>
+        <w:tc>
+          <w:tcPr>
+            <w:tcW w:w="2220" w:type="dxa"/>
+          </w:tcPr>
+          <w:p>
+            <w:pPr/>
+            <w:r>
+              <w:rPr>
+                <w:b/>
+              </w:rPr>
+              <w:t xml:space="preserve">Description</w:t>
+            </w:r>
+          </w:p>
+        </w:tc>
+        <w:tc>
+          <w:tcPr>
+            <w:tcW w:w="7125" w:type="dxa"/>
+            <w:gridSpan w:val="3"/>
+          </w:tcPr>
+          <w:p>
+            <w:pPr/>
+            <w:r>
+              <w:t xml:space="preserve">System should record role permission and user company access changes as security events.</w:t>
+            </w:r>
+          </w:p>
+        </w:tc>
+      </w:tr>
+      <w:tr>
+        <w:trPr>
+          <w:trHeight w:val="465" w:hRule="atLeast"/>
+        </w:trPr>
+        <w:tc>
+          <w:tcPr>
+            <w:tcW w:w="2220" w:type="dxa"/>
+          </w:tcPr>
+          <w:p>
+            <w:pPr/>
+            <w:r>
+              <w:rPr>
+                <w:b/>
+              </w:rPr>
+              <w:t xml:space="preserve">Author</w:t>
+            </w:r>
+          </w:p>
+        </w:tc>
+        <w:tc>
+          <w:tcPr>
+            <w:tcW w:w="7125" w:type="dxa"/>
+            <w:gridSpan w:val="3"/>
+          </w:tcPr>
+          <w:p>
+            <w:pPr/>
+            <w:r>
+              <w:t xml:space="preserve">Developer</w:t>
+            </w:r>
+          </w:p>
+        </w:tc>
+      </w:tr>
+    </w:tbl>
+    <w:p/>
+    <w:tbl>
+      <w:tblPr>
+        <w:tblStyle w:val="TableGrid"/>
+        <w:tblW w:w="9345" w:type="dxa"/>
+        <w:jc w:val="left"/>
+        <w:tblBorders>
+          <w:top w:val="single" w:color="000000" w:sz="8" w:space="0"/>
+          <w:left w:val="single" w:color="000000" w:sz="8" w:space="0"/>
+          <w:bottom w:val="single" w:color="000000" w:sz="8" w:space="0"/>
+          <w:right w:val="single" w:color="000000" w:sz="8" w:space="0"/>
+          <w:insideH w:val="single" w:color="000000" w:sz="8" w:space="0"/>
+          <w:insideV w:val="single" w:color="000000" w:sz="8" w:space="0"/>
+        </w:tblBorders>
+        <w:tblLayout w:type="fixed"/>
+        <w:tblCellMar>
+          <w:top w:w="100" w:type="dxa"/>
+          <w:left w:w="100" w:type="dxa"/>
+          <w:bottom w:w="100" w:type="dxa"/>
+          <w:right w:w="100" w:type="dxa"/>
+        </w:tblCellMar>
+      </w:tblPr>
+      <w:tblGrid>
+        <w:gridCol w:w="2220"/>
+        <w:gridCol w:w="3525"/>
+        <w:gridCol w:w="2370"/>
+        <w:gridCol w:w="1230"/>
+      </w:tblGrid>
+      <w:tr>
+        <w:trPr>
+          <w:trHeight w:val="465" w:hRule="atLeast"/>
+        </w:trPr>
+        <w:tc>
+          <w:tcPr>
+            <w:tcW w:w="2220" w:type="dxa"/>
+          </w:tcPr>
+          <w:p>
+            <w:pPr/>
+            <w:r>
+              <w:rPr>
+                <w:b/>
+              </w:rPr>
+              <w:t xml:space="preserve">Requirement ID</w:t>
+            </w:r>
+          </w:p>
+        </w:tc>
+        <w:tc>
+          <w:tcPr>
+            <w:tcW w:w="3525" w:type="dxa"/>
+          </w:tcPr>
+          <w:p>
+            <w:pPr/>
+            <w:r>
+              <w:t xml:space="preserve">REQ_F4118.27.6</w:t>
+            </w:r>
+          </w:p>
+        </w:tc>
+        <w:tc>
+          <w:tcPr>
+            <w:tcW w:w="2370" w:type="dxa"/>
+          </w:tcPr>
+          <w:p>
+            <w:pPr/>
+            <w:r>
+              <w:rPr>
+                <w:b/>
+              </w:rPr>
+              <w:t xml:space="preserve">Version</w:t>
+            </w:r>
+          </w:p>
+        </w:tc>
+        <w:tc>
+          <w:tcPr>
+            <w:tcW w:w="1230" w:type="dxa"/>
+          </w:tcPr>
+          <w:p>
+            <w:pPr/>
+            <w:r>
+              <w:t xml:space="preserve">1.0</w:t>
+            </w:r>
+          </w:p>
+        </w:tc>
+      </w:tr>
+      <w:tr>
+        <w:trPr>
+          <w:trHeight w:val="465" w:hRule="atLeast"/>
+        </w:trPr>
+        <w:tc>
+          <w:tcPr>
+            <w:tcW w:w="2220" w:type="dxa"/>
+          </w:tcPr>
+          <w:p>
+            <w:pPr/>
+            <w:r>
+              <w:rPr>
+                <w:b/>
+              </w:rPr>
+              <w:t xml:space="preserve">Description</w:t>
+            </w:r>
+          </w:p>
+        </w:tc>
+        <w:tc>
+          <w:tcPr>
+            <w:tcW w:w="7125" w:type="dxa"/>
+            <w:gridSpan w:val="3"/>
+          </w:tcPr>
+          <w:p>
+            <w:pPr/>
+            <w:r>
+              <w:t xml:space="preserve">System should provide a trilingual audit log page with per-record change history.</w:t>
+            </w:r>
+          </w:p>
+        </w:tc>
+      </w:tr>
+      <w:tr>
+        <w:trPr>
+          <w:trHeight w:val="465" w:hRule="atLeast"/>
+        </w:trPr>
+        <w:tc>
+          <w:tcPr>
+            <w:tcW w:w="2220" w:type="dxa"/>
+          </w:tcPr>
+          <w:p>
+            <w:pPr/>
+            <w:r>
+              <w:rPr>
+                <w:b/>
+              </w:rPr>
+              <w:t xml:space="preserve">Author</w:t>
+            </w:r>
+          </w:p>
+        </w:tc>
+        <w:tc>
+          <w:tcPr>
+            <w:tcW w:w="7125" w:type="dxa"/>
+            <w:gridSpan w:val="3"/>
+          </w:tcPr>
+          <w:p>
+            <w:pPr/>
+            <w:r>
+              <w:t xml:space="preserve">Developer</w:t>
+            </w:r>
+          </w:p>
+        </w:tc>
+      </w:tr>
+    </w:tbl>
+    <w:p/>
+    <w:p>
+      <w:pPr>
         <w:pStyle w:val="Heading2"/>
       </w:pPr>
       <w:r>
@@ -8027,6 +8911,171 @@
             <w:pPr/>
             <w:r>
               <w:t xml:space="preserve">Roles assigned to a user within a company.</w:t>
+            </w:r>
+          </w:p>
+        </w:tc>
+      </w:tr>
+      <w:tr>
+        <w:tc>
+          <w:tcPr>
+            <w:tcW w:w="2340" w:type="dxa"/>
+          </w:tcPr>
+          <w:p>
+            <w:pPr/>
+            <w:r>
+              <w:rPr>
+                <w:b/>
+              </w:rPr>
+              <w:t xml:space="preserve">Author</w:t>
+            </w:r>
+          </w:p>
+        </w:tc>
+        <w:tc>
+          <w:tcPr>
+            <w:tcW w:w="7020" w:type="dxa"/>
+            <w:gridSpan w:val="3"/>
+          </w:tcPr>
+          <w:p>
+            <w:pPr/>
+            <w:r>
+              <w:t xml:space="preserve">Developer</w:t>
+            </w:r>
+          </w:p>
+        </w:tc>
+      </w:tr>
+    </w:tbl>
+    <w:p/>
+    <w:tbl>
+      <w:tblPr>
+        <w:tblStyle w:val="TableGrid"/>
+        <w:tblW w:w="9360" w:type="dxa"/>
+        <w:jc w:val="left"/>
+        <w:tblBorders>
+          <w:top w:val="single" w:color="000000" w:sz="8" w:space="0"/>
+          <w:left w:val="single" w:color="000000" w:sz="8" w:space="0"/>
+          <w:bottom w:val="single" w:color="000000" w:sz="8" w:space="0"/>
+          <w:right w:val="single" w:color="000000" w:sz="8" w:space="0"/>
+          <w:insideH w:val="single" w:color="000000" w:sz="8" w:space="0"/>
+          <w:insideV w:val="single" w:color="000000" w:sz="8" w:space="0"/>
+        </w:tblBorders>
+        <w:tblLayout w:type="fixed"/>
+        <w:tblCellMar>
+          <w:top w:w="100" w:type="dxa"/>
+          <w:left w:w="100" w:type="dxa"/>
+          <w:bottom w:w="100" w:type="dxa"/>
+          <w:right w:w="100" w:type="dxa"/>
+        </w:tblCellMar>
+      </w:tblPr>
+      <w:tblGrid>
+        <w:gridCol w:w="2340"/>
+        <w:gridCol w:w="2340"/>
+        <w:gridCol w:w="2340"/>
+        <w:gridCol w:w="2340"/>
+      </w:tblGrid>
+      <w:tr>
+        <w:tc>
+          <w:tcPr>
+            <w:tcW w:w="2340" w:type="dxa"/>
+          </w:tcPr>
+          <w:p>
+            <w:pPr/>
+            <w:r>
+              <w:rPr>
+                <w:b/>
+              </w:rPr>
+              <w:t xml:space="preserve">Requirement ID</w:t>
+            </w:r>
+          </w:p>
+        </w:tc>
+        <w:tc>
+          <w:tcPr>
+            <w:tcW w:w="2340" w:type="dxa"/>
+          </w:tcPr>
+          <w:p>
+            <w:pPr/>
+            <w:r>
+              <w:t xml:space="preserve">REQ_DS43.94</w:t>
+            </w:r>
+          </w:p>
+        </w:tc>
+        <w:tc>
+          <w:tcPr>
+            <w:tcW w:w="2340" w:type="dxa"/>
+          </w:tcPr>
+          <w:p>
+            <w:pPr/>
+            <w:r>
+              <w:rPr>
+                <w:b/>
+              </w:rPr>
+              <w:t xml:space="preserve">Version</w:t>
+            </w:r>
+          </w:p>
+        </w:tc>
+        <w:tc>
+          <w:tcPr>
+            <w:tcW w:w="2340" w:type="dxa"/>
+          </w:tcPr>
+          <w:p>
+            <w:pPr/>
+            <w:r>
+              <w:t xml:space="preserve">1.0</w:t>
+            </w:r>
+          </w:p>
+        </w:tc>
+      </w:tr>
+      <w:tr>
+        <w:tc>
+          <w:tcPr>
+            <w:tcW w:w="2340" w:type="dxa"/>
+          </w:tcPr>
+          <w:p>
+            <w:pPr/>
+            <w:r>
+              <w:rPr>
+                <w:b/>
+              </w:rPr>
+              <w:t xml:space="preserve">Table Name</w:t>
+            </w:r>
+          </w:p>
+        </w:tc>
+        <w:tc>
+          <w:tcPr>
+            <w:tcW w:w="7020" w:type="dxa"/>
+            <w:gridSpan w:val="3"/>
+          </w:tcPr>
+          <w:p>
+            <w:pPr/>
+            <w:r>
+              <w:t xml:space="preserve">sys_audit_log</w:t>
+            </w:r>
+          </w:p>
+        </w:tc>
+      </w:tr>
+      <w:tr>
+        <w:tc>
+          <w:tcPr>
+            <w:tcW w:w="2340" w:type="dxa"/>
+          </w:tcPr>
+          <w:p>
+            <w:pPr/>
+            <w:r>
+              <w:rPr>
+                <w:b/>
+              </w:rPr>
+              <w:t xml:space="preserve">Description</w:t>
+            </w:r>
+          </w:p>
+        </w:tc>
+        <w:tc>
+          <w:tcPr>
+            <w:tcW w:w="7020" w:type="dxa"/>
+            <w:gridSpan w:val="3"/>
+          </w:tcPr>
+          <w:p>
+            <w:pPr/>
+            <w:r>
+              <w:t xml:space="preserve">Append-only audit trail of data changes (field old/new values) and security events, with company, user, IP and trace id.</w:t>
             </w:r>
           </w:p>
         </w:tc>
@@ -16618,7 +17667,7 @@
       </w:r>
     </w:p>
     <w:sectPr>
-      <w:footerReference xmlns:r="http://schemas.openxmlformats.org/officeDocument/2006/relationships" w:type="default" r:id="Rcfe47a637e1441b6"/>
+      <w:footerReference xmlns:r="http://schemas.openxmlformats.org/officeDocument/2006/relationships" w:type="default" r:id="Rc61bdc6edad449eb"/>
       <w:pgSz w:w="11906" w:h="16838"/>
       <w:pgMar w:top="1440" w:right="1440" w:bottom="1440" w:left="1440" w:header="720" w:footer="720" w:gutter="0"/>
     </w:sectPr>

</xml_diff>

<commit_message>
feat(sys): add document number rules with concurrency-safe generator
WU-SYS-008 part 1: sys_number_rule / sys_number_sequence (REQ_DS43.95-96),
shared INumberGenerator implemented by an atomic MERGE WITH (HOLDLOCK) inside
the caller's transaction (no duplicates, no gaps on rollback, ADR-021),
number rule management API and 9 integration tests (REQ_F4118.28.1-5).

Co-Authored-By: Claude Opus 5.5 <noreply@anthropic.com>
</commit_message>
<xml_diff>
--- a/docs/99-output/MyERP_SRS.docx
+++ b/docs/99-output/MyERP_SRS.docx
@@ -7517,6 +7517,890 @@
     <w:p/>
     <w:p>
       <w:pPr>
+        <w:pStyle w:val="Heading5"/>
+      </w:pPr>
+      <w:r>
+        <w:t xml:space="preserve">4.1.1.8.28 Document Number Rule</w:t>
+      </w:r>
+    </w:p>
+    <w:tbl>
+      <w:tblPr>
+        <w:tblStyle w:val="TableGrid"/>
+        <w:tblW w:w="9345" w:type="dxa"/>
+        <w:jc w:val="left"/>
+        <w:tblBorders>
+          <w:top w:val="single" w:color="000000" w:sz="8" w:space="0"/>
+          <w:left w:val="single" w:color="000000" w:sz="8" w:space="0"/>
+          <w:bottom w:val="single" w:color="000000" w:sz="8" w:space="0"/>
+          <w:right w:val="single" w:color="000000" w:sz="8" w:space="0"/>
+          <w:insideH w:val="single" w:color="000000" w:sz="8" w:space="0"/>
+          <w:insideV w:val="single" w:color="000000" w:sz="8" w:space="0"/>
+        </w:tblBorders>
+        <w:tblLayout w:type="fixed"/>
+        <w:tblCellMar>
+          <w:top w:w="100" w:type="dxa"/>
+          <w:left w:w="100" w:type="dxa"/>
+          <w:bottom w:w="100" w:type="dxa"/>
+          <w:right w:w="100" w:type="dxa"/>
+        </w:tblCellMar>
+      </w:tblPr>
+      <w:tblGrid>
+        <w:gridCol w:w="2220"/>
+        <w:gridCol w:w="3525"/>
+        <w:gridCol w:w="2370"/>
+        <w:gridCol w:w="1230"/>
+      </w:tblGrid>
+      <w:tr>
+        <w:trPr>
+          <w:trHeight w:val="465" w:hRule="atLeast"/>
+        </w:trPr>
+        <w:tc>
+          <w:tcPr>
+            <w:tcW w:w="2220" w:type="dxa"/>
+          </w:tcPr>
+          <w:p>
+            <w:pPr/>
+            <w:r>
+              <w:rPr>
+                <w:b/>
+              </w:rPr>
+              <w:t xml:space="preserve">Requirement ID</w:t>
+            </w:r>
+          </w:p>
+        </w:tc>
+        <w:tc>
+          <w:tcPr>
+            <w:tcW w:w="3525" w:type="dxa"/>
+          </w:tcPr>
+          <w:p>
+            <w:pPr/>
+            <w:r>
+              <w:t xml:space="preserve">REQ_F4118.28.1</w:t>
+            </w:r>
+          </w:p>
+        </w:tc>
+        <w:tc>
+          <w:tcPr>
+            <w:tcW w:w="2370" w:type="dxa"/>
+          </w:tcPr>
+          <w:p>
+            <w:pPr/>
+            <w:r>
+              <w:rPr>
+                <w:b/>
+              </w:rPr>
+              <w:t xml:space="preserve">Version</w:t>
+            </w:r>
+          </w:p>
+        </w:tc>
+        <w:tc>
+          <w:tcPr>
+            <w:tcW w:w="1230" w:type="dxa"/>
+          </w:tcPr>
+          <w:p>
+            <w:pPr/>
+            <w:r>
+              <w:t xml:space="preserve">1.0</w:t>
+            </w:r>
+          </w:p>
+        </w:tc>
+      </w:tr>
+      <w:tr>
+        <w:trPr>
+          <w:trHeight w:val="465" w:hRule="atLeast"/>
+        </w:trPr>
+        <w:tc>
+          <w:tcPr>
+            <w:tcW w:w="2220" w:type="dxa"/>
+          </w:tcPr>
+          <w:p>
+            <w:pPr/>
+            <w:r>
+              <w:rPr>
+                <w:b/>
+              </w:rPr>
+              <w:t xml:space="preserve">Description</w:t>
+            </w:r>
+          </w:p>
+        </w:tc>
+        <w:tc>
+          <w:tcPr>
+            <w:tcW w:w="7125" w:type="dxa"/>
+            <w:gridSpan w:val="3"/>
+          </w:tcPr>
+          <w:p>
+            <w:pPr/>
+            <w:r>
+              <w:t xml:space="preserve">System should allow user to view document number rules of the current company.</w:t>
+            </w:r>
+          </w:p>
+        </w:tc>
+      </w:tr>
+      <w:tr>
+        <w:trPr>
+          <w:trHeight w:val="465" w:hRule="atLeast"/>
+        </w:trPr>
+        <w:tc>
+          <w:tcPr>
+            <w:tcW w:w="2220" w:type="dxa"/>
+          </w:tcPr>
+          <w:p>
+            <w:pPr/>
+            <w:r>
+              <w:rPr>
+                <w:b/>
+              </w:rPr>
+              <w:t xml:space="preserve">Author</w:t>
+            </w:r>
+          </w:p>
+        </w:tc>
+        <w:tc>
+          <w:tcPr>
+            <w:tcW w:w="7125" w:type="dxa"/>
+            <w:gridSpan w:val="3"/>
+          </w:tcPr>
+          <w:p>
+            <w:pPr/>
+            <w:r>
+              <w:t xml:space="preserve">Developer</w:t>
+            </w:r>
+          </w:p>
+        </w:tc>
+      </w:tr>
+    </w:tbl>
+    <w:p/>
+    <w:tbl>
+      <w:tblPr>
+        <w:tblStyle w:val="TableGrid"/>
+        <w:tblW w:w="9345" w:type="dxa"/>
+        <w:jc w:val="left"/>
+        <w:tblBorders>
+          <w:top w:val="single" w:color="000000" w:sz="8" w:space="0"/>
+          <w:left w:val="single" w:color="000000" w:sz="8" w:space="0"/>
+          <w:bottom w:val="single" w:color="000000" w:sz="8" w:space="0"/>
+          <w:right w:val="single" w:color="000000" w:sz="8" w:space="0"/>
+          <w:insideH w:val="single" w:color="000000" w:sz="8" w:space="0"/>
+          <w:insideV w:val="single" w:color="000000" w:sz="8" w:space="0"/>
+        </w:tblBorders>
+        <w:tblLayout w:type="fixed"/>
+        <w:tblCellMar>
+          <w:top w:w="100" w:type="dxa"/>
+          <w:left w:w="100" w:type="dxa"/>
+          <w:bottom w:w="100" w:type="dxa"/>
+          <w:right w:w="100" w:type="dxa"/>
+        </w:tblCellMar>
+      </w:tblPr>
+      <w:tblGrid>
+        <w:gridCol w:w="2220"/>
+        <w:gridCol w:w="3525"/>
+        <w:gridCol w:w="2370"/>
+        <w:gridCol w:w="1230"/>
+      </w:tblGrid>
+      <w:tr>
+        <w:trPr>
+          <w:trHeight w:val="465" w:hRule="atLeast"/>
+        </w:trPr>
+        <w:tc>
+          <w:tcPr>
+            <w:tcW w:w="2220" w:type="dxa"/>
+          </w:tcPr>
+          <w:p>
+            <w:pPr/>
+            <w:r>
+              <w:rPr>
+                <w:b/>
+              </w:rPr>
+              <w:t xml:space="preserve">Requirement ID</w:t>
+            </w:r>
+          </w:p>
+        </w:tc>
+        <w:tc>
+          <w:tcPr>
+            <w:tcW w:w="3525" w:type="dxa"/>
+          </w:tcPr>
+          <w:p>
+            <w:pPr/>
+            <w:r>
+              <w:t xml:space="preserve">REQ_F4118.28.2</w:t>
+            </w:r>
+          </w:p>
+        </w:tc>
+        <w:tc>
+          <w:tcPr>
+            <w:tcW w:w="2370" w:type="dxa"/>
+          </w:tcPr>
+          <w:p>
+            <w:pPr/>
+            <w:r>
+              <w:rPr>
+                <w:b/>
+              </w:rPr>
+              <w:t xml:space="preserve">Version</w:t>
+            </w:r>
+          </w:p>
+        </w:tc>
+        <w:tc>
+          <w:tcPr>
+            <w:tcW w:w="1230" w:type="dxa"/>
+          </w:tcPr>
+          <w:p>
+            <w:pPr/>
+            <w:r>
+              <w:t xml:space="preserve">1.0</w:t>
+            </w:r>
+          </w:p>
+        </w:tc>
+      </w:tr>
+      <w:tr>
+        <w:trPr>
+          <w:trHeight w:val="465" w:hRule="atLeast"/>
+        </w:trPr>
+        <w:tc>
+          <w:tcPr>
+            <w:tcW w:w="2220" w:type="dxa"/>
+          </w:tcPr>
+          <w:p>
+            <w:pPr/>
+            <w:r>
+              <w:rPr>
+                <w:b/>
+              </w:rPr>
+              <w:t xml:space="preserve">Description</w:t>
+            </w:r>
+          </w:p>
+        </w:tc>
+        <w:tc>
+          <w:tcPr>
+            <w:tcW w:w="7125" w:type="dxa"/>
+            <w:gridSpan w:val="3"/>
+          </w:tcPr>
+          <w:p>
+            <w:pPr/>
+            <w:r>
+              <w:t xml:space="preserve">System should allow user to create a document number rule with prefix, date format, sequence length and reset period.</w:t>
+            </w:r>
+          </w:p>
+        </w:tc>
+      </w:tr>
+      <w:tr>
+        <w:trPr>
+          <w:trHeight w:val="465" w:hRule="atLeast"/>
+        </w:trPr>
+        <w:tc>
+          <w:tcPr>
+            <w:tcW w:w="2220" w:type="dxa"/>
+          </w:tcPr>
+          <w:p>
+            <w:pPr/>
+            <w:r>
+              <w:rPr>
+                <w:b/>
+              </w:rPr>
+              <w:t xml:space="preserve">Author</w:t>
+            </w:r>
+          </w:p>
+        </w:tc>
+        <w:tc>
+          <w:tcPr>
+            <w:tcW w:w="7125" w:type="dxa"/>
+            <w:gridSpan w:val="3"/>
+          </w:tcPr>
+          <w:p>
+            <w:pPr/>
+            <w:r>
+              <w:t xml:space="preserve">Developer</w:t>
+            </w:r>
+          </w:p>
+        </w:tc>
+      </w:tr>
+    </w:tbl>
+    <w:p/>
+    <w:tbl>
+      <w:tblPr>
+        <w:tblStyle w:val="TableGrid"/>
+        <w:tblW w:w="9345" w:type="dxa"/>
+        <w:jc w:val="left"/>
+        <w:tblBorders>
+          <w:top w:val="single" w:color="000000" w:sz="8" w:space="0"/>
+          <w:left w:val="single" w:color="000000" w:sz="8" w:space="0"/>
+          <w:bottom w:val="single" w:color="000000" w:sz="8" w:space="0"/>
+          <w:right w:val="single" w:color="000000" w:sz="8" w:space="0"/>
+          <w:insideH w:val="single" w:color="000000" w:sz="8" w:space="0"/>
+          <w:insideV w:val="single" w:color="000000" w:sz="8" w:space="0"/>
+        </w:tblBorders>
+        <w:tblLayout w:type="fixed"/>
+        <w:tblCellMar>
+          <w:top w:w="100" w:type="dxa"/>
+          <w:left w:w="100" w:type="dxa"/>
+          <w:bottom w:w="100" w:type="dxa"/>
+          <w:right w:w="100" w:type="dxa"/>
+        </w:tblCellMar>
+      </w:tblPr>
+      <w:tblGrid>
+        <w:gridCol w:w="2220"/>
+        <w:gridCol w:w="3525"/>
+        <w:gridCol w:w="2370"/>
+        <w:gridCol w:w="1230"/>
+      </w:tblGrid>
+      <w:tr>
+        <w:trPr>
+          <w:trHeight w:val="465" w:hRule="atLeast"/>
+        </w:trPr>
+        <w:tc>
+          <w:tcPr>
+            <w:tcW w:w="2220" w:type="dxa"/>
+          </w:tcPr>
+          <w:p>
+            <w:pPr/>
+            <w:r>
+              <w:rPr>
+                <w:b/>
+              </w:rPr>
+              <w:t xml:space="preserve">Requirement ID</w:t>
+            </w:r>
+          </w:p>
+        </w:tc>
+        <w:tc>
+          <w:tcPr>
+            <w:tcW w:w="3525" w:type="dxa"/>
+          </w:tcPr>
+          <w:p>
+            <w:pPr/>
+            <w:r>
+              <w:t xml:space="preserve">REQ_F4118.28.3</w:t>
+            </w:r>
+          </w:p>
+        </w:tc>
+        <w:tc>
+          <w:tcPr>
+            <w:tcW w:w="2370" w:type="dxa"/>
+          </w:tcPr>
+          <w:p>
+            <w:pPr/>
+            <w:r>
+              <w:rPr>
+                <w:b/>
+              </w:rPr>
+              <w:t xml:space="preserve">Version</w:t>
+            </w:r>
+          </w:p>
+        </w:tc>
+        <w:tc>
+          <w:tcPr>
+            <w:tcW w:w="1230" w:type="dxa"/>
+          </w:tcPr>
+          <w:p>
+            <w:pPr/>
+            <w:r>
+              <w:t xml:space="preserve">1.0</w:t>
+            </w:r>
+          </w:p>
+        </w:tc>
+      </w:tr>
+      <w:tr>
+        <w:trPr>
+          <w:trHeight w:val="465" w:hRule="atLeast"/>
+        </w:trPr>
+        <w:tc>
+          <w:tcPr>
+            <w:tcW w:w="2220" w:type="dxa"/>
+          </w:tcPr>
+          <w:p>
+            <w:pPr/>
+            <w:r>
+              <w:rPr>
+                <w:b/>
+              </w:rPr>
+              <w:t xml:space="preserve">Description</w:t>
+            </w:r>
+          </w:p>
+        </w:tc>
+        <w:tc>
+          <w:tcPr>
+            <w:tcW w:w="7125" w:type="dxa"/>
+            <w:gridSpan w:val="3"/>
+          </w:tcPr>
+          <w:p>
+            <w:pPr/>
+            <w:r>
+              <w:t xml:space="preserve">System should allow user to edit or deactivate a document number rule without breaking issued numbers.</w:t>
+            </w:r>
+          </w:p>
+        </w:tc>
+      </w:tr>
+      <w:tr>
+        <w:trPr>
+          <w:trHeight w:val="465" w:hRule="atLeast"/>
+        </w:trPr>
+        <w:tc>
+          <w:tcPr>
+            <w:tcW w:w="2220" w:type="dxa"/>
+          </w:tcPr>
+          <w:p>
+            <w:pPr/>
+            <w:r>
+              <w:rPr>
+                <w:b/>
+              </w:rPr>
+              <w:t xml:space="preserve">Author</w:t>
+            </w:r>
+          </w:p>
+        </w:tc>
+        <w:tc>
+          <w:tcPr>
+            <w:tcW w:w="7125" w:type="dxa"/>
+            <w:gridSpan w:val="3"/>
+          </w:tcPr>
+          <w:p>
+            <w:pPr/>
+            <w:r>
+              <w:t xml:space="preserve">Developer</w:t>
+            </w:r>
+          </w:p>
+        </w:tc>
+      </w:tr>
+    </w:tbl>
+    <w:p/>
+    <w:tbl>
+      <w:tblPr>
+        <w:tblStyle w:val="TableGrid"/>
+        <w:tblW w:w="9345" w:type="dxa"/>
+        <w:jc w:val="left"/>
+        <w:tblBorders>
+          <w:top w:val="single" w:color="000000" w:sz="8" w:space="0"/>
+          <w:left w:val="single" w:color="000000" w:sz="8" w:space="0"/>
+          <w:bottom w:val="single" w:color="000000" w:sz="8" w:space="0"/>
+          <w:right w:val="single" w:color="000000" w:sz="8" w:space="0"/>
+          <w:insideH w:val="single" w:color="000000" w:sz="8" w:space="0"/>
+          <w:insideV w:val="single" w:color="000000" w:sz="8" w:space="0"/>
+        </w:tblBorders>
+        <w:tblLayout w:type="fixed"/>
+        <w:tblCellMar>
+          <w:top w:w="100" w:type="dxa"/>
+          <w:left w:w="100" w:type="dxa"/>
+          <w:bottom w:w="100" w:type="dxa"/>
+          <w:right w:w="100" w:type="dxa"/>
+        </w:tblCellMar>
+      </w:tblPr>
+      <w:tblGrid>
+        <w:gridCol w:w="2220"/>
+        <w:gridCol w:w="3525"/>
+        <w:gridCol w:w="2370"/>
+        <w:gridCol w:w="1230"/>
+      </w:tblGrid>
+      <w:tr>
+        <w:trPr>
+          <w:trHeight w:val="465" w:hRule="atLeast"/>
+        </w:trPr>
+        <w:tc>
+          <w:tcPr>
+            <w:tcW w:w="2220" w:type="dxa"/>
+          </w:tcPr>
+          <w:p>
+            <w:pPr/>
+            <w:r>
+              <w:rPr>
+                <w:b/>
+              </w:rPr>
+              <w:t xml:space="preserve">Requirement ID</w:t>
+            </w:r>
+          </w:p>
+        </w:tc>
+        <w:tc>
+          <w:tcPr>
+            <w:tcW w:w="3525" w:type="dxa"/>
+          </w:tcPr>
+          <w:p>
+            <w:pPr/>
+            <w:r>
+              <w:t xml:space="preserve">REQ_F4118.28.4</w:t>
+            </w:r>
+          </w:p>
+        </w:tc>
+        <w:tc>
+          <w:tcPr>
+            <w:tcW w:w="2370" w:type="dxa"/>
+          </w:tcPr>
+          <w:p>
+            <w:pPr/>
+            <w:r>
+              <w:rPr>
+                <w:b/>
+              </w:rPr>
+              <w:t xml:space="preserve">Version</w:t>
+            </w:r>
+          </w:p>
+        </w:tc>
+        <w:tc>
+          <w:tcPr>
+            <w:tcW w:w="1230" w:type="dxa"/>
+          </w:tcPr>
+          <w:p>
+            <w:pPr/>
+            <w:r>
+              <w:t xml:space="preserve">1.0</w:t>
+            </w:r>
+          </w:p>
+        </w:tc>
+      </w:tr>
+      <w:tr>
+        <w:trPr>
+          <w:trHeight w:val="465" w:hRule="atLeast"/>
+        </w:trPr>
+        <w:tc>
+          <w:tcPr>
+            <w:tcW w:w="2220" w:type="dxa"/>
+          </w:tcPr>
+          <w:p>
+            <w:pPr/>
+            <w:r>
+              <w:rPr>
+                <w:b/>
+              </w:rPr>
+              <w:t xml:space="preserve">Description</w:t>
+            </w:r>
+          </w:p>
+        </w:tc>
+        <w:tc>
+          <w:tcPr>
+            <w:tcW w:w="7125" w:type="dxa"/>
+            <w:gridSpan w:val="3"/>
+          </w:tcPr>
+          <w:p>
+            <w:pPr/>
+            <w:r>
+              <w:t xml:space="preserve">System should allow user to preview the next document number for a business date.</w:t>
+            </w:r>
+          </w:p>
+        </w:tc>
+      </w:tr>
+      <w:tr>
+        <w:trPr>
+          <w:trHeight w:val="465" w:hRule="atLeast"/>
+        </w:trPr>
+        <w:tc>
+          <w:tcPr>
+            <w:tcW w:w="2220" w:type="dxa"/>
+          </w:tcPr>
+          <w:p>
+            <w:pPr/>
+            <w:r>
+              <w:rPr>
+                <w:b/>
+              </w:rPr>
+              <w:t xml:space="preserve">Author</w:t>
+            </w:r>
+          </w:p>
+        </w:tc>
+        <w:tc>
+          <w:tcPr>
+            <w:tcW w:w="7125" w:type="dxa"/>
+            <w:gridSpan w:val="3"/>
+          </w:tcPr>
+          <w:p>
+            <w:pPr/>
+            <w:r>
+              <w:t xml:space="preserve">Developer</w:t>
+            </w:r>
+          </w:p>
+        </w:tc>
+      </w:tr>
+    </w:tbl>
+    <w:p/>
+    <w:tbl>
+      <w:tblPr>
+        <w:tblStyle w:val="TableGrid"/>
+        <w:tblW w:w="9345" w:type="dxa"/>
+        <w:jc w:val="left"/>
+        <w:tblBorders>
+          <w:top w:val="single" w:color="000000" w:sz="8" w:space="0"/>
+          <w:left w:val="single" w:color="000000" w:sz="8" w:space="0"/>
+          <w:bottom w:val="single" w:color="000000" w:sz="8" w:space="0"/>
+          <w:right w:val="single" w:color="000000" w:sz="8" w:space="0"/>
+          <w:insideH w:val="single" w:color="000000" w:sz="8" w:space="0"/>
+          <w:insideV w:val="single" w:color="000000" w:sz="8" w:space="0"/>
+        </w:tblBorders>
+        <w:tblLayout w:type="fixed"/>
+        <w:tblCellMar>
+          <w:top w:w="100" w:type="dxa"/>
+          <w:left w:w="100" w:type="dxa"/>
+          <w:bottom w:w="100" w:type="dxa"/>
+          <w:right w:w="100" w:type="dxa"/>
+        </w:tblCellMar>
+      </w:tblPr>
+      <w:tblGrid>
+        <w:gridCol w:w="2220"/>
+        <w:gridCol w:w="3525"/>
+        <w:gridCol w:w="2370"/>
+        <w:gridCol w:w="1230"/>
+      </w:tblGrid>
+      <w:tr>
+        <w:trPr>
+          <w:trHeight w:val="465" w:hRule="atLeast"/>
+        </w:trPr>
+        <w:tc>
+          <w:tcPr>
+            <w:tcW w:w="2220" w:type="dxa"/>
+          </w:tcPr>
+          <w:p>
+            <w:pPr/>
+            <w:r>
+              <w:rPr>
+                <w:b/>
+              </w:rPr>
+              <w:t xml:space="preserve">Requirement ID</w:t>
+            </w:r>
+          </w:p>
+        </w:tc>
+        <w:tc>
+          <w:tcPr>
+            <w:tcW w:w="3525" w:type="dxa"/>
+          </w:tcPr>
+          <w:p>
+            <w:pPr/>
+            <w:r>
+              <w:t xml:space="preserve">REQ_F4118.28.5</w:t>
+            </w:r>
+          </w:p>
+        </w:tc>
+        <w:tc>
+          <w:tcPr>
+            <w:tcW w:w="2370" w:type="dxa"/>
+          </w:tcPr>
+          <w:p>
+            <w:pPr/>
+            <w:r>
+              <w:rPr>
+                <w:b/>
+              </w:rPr>
+              <w:t xml:space="preserve">Version</w:t>
+            </w:r>
+          </w:p>
+        </w:tc>
+        <w:tc>
+          <w:tcPr>
+            <w:tcW w:w="1230" w:type="dxa"/>
+          </w:tcPr>
+          <w:p>
+            <w:pPr/>
+            <w:r>
+              <w:t xml:space="preserve">1.0</w:t>
+            </w:r>
+          </w:p>
+        </w:tc>
+      </w:tr>
+      <w:tr>
+        <w:trPr>
+          <w:trHeight w:val="465" w:hRule="atLeast"/>
+        </w:trPr>
+        <w:tc>
+          <w:tcPr>
+            <w:tcW w:w="2220" w:type="dxa"/>
+          </w:tcPr>
+          <w:p>
+            <w:pPr/>
+            <w:r>
+              <w:rPr>
+                <w:b/>
+              </w:rPr>
+              <w:t xml:space="preserve">Description</w:t>
+            </w:r>
+          </w:p>
+        </w:tc>
+        <w:tc>
+          <w:tcPr>
+            <w:tcW w:w="7125" w:type="dxa"/>
+            <w:gridSpan w:val="3"/>
+          </w:tcPr>
+          <w:p>
+            <w:pPr/>
+            <w:r>
+              <w:t xml:space="preserve">System should generate unique, gap-free document numbers for every module under concurrency.</w:t>
+            </w:r>
+          </w:p>
+        </w:tc>
+      </w:tr>
+      <w:tr>
+        <w:trPr>
+          <w:trHeight w:val="465" w:hRule="atLeast"/>
+        </w:trPr>
+        <w:tc>
+          <w:tcPr>
+            <w:tcW w:w="2220" w:type="dxa"/>
+          </w:tcPr>
+          <w:p>
+            <w:pPr/>
+            <w:r>
+              <w:rPr>
+                <w:b/>
+              </w:rPr>
+              <w:t xml:space="preserve">Author</w:t>
+            </w:r>
+          </w:p>
+        </w:tc>
+        <w:tc>
+          <w:tcPr>
+            <w:tcW w:w="7125" w:type="dxa"/>
+            <w:gridSpan w:val="3"/>
+          </w:tcPr>
+          <w:p>
+            <w:pPr/>
+            <w:r>
+              <w:t xml:space="preserve">Developer</w:t>
+            </w:r>
+          </w:p>
+        </w:tc>
+      </w:tr>
+    </w:tbl>
+    <w:p/>
+    <w:tbl>
+      <w:tblPr>
+        <w:tblStyle w:val="TableGrid"/>
+        <w:tblW w:w="9345" w:type="dxa"/>
+        <w:jc w:val="left"/>
+        <w:tblBorders>
+          <w:top w:val="single" w:color="000000" w:sz="8" w:space="0"/>
+          <w:left w:val="single" w:color="000000" w:sz="8" w:space="0"/>
+          <w:bottom w:val="single" w:color="000000" w:sz="8" w:space="0"/>
+          <w:right w:val="single" w:color="000000" w:sz="8" w:space="0"/>
+          <w:insideH w:val="single" w:color="000000" w:sz="8" w:space="0"/>
+          <w:insideV w:val="single" w:color="000000" w:sz="8" w:space="0"/>
+        </w:tblBorders>
+        <w:tblLayout w:type="fixed"/>
+        <w:tblCellMar>
+          <w:top w:w="100" w:type="dxa"/>
+          <w:left w:w="100" w:type="dxa"/>
+          <w:bottom w:w="100" w:type="dxa"/>
+          <w:right w:w="100" w:type="dxa"/>
+        </w:tblCellMar>
+      </w:tblPr>
+      <w:tblGrid>
+        <w:gridCol w:w="2220"/>
+        <w:gridCol w:w="3525"/>
+        <w:gridCol w:w="2370"/>
+        <w:gridCol w:w="1230"/>
+      </w:tblGrid>
+      <w:tr>
+        <w:trPr>
+          <w:trHeight w:val="465" w:hRule="atLeast"/>
+        </w:trPr>
+        <w:tc>
+          <w:tcPr>
+            <w:tcW w:w="2220" w:type="dxa"/>
+          </w:tcPr>
+          <w:p>
+            <w:pPr/>
+            <w:r>
+              <w:rPr>
+                <w:b/>
+              </w:rPr>
+              <w:t xml:space="preserve">Requirement ID</w:t>
+            </w:r>
+          </w:p>
+        </w:tc>
+        <w:tc>
+          <w:tcPr>
+            <w:tcW w:w="3525" w:type="dxa"/>
+          </w:tcPr>
+          <w:p>
+            <w:pPr/>
+            <w:r>
+              <w:t xml:space="preserve">REQ_F4118.28.6</w:t>
+            </w:r>
+          </w:p>
+        </w:tc>
+        <w:tc>
+          <w:tcPr>
+            <w:tcW w:w="2370" w:type="dxa"/>
+          </w:tcPr>
+          <w:p>
+            <w:pPr/>
+            <w:r>
+              <w:rPr>
+                <w:b/>
+              </w:rPr>
+              <w:t xml:space="preserve">Version</w:t>
+            </w:r>
+          </w:p>
+        </w:tc>
+        <w:tc>
+          <w:tcPr>
+            <w:tcW w:w="1230" w:type="dxa"/>
+          </w:tcPr>
+          <w:p>
+            <w:pPr/>
+            <w:r>
+              <w:t xml:space="preserve">1.0</w:t>
+            </w:r>
+          </w:p>
+        </w:tc>
+      </w:tr>
+      <w:tr>
+        <w:trPr>
+          <w:trHeight w:val="465" w:hRule="atLeast"/>
+        </w:trPr>
+        <w:tc>
+          <w:tcPr>
+            <w:tcW w:w="2220" w:type="dxa"/>
+          </w:tcPr>
+          <w:p>
+            <w:pPr/>
+            <w:r>
+              <w:rPr>
+                <w:b/>
+              </w:rPr>
+              <w:t xml:space="preserve">Description</w:t>
+            </w:r>
+          </w:p>
+        </w:tc>
+        <w:tc>
+          <w:tcPr>
+            <w:tcW w:w="7125" w:type="dxa"/>
+            <w:gridSpan w:val="3"/>
+          </w:tcPr>
+          <w:p>
+            <w:pPr/>
+            <w:r>
+              <w:t xml:space="preserve">System should provide a trilingual number rule maintenance page.</w:t>
+            </w:r>
+          </w:p>
+        </w:tc>
+      </w:tr>
+      <w:tr>
+        <w:trPr>
+          <w:trHeight w:val="465" w:hRule="atLeast"/>
+        </w:trPr>
+        <w:tc>
+          <w:tcPr>
+            <w:tcW w:w="2220" w:type="dxa"/>
+          </w:tcPr>
+          <w:p>
+            <w:pPr/>
+            <w:r>
+              <w:rPr>
+                <w:b/>
+              </w:rPr>
+              <w:t xml:space="preserve">Author</w:t>
+            </w:r>
+          </w:p>
+        </w:tc>
+        <w:tc>
+          <w:tcPr>
+            <w:tcW w:w="7125" w:type="dxa"/>
+            <w:gridSpan w:val="3"/>
+          </w:tcPr>
+          <w:p>
+            <w:pPr/>
+            <w:r>
+              <w:t xml:space="preserve">Developer</w:t>
+            </w:r>
+          </w:p>
+        </w:tc>
+      </w:tr>
+    </w:tbl>
+    <w:p/>
+    <w:p>
+      <w:pPr>
         <w:pStyle w:val="Heading2"/>
       </w:pPr>
       <w:r>
@@ -9076,6 +9960,336 @@
             <w:pPr/>
             <w:r>
               <w:t xml:space="preserve">Append-only audit trail of data changes (field old/new values) and security events, with company, user, IP and trace id.</w:t>
+            </w:r>
+          </w:p>
+        </w:tc>
+      </w:tr>
+      <w:tr>
+        <w:tc>
+          <w:tcPr>
+            <w:tcW w:w="2340" w:type="dxa"/>
+          </w:tcPr>
+          <w:p>
+            <w:pPr/>
+            <w:r>
+              <w:rPr>
+                <w:b/>
+              </w:rPr>
+              <w:t xml:space="preserve">Author</w:t>
+            </w:r>
+          </w:p>
+        </w:tc>
+        <w:tc>
+          <w:tcPr>
+            <w:tcW w:w="7020" w:type="dxa"/>
+            <w:gridSpan w:val="3"/>
+          </w:tcPr>
+          <w:p>
+            <w:pPr/>
+            <w:r>
+              <w:t xml:space="preserve">Developer</w:t>
+            </w:r>
+          </w:p>
+        </w:tc>
+      </w:tr>
+    </w:tbl>
+    <w:p/>
+    <w:tbl>
+      <w:tblPr>
+        <w:tblStyle w:val="TableGrid"/>
+        <w:tblW w:w="9360" w:type="dxa"/>
+        <w:jc w:val="left"/>
+        <w:tblBorders>
+          <w:top w:val="single" w:color="000000" w:sz="8" w:space="0"/>
+          <w:left w:val="single" w:color="000000" w:sz="8" w:space="0"/>
+          <w:bottom w:val="single" w:color="000000" w:sz="8" w:space="0"/>
+          <w:right w:val="single" w:color="000000" w:sz="8" w:space="0"/>
+          <w:insideH w:val="single" w:color="000000" w:sz="8" w:space="0"/>
+          <w:insideV w:val="single" w:color="000000" w:sz="8" w:space="0"/>
+        </w:tblBorders>
+        <w:tblLayout w:type="fixed"/>
+        <w:tblCellMar>
+          <w:top w:w="100" w:type="dxa"/>
+          <w:left w:w="100" w:type="dxa"/>
+          <w:bottom w:w="100" w:type="dxa"/>
+          <w:right w:w="100" w:type="dxa"/>
+        </w:tblCellMar>
+      </w:tblPr>
+      <w:tblGrid>
+        <w:gridCol w:w="2340"/>
+        <w:gridCol w:w="2340"/>
+        <w:gridCol w:w="2340"/>
+        <w:gridCol w:w="2340"/>
+      </w:tblGrid>
+      <w:tr>
+        <w:tc>
+          <w:tcPr>
+            <w:tcW w:w="2340" w:type="dxa"/>
+          </w:tcPr>
+          <w:p>
+            <w:pPr/>
+            <w:r>
+              <w:rPr>
+                <w:b/>
+              </w:rPr>
+              <w:t xml:space="preserve">Requirement ID</w:t>
+            </w:r>
+          </w:p>
+        </w:tc>
+        <w:tc>
+          <w:tcPr>
+            <w:tcW w:w="2340" w:type="dxa"/>
+          </w:tcPr>
+          <w:p>
+            <w:pPr/>
+            <w:r>
+              <w:t xml:space="preserve">REQ_DS43.95</w:t>
+            </w:r>
+          </w:p>
+        </w:tc>
+        <w:tc>
+          <w:tcPr>
+            <w:tcW w:w="2340" w:type="dxa"/>
+          </w:tcPr>
+          <w:p>
+            <w:pPr/>
+            <w:r>
+              <w:rPr>
+                <w:b/>
+              </w:rPr>
+              <w:t xml:space="preserve">Version</w:t>
+            </w:r>
+          </w:p>
+        </w:tc>
+        <w:tc>
+          <w:tcPr>
+            <w:tcW w:w="2340" w:type="dxa"/>
+          </w:tcPr>
+          <w:p>
+            <w:pPr/>
+            <w:r>
+              <w:t xml:space="preserve">1.0</w:t>
+            </w:r>
+          </w:p>
+        </w:tc>
+      </w:tr>
+      <w:tr>
+        <w:tc>
+          <w:tcPr>
+            <w:tcW w:w="2340" w:type="dxa"/>
+          </w:tcPr>
+          <w:p>
+            <w:pPr/>
+            <w:r>
+              <w:rPr>
+                <w:b/>
+              </w:rPr>
+              <w:t xml:space="preserve">Table Name</w:t>
+            </w:r>
+          </w:p>
+        </w:tc>
+        <w:tc>
+          <w:tcPr>
+            <w:tcW w:w="7020" w:type="dxa"/>
+            <w:gridSpan w:val="3"/>
+          </w:tcPr>
+          <w:p>
+            <w:pPr/>
+            <w:r>
+              <w:t xml:space="preserve">sys_number_rule</w:t>
+            </w:r>
+          </w:p>
+        </w:tc>
+      </w:tr>
+      <w:tr>
+        <w:tc>
+          <w:tcPr>
+            <w:tcW w:w="2340" w:type="dxa"/>
+          </w:tcPr>
+          <w:p>
+            <w:pPr/>
+            <w:r>
+              <w:rPr>
+                <w:b/>
+              </w:rPr>
+              <w:t xml:space="preserve">Description</w:t>
+            </w:r>
+          </w:p>
+        </w:tc>
+        <w:tc>
+          <w:tcPr>
+            <w:tcW w:w="7020" w:type="dxa"/>
+            <w:gridSpan w:val="3"/>
+          </w:tcPr>
+          <w:p>
+            <w:pPr/>
+            <w:r>
+              <w:t xml:space="preserve">Document number rule per company and document type: prefix, date format, sequence length, reset period and active flag.</w:t>
+            </w:r>
+          </w:p>
+        </w:tc>
+      </w:tr>
+      <w:tr>
+        <w:tc>
+          <w:tcPr>
+            <w:tcW w:w="2340" w:type="dxa"/>
+          </w:tcPr>
+          <w:p>
+            <w:pPr/>
+            <w:r>
+              <w:rPr>
+                <w:b/>
+              </w:rPr>
+              <w:t xml:space="preserve">Author</w:t>
+            </w:r>
+          </w:p>
+        </w:tc>
+        <w:tc>
+          <w:tcPr>
+            <w:tcW w:w="7020" w:type="dxa"/>
+            <w:gridSpan w:val="3"/>
+          </w:tcPr>
+          <w:p>
+            <w:pPr/>
+            <w:r>
+              <w:t xml:space="preserve">Developer</w:t>
+            </w:r>
+          </w:p>
+        </w:tc>
+      </w:tr>
+    </w:tbl>
+    <w:p/>
+    <w:tbl>
+      <w:tblPr>
+        <w:tblStyle w:val="TableGrid"/>
+        <w:tblW w:w="9360" w:type="dxa"/>
+        <w:jc w:val="left"/>
+        <w:tblBorders>
+          <w:top w:val="single" w:color="000000" w:sz="8" w:space="0"/>
+          <w:left w:val="single" w:color="000000" w:sz="8" w:space="0"/>
+          <w:bottom w:val="single" w:color="000000" w:sz="8" w:space="0"/>
+          <w:right w:val="single" w:color="000000" w:sz="8" w:space="0"/>
+          <w:insideH w:val="single" w:color="000000" w:sz="8" w:space="0"/>
+          <w:insideV w:val="single" w:color="000000" w:sz="8" w:space="0"/>
+        </w:tblBorders>
+        <w:tblLayout w:type="fixed"/>
+        <w:tblCellMar>
+          <w:top w:w="100" w:type="dxa"/>
+          <w:left w:w="100" w:type="dxa"/>
+          <w:bottom w:w="100" w:type="dxa"/>
+          <w:right w:w="100" w:type="dxa"/>
+        </w:tblCellMar>
+      </w:tblPr>
+      <w:tblGrid>
+        <w:gridCol w:w="2340"/>
+        <w:gridCol w:w="2340"/>
+        <w:gridCol w:w="2340"/>
+        <w:gridCol w:w="2340"/>
+      </w:tblGrid>
+      <w:tr>
+        <w:tc>
+          <w:tcPr>
+            <w:tcW w:w="2340" w:type="dxa"/>
+          </w:tcPr>
+          <w:p>
+            <w:pPr/>
+            <w:r>
+              <w:rPr>
+                <w:b/>
+              </w:rPr>
+              <w:t xml:space="preserve">Requirement ID</w:t>
+            </w:r>
+          </w:p>
+        </w:tc>
+        <w:tc>
+          <w:tcPr>
+            <w:tcW w:w="2340" w:type="dxa"/>
+          </w:tcPr>
+          <w:p>
+            <w:pPr/>
+            <w:r>
+              <w:t xml:space="preserve">REQ_DS43.96</w:t>
+            </w:r>
+          </w:p>
+        </w:tc>
+        <w:tc>
+          <w:tcPr>
+            <w:tcW w:w="2340" w:type="dxa"/>
+          </w:tcPr>
+          <w:p>
+            <w:pPr/>
+            <w:r>
+              <w:rPr>
+                <w:b/>
+              </w:rPr>
+              <w:t xml:space="preserve">Version</w:t>
+            </w:r>
+          </w:p>
+        </w:tc>
+        <w:tc>
+          <w:tcPr>
+            <w:tcW w:w="2340" w:type="dxa"/>
+          </w:tcPr>
+          <w:p>
+            <w:pPr/>
+            <w:r>
+              <w:t xml:space="preserve">1.0</w:t>
+            </w:r>
+          </w:p>
+        </w:tc>
+      </w:tr>
+      <w:tr>
+        <w:tc>
+          <w:tcPr>
+            <w:tcW w:w="2340" w:type="dxa"/>
+          </w:tcPr>
+          <w:p>
+            <w:pPr/>
+            <w:r>
+              <w:rPr>
+                <w:b/>
+              </w:rPr>
+              <w:t xml:space="preserve">Table Name</w:t>
+            </w:r>
+          </w:p>
+        </w:tc>
+        <w:tc>
+          <w:tcPr>
+            <w:tcW w:w="7020" w:type="dxa"/>
+            <w:gridSpan w:val="3"/>
+          </w:tcPr>
+          <w:p>
+            <w:pPr/>
+            <w:r>
+              <w:t xml:space="preserve">sys_number_sequence</w:t>
+            </w:r>
+          </w:p>
+        </w:tc>
+      </w:tr>
+      <w:tr>
+        <w:tc>
+          <w:tcPr>
+            <w:tcW w:w="2340" w:type="dxa"/>
+          </w:tcPr>
+          <w:p>
+            <w:pPr/>
+            <w:r>
+              <w:rPr>
+                <w:b/>
+              </w:rPr>
+              <w:t xml:space="preserve">Description</w:t>
+            </w:r>
+          </w:p>
+        </w:tc>
+        <w:tc>
+          <w:tcPr>
+            <w:tcW w:w="7020" w:type="dxa"/>
+            <w:gridSpan w:val="3"/>
+          </w:tcPr>
+          <w:p>
+            <w:pPr/>
+            <w:r>
+              <w:t xml:space="preserve">Running sequence counter per number rule and reset period, updated atomically when a number is issued.</w:t>
             </w:r>
           </w:p>
         </w:tc>
@@ -19332,7 +20546,7 @@
       </w:r>
     </w:p>
     <w:sectPr>
-      <w:footerReference xmlns:r="http://schemas.openxmlformats.org/officeDocument/2006/relationships" w:type="default" r:id="R706494a171d14f9f"/>
+      <w:footerReference xmlns:r="http://schemas.openxmlformats.org/officeDocument/2006/relationships" w:type="default" r:id="R95f7e82e21114c4f"/>
       <w:pgSz w:w="11906" w:h="16838"/>
       <w:pgMar w:top="1440" w:right="1440" w:bottom="1440" w:left="1440" w:header="720" w:footer="720" w:gutter="0"/>
     </w:sectPr>

</xml_diff>

<commit_message>
docs(sys): complete WU-SYS-013 seed data (ADR-023) and update progress
Co-Authored-By: Claude Opus 5.5 <noreply@anthropic.com>
</commit_message>
<xml_diff>
--- a/docs/99-output/MyERP_SRS.docx
+++ b/docs/99-output/MyERP_SRS.docx
@@ -9723,6 +9723,452 @@
     <w:p/>
     <w:p>
       <w:pPr>
+        <w:pStyle w:val="Heading5"/>
+      </w:pPr>
+      <w:r>
+        <w:t xml:space="preserve">4.1.1.8.30 Development Seed Data</w:t>
+      </w:r>
+    </w:p>
+    <w:tbl>
+      <w:tblPr>
+        <w:tblStyle w:val="TableGrid"/>
+        <w:tblW w:w="9345" w:type="dxa"/>
+        <w:jc w:val="left"/>
+        <w:tblBorders>
+          <w:top w:val="single" w:color="000000" w:sz="8" w:space="0"/>
+          <w:left w:val="single" w:color="000000" w:sz="8" w:space="0"/>
+          <w:bottom w:val="single" w:color="000000" w:sz="8" w:space="0"/>
+          <w:right w:val="single" w:color="000000" w:sz="8" w:space="0"/>
+          <w:insideH w:val="single" w:color="000000" w:sz="8" w:space="0"/>
+          <w:insideV w:val="single" w:color="000000" w:sz="8" w:space="0"/>
+        </w:tblBorders>
+        <w:tblLayout w:type="fixed"/>
+        <w:tblCellMar>
+          <w:top w:w="100" w:type="dxa"/>
+          <w:left w:w="100" w:type="dxa"/>
+          <w:bottom w:w="100" w:type="dxa"/>
+          <w:right w:w="100" w:type="dxa"/>
+        </w:tblCellMar>
+      </w:tblPr>
+      <w:tblGrid>
+        <w:gridCol w:w="2220"/>
+        <w:gridCol w:w="3525"/>
+        <w:gridCol w:w="2370"/>
+        <w:gridCol w:w="1230"/>
+      </w:tblGrid>
+      <w:tr>
+        <w:trPr>
+          <w:trHeight w:val="465" w:hRule="atLeast"/>
+        </w:trPr>
+        <w:tc>
+          <w:tcPr>
+            <w:tcW w:w="2220" w:type="dxa"/>
+          </w:tcPr>
+          <w:p>
+            <w:pPr/>
+            <w:r>
+              <w:rPr>
+                <w:b/>
+              </w:rPr>
+              <w:t xml:space="preserve">Requirement ID</w:t>
+            </w:r>
+          </w:p>
+        </w:tc>
+        <w:tc>
+          <w:tcPr>
+            <w:tcW w:w="3525" w:type="dxa"/>
+          </w:tcPr>
+          <w:p>
+            <w:pPr/>
+            <w:r>
+              <w:t xml:space="preserve">REQ_F4118.30.1</w:t>
+            </w:r>
+          </w:p>
+        </w:tc>
+        <w:tc>
+          <w:tcPr>
+            <w:tcW w:w="2370" w:type="dxa"/>
+          </w:tcPr>
+          <w:p>
+            <w:pPr/>
+            <w:r>
+              <w:rPr>
+                <w:b/>
+              </w:rPr>
+              <w:t xml:space="preserve">Version</w:t>
+            </w:r>
+          </w:p>
+        </w:tc>
+        <w:tc>
+          <w:tcPr>
+            <w:tcW w:w="1230" w:type="dxa"/>
+          </w:tcPr>
+          <w:p>
+            <w:pPr/>
+            <w:r>
+              <w:t xml:space="preserve">1.0</w:t>
+            </w:r>
+          </w:p>
+        </w:tc>
+      </w:tr>
+      <w:tr>
+        <w:trPr>
+          <w:trHeight w:val="465" w:hRule="atLeast"/>
+        </w:trPr>
+        <w:tc>
+          <w:tcPr>
+            <w:tcW w:w="2220" w:type="dxa"/>
+          </w:tcPr>
+          <w:p>
+            <w:pPr/>
+            <w:r>
+              <w:rPr>
+                <w:b/>
+              </w:rPr>
+              <w:t xml:space="preserve">Description</w:t>
+            </w:r>
+          </w:p>
+        </w:tc>
+        <w:tc>
+          <w:tcPr>
+            <w:tcW w:w="7125" w:type="dxa"/>
+            <w:gridSpan w:val="3"/>
+          </w:tcPr>
+          <w:p>
+            <w:pPr/>
+            <w:r>
+              <w:t xml:space="preserve">System should load demo companies, branches, departments and roles for the Development environment.</w:t>
+            </w:r>
+          </w:p>
+        </w:tc>
+      </w:tr>
+      <w:tr>
+        <w:trPr>
+          <w:trHeight w:val="465" w:hRule="atLeast"/>
+        </w:trPr>
+        <w:tc>
+          <w:tcPr>
+            <w:tcW w:w="2220" w:type="dxa"/>
+          </w:tcPr>
+          <w:p>
+            <w:pPr/>
+            <w:r>
+              <w:rPr>
+                <w:b/>
+              </w:rPr>
+              <w:t xml:space="preserve">Author</w:t>
+            </w:r>
+          </w:p>
+        </w:tc>
+        <w:tc>
+          <w:tcPr>
+            <w:tcW w:w="7125" w:type="dxa"/>
+            <w:gridSpan w:val="3"/>
+          </w:tcPr>
+          <w:p>
+            <w:pPr/>
+            <w:r>
+              <w:t xml:space="preserve">Developer</w:t>
+            </w:r>
+          </w:p>
+        </w:tc>
+      </w:tr>
+    </w:tbl>
+    <w:p/>
+    <w:tbl>
+      <w:tblPr>
+        <w:tblStyle w:val="TableGrid"/>
+        <w:tblW w:w="9345" w:type="dxa"/>
+        <w:jc w:val="left"/>
+        <w:tblBorders>
+          <w:top w:val="single" w:color="000000" w:sz="8" w:space="0"/>
+          <w:left w:val="single" w:color="000000" w:sz="8" w:space="0"/>
+          <w:bottom w:val="single" w:color="000000" w:sz="8" w:space="0"/>
+          <w:right w:val="single" w:color="000000" w:sz="8" w:space="0"/>
+          <w:insideH w:val="single" w:color="000000" w:sz="8" w:space="0"/>
+          <w:insideV w:val="single" w:color="000000" w:sz="8" w:space="0"/>
+        </w:tblBorders>
+        <w:tblLayout w:type="fixed"/>
+        <w:tblCellMar>
+          <w:top w:w="100" w:type="dxa"/>
+          <w:left w:w="100" w:type="dxa"/>
+          <w:bottom w:w="100" w:type="dxa"/>
+          <w:right w:w="100" w:type="dxa"/>
+        </w:tblCellMar>
+      </w:tblPr>
+      <w:tblGrid>
+        <w:gridCol w:w="2220"/>
+        <w:gridCol w:w="3525"/>
+        <w:gridCol w:w="2370"/>
+        <w:gridCol w:w="1230"/>
+      </w:tblGrid>
+      <w:tr>
+        <w:trPr>
+          <w:trHeight w:val="465" w:hRule="atLeast"/>
+        </w:trPr>
+        <w:tc>
+          <w:tcPr>
+            <w:tcW w:w="2220" w:type="dxa"/>
+          </w:tcPr>
+          <w:p>
+            <w:pPr/>
+            <w:r>
+              <w:rPr>
+                <w:b/>
+              </w:rPr>
+              <w:t xml:space="preserve">Requirement ID</w:t>
+            </w:r>
+          </w:p>
+        </w:tc>
+        <w:tc>
+          <w:tcPr>
+            <w:tcW w:w="3525" w:type="dxa"/>
+          </w:tcPr>
+          <w:p>
+            <w:pPr/>
+            <w:r>
+              <w:t xml:space="preserve">REQ_F4118.30.2</w:t>
+            </w:r>
+          </w:p>
+        </w:tc>
+        <w:tc>
+          <w:tcPr>
+            <w:tcW w:w="2370" w:type="dxa"/>
+          </w:tcPr>
+          <w:p>
+            <w:pPr/>
+            <w:r>
+              <w:rPr>
+                <w:b/>
+              </w:rPr>
+              <w:t xml:space="preserve">Version</w:t>
+            </w:r>
+          </w:p>
+        </w:tc>
+        <w:tc>
+          <w:tcPr>
+            <w:tcW w:w="1230" w:type="dxa"/>
+          </w:tcPr>
+          <w:p>
+            <w:pPr/>
+            <w:r>
+              <w:t xml:space="preserve">1.0</w:t>
+            </w:r>
+          </w:p>
+        </w:tc>
+      </w:tr>
+      <w:tr>
+        <w:trPr>
+          <w:trHeight w:val="465" w:hRule="atLeast"/>
+        </w:trPr>
+        <w:tc>
+          <w:tcPr>
+            <w:tcW w:w="2220" w:type="dxa"/>
+          </w:tcPr>
+          <w:p>
+            <w:pPr/>
+            <w:r>
+              <w:rPr>
+                <w:b/>
+              </w:rPr>
+              <w:t xml:space="preserve">Description</w:t>
+            </w:r>
+          </w:p>
+        </w:tc>
+        <w:tc>
+          <w:tcPr>
+            <w:tcW w:w="7125" w:type="dxa"/>
+            <w:gridSpan w:val="3"/>
+          </w:tcPr>
+          <w:p>
+            <w:pPr/>
+            <w:r>
+              <w:t xml:space="preserve">System should create the test accounts of the SeedUsers setting with hashed passwords and company assignments.</w:t>
+            </w:r>
+          </w:p>
+        </w:tc>
+      </w:tr>
+      <w:tr>
+        <w:trPr>
+          <w:trHeight w:val="465" w:hRule="atLeast"/>
+        </w:trPr>
+        <w:tc>
+          <w:tcPr>
+            <w:tcW w:w="2220" w:type="dxa"/>
+          </w:tcPr>
+          <w:p>
+            <w:pPr/>
+            <w:r>
+              <w:rPr>
+                <w:b/>
+              </w:rPr>
+              <w:t xml:space="preserve">Author</w:t>
+            </w:r>
+          </w:p>
+        </w:tc>
+        <w:tc>
+          <w:tcPr>
+            <w:tcW w:w="7125" w:type="dxa"/>
+            <w:gridSpan w:val="3"/>
+          </w:tcPr>
+          <w:p>
+            <w:pPr/>
+            <w:r>
+              <w:t xml:space="preserve">Developer</w:t>
+            </w:r>
+          </w:p>
+        </w:tc>
+      </w:tr>
+    </w:tbl>
+    <w:p/>
+    <w:tbl>
+      <w:tblPr>
+        <w:tblStyle w:val="TableGrid"/>
+        <w:tblW w:w="9345" w:type="dxa"/>
+        <w:jc w:val="left"/>
+        <w:tblBorders>
+          <w:top w:val="single" w:color="000000" w:sz="8" w:space="0"/>
+          <w:left w:val="single" w:color="000000" w:sz="8" w:space="0"/>
+          <w:bottom w:val="single" w:color="000000" w:sz="8" w:space="0"/>
+          <w:right w:val="single" w:color="000000" w:sz="8" w:space="0"/>
+          <w:insideH w:val="single" w:color="000000" w:sz="8" w:space="0"/>
+          <w:insideV w:val="single" w:color="000000" w:sz="8" w:space="0"/>
+        </w:tblBorders>
+        <w:tblLayout w:type="fixed"/>
+        <w:tblCellMar>
+          <w:top w:w="100" w:type="dxa"/>
+          <w:left w:w="100" w:type="dxa"/>
+          <w:bottom w:w="100" w:type="dxa"/>
+          <w:right w:w="100" w:type="dxa"/>
+        </w:tblCellMar>
+      </w:tblPr>
+      <w:tblGrid>
+        <w:gridCol w:w="2220"/>
+        <w:gridCol w:w="3525"/>
+        <w:gridCol w:w="2370"/>
+        <w:gridCol w:w="1230"/>
+      </w:tblGrid>
+      <w:tr>
+        <w:trPr>
+          <w:trHeight w:val="465" w:hRule="atLeast"/>
+        </w:trPr>
+        <w:tc>
+          <w:tcPr>
+            <w:tcW w:w="2220" w:type="dxa"/>
+          </w:tcPr>
+          <w:p>
+            <w:pPr/>
+            <w:r>
+              <w:rPr>
+                <w:b/>
+              </w:rPr>
+              <w:t xml:space="preserve">Requirement ID</w:t>
+            </w:r>
+          </w:p>
+        </w:tc>
+        <w:tc>
+          <w:tcPr>
+            <w:tcW w:w="3525" w:type="dxa"/>
+          </w:tcPr>
+          <w:p>
+            <w:pPr/>
+            <w:r>
+              <w:t xml:space="preserve">REQ_F4118.30.3</w:t>
+            </w:r>
+          </w:p>
+        </w:tc>
+        <w:tc>
+          <w:tcPr>
+            <w:tcW w:w="2370" w:type="dxa"/>
+          </w:tcPr>
+          <w:p>
+            <w:pPr/>
+            <w:r>
+              <w:rPr>
+                <w:b/>
+              </w:rPr>
+              <w:t xml:space="preserve">Version</w:t>
+            </w:r>
+          </w:p>
+        </w:tc>
+        <w:tc>
+          <w:tcPr>
+            <w:tcW w:w="1230" w:type="dxa"/>
+          </w:tcPr>
+          <w:p>
+            <w:pPr/>
+            <w:r>
+              <w:t xml:space="preserve">1.0</w:t>
+            </w:r>
+          </w:p>
+        </w:tc>
+      </w:tr>
+      <w:tr>
+        <w:trPr>
+          <w:trHeight w:val="465" w:hRule="atLeast"/>
+        </w:trPr>
+        <w:tc>
+          <w:tcPr>
+            <w:tcW w:w="2220" w:type="dxa"/>
+          </w:tcPr>
+          <w:p>
+            <w:pPr/>
+            <w:r>
+              <w:rPr>
+                <w:b/>
+              </w:rPr>
+              <w:t xml:space="preserve">Description</w:t>
+            </w:r>
+          </w:p>
+        </w:tc>
+        <w:tc>
+          <w:tcPr>
+            <w:tcW w:w="7125" w:type="dxa"/>
+            <w:gridSpan w:val="3"/>
+          </w:tcPr>
+          <w:p>
+            <w:pPr/>
+            <w:r>
+              <w:t xml:space="preserve">System should allow the seed to run repeatedly without duplicating or overwriting data.</w:t>
+            </w:r>
+          </w:p>
+        </w:tc>
+      </w:tr>
+      <w:tr>
+        <w:trPr>
+          <w:trHeight w:val="465" w:hRule="atLeast"/>
+        </w:trPr>
+        <w:tc>
+          <w:tcPr>
+            <w:tcW w:w="2220" w:type="dxa"/>
+          </w:tcPr>
+          <w:p>
+            <w:pPr/>
+            <w:r>
+              <w:rPr>
+                <w:b/>
+              </w:rPr>
+              <w:t xml:space="preserve">Author</w:t>
+            </w:r>
+          </w:p>
+        </w:tc>
+        <w:tc>
+          <w:tcPr>
+            <w:tcW w:w="7125" w:type="dxa"/>
+            <w:gridSpan w:val="3"/>
+          </w:tcPr>
+          <w:p>
+            <w:pPr/>
+            <w:r>
+              <w:t xml:space="preserve">Developer</w:t>
+            </w:r>
+          </w:p>
+        </w:tc>
+      </w:tr>
+    </w:tbl>
+    <w:p/>
+    <w:p>
+      <w:pPr>
         <w:pStyle w:val="Heading2"/>
       </w:pPr>
       <w:r>
@@ -29080,7 +29526,7 @@
       </w:r>
     </w:p>
     <w:sectPr>
-      <w:footerReference xmlns:r="http://schemas.openxmlformats.org/officeDocument/2006/relationships" w:type="default" r:id="R1f9bfc3b162a4156"/>
+      <w:footerReference xmlns:r="http://schemas.openxmlformats.org/officeDocument/2006/relationships" w:type="default" r:id="R953baf6950cc4b67"/>
       <w:pgSz w:w="11906" w:h="16838"/>
       <w:pgMar w:top="1440" w:right="1440" w:bottom="1440" w:left="1440" w:header="720" w:footer="720" w:gutter="0"/>
     </w:sectPr>

</xml_diff>

<commit_message>
feat(ui): add shared dialogs, list/document page templates (WU-SYS-014)
- ErpDialogService: confirm / alert / success toast / select dialog (BlueWhale 4.4.1.9)
- erp-list-page + table-query helpers, erp-document-page + adjacentIds + unsavedChangesGuard
- erp-date-range quick ranges, erp-status-tag
- role list adopts the list template and shared confirm dialog (replaces popconfirm)
- trilingual keys, ADR-024, REQ_F4118.31.1-6, interfaces 8.71-8.74

Co-Authored-By: Claude Opus 5.5 <noreply@anthropic.com>
</commit_message>
<xml_diff>
--- a/docs/99-output/MyERP_SRS.docx
+++ b/docs/99-output/MyERP_SRS.docx
@@ -10169,6 +10169,890 @@
     <w:p/>
     <w:p>
       <w:pPr>
+        <w:pStyle w:val="Heading5"/>
+      </w:pPr>
+      <w:r>
+        <w:t xml:space="preserve">4.1.1.8.31 Shared Dialogs and Page Templates</w:t>
+      </w:r>
+    </w:p>
+    <w:tbl>
+      <w:tblPr>
+        <w:tblStyle w:val="TableGrid"/>
+        <w:tblW w:w="9345" w:type="dxa"/>
+        <w:jc w:val="left"/>
+        <w:tblBorders>
+          <w:top w:val="single" w:color="000000" w:sz="8" w:space="0"/>
+          <w:left w:val="single" w:color="000000" w:sz="8" w:space="0"/>
+          <w:bottom w:val="single" w:color="000000" w:sz="8" w:space="0"/>
+          <w:right w:val="single" w:color="000000" w:sz="8" w:space="0"/>
+          <w:insideH w:val="single" w:color="000000" w:sz="8" w:space="0"/>
+          <w:insideV w:val="single" w:color="000000" w:sz="8" w:space="0"/>
+        </w:tblBorders>
+        <w:tblLayout w:type="fixed"/>
+        <w:tblCellMar>
+          <w:top w:w="100" w:type="dxa"/>
+          <w:left w:w="100" w:type="dxa"/>
+          <w:bottom w:w="100" w:type="dxa"/>
+          <w:right w:w="100" w:type="dxa"/>
+        </w:tblCellMar>
+      </w:tblPr>
+      <w:tblGrid>
+        <w:gridCol w:w="2220"/>
+        <w:gridCol w:w="3525"/>
+        <w:gridCol w:w="2370"/>
+        <w:gridCol w:w="1230"/>
+      </w:tblGrid>
+      <w:tr>
+        <w:trPr>
+          <w:trHeight w:val="465" w:hRule="atLeast"/>
+        </w:trPr>
+        <w:tc>
+          <w:tcPr>
+            <w:tcW w:w="2220" w:type="dxa"/>
+          </w:tcPr>
+          <w:p>
+            <w:pPr/>
+            <w:r>
+              <w:rPr>
+                <w:b/>
+              </w:rPr>
+              <w:t xml:space="preserve">Requirement ID</w:t>
+            </w:r>
+          </w:p>
+        </w:tc>
+        <w:tc>
+          <w:tcPr>
+            <w:tcW w:w="3525" w:type="dxa"/>
+          </w:tcPr>
+          <w:p>
+            <w:pPr/>
+            <w:r>
+              <w:t xml:space="preserve">REQ_F4118.31.1</w:t>
+            </w:r>
+          </w:p>
+        </w:tc>
+        <w:tc>
+          <w:tcPr>
+            <w:tcW w:w="2370" w:type="dxa"/>
+          </w:tcPr>
+          <w:p>
+            <w:pPr/>
+            <w:r>
+              <w:rPr>
+                <w:b/>
+              </w:rPr>
+              <w:t xml:space="preserve">Version</w:t>
+            </w:r>
+          </w:p>
+        </w:tc>
+        <w:tc>
+          <w:tcPr>
+            <w:tcW w:w="1230" w:type="dxa"/>
+          </w:tcPr>
+          <w:p>
+            <w:pPr/>
+            <w:r>
+              <w:t xml:space="preserve">1.0</w:t>
+            </w:r>
+          </w:p>
+        </w:tc>
+      </w:tr>
+      <w:tr>
+        <w:trPr>
+          <w:trHeight w:val="465" w:hRule="atLeast"/>
+        </w:trPr>
+        <w:tc>
+          <w:tcPr>
+            <w:tcW w:w="2220" w:type="dxa"/>
+          </w:tcPr>
+          <w:p>
+            <w:pPr/>
+            <w:r>
+              <w:rPr>
+                <w:b/>
+              </w:rPr>
+              <w:t xml:space="preserve">Description</w:t>
+            </w:r>
+          </w:p>
+        </w:tc>
+        <w:tc>
+          <w:tcPr>
+            <w:tcW w:w="7125" w:type="dxa"/>
+            <w:gridSpan w:val="3"/>
+          </w:tcPr>
+          <w:p>
+            <w:pPr/>
+            <w:r>
+              <w:t xml:space="preserve">System should ask for confirmation in a shared trilingual confirmation box before dangerous actions.</w:t>
+            </w:r>
+          </w:p>
+        </w:tc>
+      </w:tr>
+      <w:tr>
+        <w:trPr>
+          <w:trHeight w:val="465" w:hRule="atLeast"/>
+        </w:trPr>
+        <w:tc>
+          <w:tcPr>
+            <w:tcW w:w="2220" w:type="dxa"/>
+          </w:tcPr>
+          <w:p>
+            <w:pPr/>
+            <w:r>
+              <w:rPr>
+                <w:b/>
+              </w:rPr>
+              <w:t xml:space="preserve">Author</w:t>
+            </w:r>
+          </w:p>
+        </w:tc>
+        <w:tc>
+          <w:tcPr>
+            <w:tcW w:w="7125" w:type="dxa"/>
+            <w:gridSpan w:val="3"/>
+          </w:tcPr>
+          <w:p>
+            <w:pPr/>
+            <w:r>
+              <w:t xml:space="preserve">Developer</w:t>
+            </w:r>
+          </w:p>
+        </w:tc>
+      </w:tr>
+    </w:tbl>
+    <w:p/>
+    <w:tbl>
+      <w:tblPr>
+        <w:tblStyle w:val="TableGrid"/>
+        <w:tblW w:w="9345" w:type="dxa"/>
+        <w:jc w:val="left"/>
+        <w:tblBorders>
+          <w:top w:val="single" w:color="000000" w:sz="8" w:space="0"/>
+          <w:left w:val="single" w:color="000000" w:sz="8" w:space="0"/>
+          <w:bottom w:val="single" w:color="000000" w:sz="8" w:space="0"/>
+          <w:right w:val="single" w:color="000000" w:sz="8" w:space="0"/>
+          <w:insideH w:val="single" w:color="000000" w:sz="8" w:space="0"/>
+          <w:insideV w:val="single" w:color="000000" w:sz="8" w:space="0"/>
+        </w:tblBorders>
+        <w:tblLayout w:type="fixed"/>
+        <w:tblCellMar>
+          <w:top w:w="100" w:type="dxa"/>
+          <w:left w:w="100" w:type="dxa"/>
+          <w:bottom w:w="100" w:type="dxa"/>
+          <w:right w:w="100" w:type="dxa"/>
+        </w:tblCellMar>
+      </w:tblPr>
+      <w:tblGrid>
+        <w:gridCol w:w="2220"/>
+        <w:gridCol w:w="3525"/>
+        <w:gridCol w:w="2370"/>
+        <w:gridCol w:w="1230"/>
+      </w:tblGrid>
+      <w:tr>
+        <w:trPr>
+          <w:trHeight w:val="465" w:hRule="atLeast"/>
+        </w:trPr>
+        <w:tc>
+          <w:tcPr>
+            <w:tcW w:w="2220" w:type="dxa"/>
+          </w:tcPr>
+          <w:p>
+            <w:pPr/>
+            <w:r>
+              <w:rPr>
+                <w:b/>
+              </w:rPr>
+              <w:t xml:space="preserve">Requirement ID</w:t>
+            </w:r>
+          </w:p>
+        </w:tc>
+        <w:tc>
+          <w:tcPr>
+            <w:tcW w:w="3525" w:type="dxa"/>
+          </w:tcPr>
+          <w:p>
+            <w:pPr/>
+            <w:r>
+              <w:t xml:space="preserve">REQ_F4118.31.2</w:t>
+            </w:r>
+          </w:p>
+        </w:tc>
+        <w:tc>
+          <w:tcPr>
+            <w:tcW w:w="2370" w:type="dxa"/>
+          </w:tcPr>
+          <w:p>
+            <w:pPr/>
+            <w:r>
+              <w:rPr>
+                <w:b/>
+              </w:rPr>
+              <w:t xml:space="preserve">Version</w:t>
+            </w:r>
+          </w:p>
+        </w:tc>
+        <w:tc>
+          <w:tcPr>
+            <w:tcW w:w="1230" w:type="dxa"/>
+          </w:tcPr>
+          <w:p>
+            <w:pPr/>
+            <w:r>
+              <w:t xml:space="preserve">1.0</w:t>
+            </w:r>
+          </w:p>
+        </w:tc>
+      </w:tr>
+      <w:tr>
+        <w:trPr>
+          <w:trHeight w:val="465" w:hRule="atLeast"/>
+        </w:trPr>
+        <w:tc>
+          <w:tcPr>
+            <w:tcW w:w="2220" w:type="dxa"/>
+          </w:tcPr>
+          <w:p>
+            <w:pPr/>
+            <w:r>
+              <w:rPr>
+                <w:b/>
+              </w:rPr>
+              <w:t xml:space="preserve">Description</w:t>
+            </w:r>
+          </w:p>
+        </w:tc>
+        <w:tc>
+          <w:tcPr>
+            <w:tcW w:w="7125" w:type="dxa"/>
+            <w:gridSpan w:val="3"/>
+          </w:tcPr>
+          <w:p>
+            <w:pPr/>
+            <w:r>
+              <w:t xml:space="preserve">System should show results that need the user's attention in a shared prompt box, and short success messages as toasts.</w:t>
+            </w:r>
+          </w:p>
+        </w:tc>
+      </w:tr>
+      <w:tr>
+        <w:trPr>
+          <w:trHeight w:val="465" w:hRule="atLeast"/>
+        </w:trPr>
+        <w:tc>
+          <w:tcPr>
+            <w:tcW w:w="2220" w:type="dxa"/>
+          </w:tcPr>
+          <w:p>
+            <w:pPr/>
+            <w:r>
+              <w:rPr>
+                <w:b/>
+              </w:rPr>
+              <w:t xml:space="preserve">Author</w:t>
+            </w:r>
+          </w:p>
+        </w:tc>
+        <w:tc>
+          <w:tcPr>
+            <w:tcW w:w="7125" w:type="dxa"/>
+            <w:gridSpan w:val="3"/>
+          </w:tcPr>
+          <w:p>
+            <w:pPr/>
+            <w:r>
+              <w:t xml:space="preserve">Developer</w:t>
+            </w:r>
+          </w:p>
+        </w:tc>
+      </w:tr>
+    </w:tbl>
+    <w:p/>
+    <w:tbl>
+      <w:tblPr>
+        <w:tblStyle w:val="TableGrid"/>
+        <w:tblW w:w="9345" w:type="dxa"/>
+        <w:jc w:val="left"/>
+        <w:tblBorders>
+          <w:top w:val="single" w:color="000000" w:sz="8" w:space="0"/>
+          <w:left w:val="single" w:color="000000" w:sz="8" w:space="0"/>
+          <w:bottom w:val="single" w:color="000000" w:sz="8" w:space="0"/>
+          <w:right w:val="single" w:color="000000" w:sz="8" w:space="0"/>
+          <w:insideH w:val="single" w:color="000000" w:sz="8" w:space="0"/>
+          <w:insideV w:val="single" w:color="000000" w:sz="8" w:space="0"/>
+        </w:tblBorders>
+        <w:tblLayout w:type="fixed"/>
+        <w:tblCellMar>
+          <w:top w:w="100" w:type="dxa"/>
+          <w:left w:w="100" w:type="dxa"/>
+          <w:bottom w:w="100" w:type="dxa"/>
+          <w:right w:w="100" w:type="dxa"/>
+        </w:tblCellMar>
+      </w:tblPr>
+      <w:tblGrid>
+        <w:gridCol w:w="2220"/>
+        <w:gridCol w:w="3525"/>
+        <w:gridCol w:w="2370"/>
+        <w:gridCol w:w="1230"/>
+      </w:tblGrid>
+      <w:tr>
+        <w:trPr>
+          <w:trHeight w:val="465" w:hRule="atLeast"/>
+        </w:trPr>
+        <w:tc>
+          <w:tcPr>
+            <w:tcW w:w="2220" w:type="dxa"/>
+          </w:tcPr>
+          <w:p>
+            <w:pPr/>
+            <w:r>
+              <w:rPr>
+                <w:b/>
+              </w:rPr>
+              <w:t xml:space="preserve">Requirement ID</w:t>
+            </w:r>
+          </w:p>
+        </w:tc>
+        <w:tc>
+          <w:tcPr>
+            <w:tcW w:w="3525" w:type="dxa"/>
+          </w:tcPr>
+          <w:p>
+            <w:pPr/>
+            <w:r>
+              <w:t xml:space="preserve">REQ_F4118.31.3</w:t>
+            </w:r>
+          </w:p>
+        </w:tc>
+        <w:tc>
+          <w:tcPr>
+            <w:tcW w:w="2370" w:type="dxa"/>
+          </w:tcPr>
+          <w:p>
+            <w:pPr/>
+            <w:r>
+              <w:rPr>
+                <w:b/>
+              </w:rPr>
+              <w:t xml:space="preserve">Version</w:t>
+            </w:r>
+          </w:p>
+        </w:tc>
+        <w:tc>
+          <w:tcPr>
+            <w:tcW w:w="1230" w:type="dxa"/>
+          </w:tcPr>
+          <w:p>
+            <w:pPr/>
+            <w:r>
+              <w:t xml:space="preserve">1.0</w:t>
+            </w:r>
+          </w:p>
+        </w:tc>
+      </w:tr>
+      <w:tr>
+        <w:trPr>
+          <w:trHeight w:val="465" w:hRule="atLeast"/>
+        </w:trPr>
+        <w:tc>
+          <w:tcPr>
+            <w:tcW w:w="2220" w:type="dxa"/>
+          </w:tcPr>
+          <w:p>
+            <w:pPr/>
+            <w:r>
+              <w:rPr>
+                <w:b/>
+              </w:rPr>
+              <w:t xml:space="preserve">Description</w:t>
+            </w:r>
+          </w:p>
+        </w:tc>
+        <w:tc>
+          <w:tcPr>
+            <w:tcW w:w="7125" w:type="dxa"/>
+            <w:gridSpan w:val="3"/>
+          </w:tcPr>
+          <w:p>
+            <w:pPr/>
+            <w:r>
+              <w:t xml:space="preserve">System should provide a shared selection window for choosing master data with search and server-side paging.</w:t>
+            </w:r>
+          </w:p>
+        </w:tc>
+      </w:tr>
+      <w:tr>
+        <w:trPr>
+          <w:trHeight w:val="465" w:hRule="atLeast"/>
+        </w:trPr>
+        <w:tc>
+          <w:tcPr>
+            <w:tcW w:w="2220" w:type="dxa"/>
+          </w:tcPr>
+          <w:p>
+            <w:pPr/>
+            <w:r>
+              <w:rPr>
+                <w:b/>
+              </w:rPr>
+              <w:t xml:space="preserve">Author</w:t>
+            </w:r>
+          </w:p>
+        </w:tc>
+        <w:tc>
+          <w:tcPr>
+            <w:tcW w:w="7125" w:type="dxa"/>
+            <w:gridSpan w:val="3"/>
+          </w:tcPr>
+          <w:p>
+            <w:pPr/>
+            <w:r>
+              <w:t xml:space="preserve">Developer</w:t>
+            </w:r>
+          </w:p>
+        </w:tc>
+      </w:tr>
+    </w:tbl>
+    <w:p/>
+    <w:tbl>
+      <w:tblPr>
+        <w:tblStyle w:val="TableGrid"/>
+        <w:tblW w:w="9345" w:type="dxa"/>
+        <w:jc w:val="left"/>
+        <w:tblBorders>
+          <w:top w:val="single" w:color="000000" w:sz="8" w:space="0"/>
+          <w:left w:val="single" w:color="000000" w:sz="8" w:space="0"/>
+          <w:bottom w:val="single" w:color="000000" w:sz="8" w:space="0"/>
+          <w:right w:val="single" w:color="000000" w:sz="8" w:space="0"/>
+          <w:insideH w:val="single" w:color="000000" w:sz="8" w:space="0"/>
+          <w:insideV w:val="single" w:color="000000" w:sz="8" w:space="0"/>
+        </w:tblBorders>
+        <w:tblLayout w:type="fixed"/>
+        <w:tblCellMar>
+          <w:top w:w="100" w:type="dxa"/>
+          <w:left w:w="100" w:type="dxa"/>
+          <w:bottom w:w="100" w:type="dxa"/>
+          <w:right w:w="100" w:type="dxa"/>
+        </w:tblCellMar>
+      </w:tblPr>
+      <w:tblGrid>
+        <w:gridCol w:w="2220"/>
+        <w:gridCol w:w="3525"/>
+        <w:gridCol w:w="2370"/>
+        <w:gridCol w:w="1230"/>
+      </w:tblGrid>
+      <w:tr>
+        <w:trPr>
+          <w:trHeight w:val="465" w:hRule="atLeast"/>
+        </w:trPr>
+        <w:tc>
+          <w:tcPr>
+            <w:tcW w:w="2220" w:type="dxa"/>
+          </w:tcPr>
+          <w:p>
+            <w:pPr/>
+            <w:r>
+              <w:rPr>
+                <w:b/>
+              </w:rPr>
+              <w:t xml:space="preserve">Requirement ID</w:t>
+            </w:r>
+          </w:p>
+        </w:tc>
+        <w:tc>
+          <w:tcPr>
+            <w:tcW w:w="3525" w:type="dxa"/>
+          </w:tcPr>
+          <w:p>
+            <w:pPr/>
+            <w:r>
+              <w:t xml:space="preserve">REQ_F4118.31.4</w:t>
+            </w:r>
+          </w:p>
+        </w:tc>
+        <w:tc>
+          <w:tcPr>
+            <w:tcW w:w="2370" w:type="dxa"/>
+          </w:tcPr>
+          <w:p>
+            <w:pPr/>
+            <w:r>
+              <w:rPr>
+                <w:b/>
+              </w:rPr>
+              <w:t xml:space="preserve">Version</w:t>
+            </w:r>
+          </w:p>
+        </w:tc>
+        <w:tc>
+          <w:tcPr>
+            <w:tcW w:w="1230" w:type="dxa"/>
+          </w:tcPr>
+          <w:p>
+            <w:pPr/>
+            <w:r>
+              <w:t xml:space="preserve">1.0</w:t>
+            </w:r>
+          </w:p>
+        </w:tc>
+      </w:tr>
+      <w:tr>
+        <w:trPr>
+          <w:trHeight w:val="465" w:hRule="atLeast"/>
+        </w:trPr>
+        <w:tc>
+          <w:tcPr>
+            <w:tcW w:w="2220" w:type="dxa"/>
+          </w:tcPr>
+          <w:p>
+            <w:pPr/>
+            <w:r>
+              <w:rPr>
+                <w:b/>
+              </w:rPr>
+              <w:t xml:space="preserve">Description</w:t>
+            </w:r>
+          </w:p>
+        </w:tc>
+        <w:tc>
+          <w:tcPr>
+            <w:tcW w:w="7125" w:type="dxa"/>
+            <w:gridSpan w:val="3"/>
+          </w:tcPr>
+          <w:p>
+            <w:pPr/>
+            <w:r>
+              <w:t xml:space="preserve">System should provide a standard list page template reused by every module.</w:t>
+            </w:r>
+          </w:p>
+        </w:tc>
+      </w:tr>
+      <w:tr>
+        <w:trPr>
+          <w:trHeight w:val="465" w:hRule="atLeast"/>
+        </w:trPr>
+        <w:tc>
+          <w:tcPr>
+            <w:tcW w:w="2220" w:type="dxa"/>
+          </w:tcPr>
+          <w:p>
+            <w:pPr/>
+            <w:r>
+              <w:rPr>
+                <w:b/>
+              </w:rPr>
+              <w:t xml:space="preserve">Author</w:t>
+            </w:r>
+          </w:p>
+        </w:tc>
+        <w:tc>
+          <w:tcPr>
+            <w:tcW w:w="7125" w:type="dxa"/>
+            <w:gridSpan w:val="3"/>
+          </w:tcPr>
+          <w:p>
+            <w:pPr/>
+            <w:r>
+              <w:t xml:space="preserve">Developer</w:t>
+            </w:r>
+          </w:p>
+        </w:tc>
+      </w:tr>
+    </w:tbl>
+    <w:p/>
+    <w:tbl>
+      <w:tblPr>
+        <w:tblStyle w:val="TableGrid"/>
+        <w:tblW w:w="9345" w:type="dxa"/>
+        <w:jc w:val="left"/>
+        <w:tblBorders>
+          <w:top w:val="single" w:color="000000" w:sz="8" w:space="0"/>
+          <w:left w:val="single" w:color="000000" w:sz="8" w:space="0"/>
+          <w:bottom w:val="single" w:color="000000" w:sz="8" w:space="0"/>
+          <w:right w:val="single" w:color="000000" w:sz="8" w:space="0"/>
+          <w:insideH w:val="single" w:color="000000" w:sz="8" w:space="0"/>
+          <w:insideV w:val="single" w:color="000000" w:sz="8" w:space="0"/>
+        </w:tblBorders>
+        <w:tblLayout w:type="fixed"/>
+        <w:tblCellMar>
+          <w:top w:w="100" w:type="dxa"/>
+          <w:left w:w="100" w:type="dxa"/>
+          <w:bottom w:w="100" w:type="dxa"/>
+          <w:right w:w="100" w:type="dxa"/>
+        </w:tblCellMar>
+      </w:tblPr>
+      <w:tblGrid>
+        <w:gridCol w:w="2220"/>
+        <w:gridCol w:w="3525"/>
+        <w:gridCol w:w="2370"/>
+        <w:gridCol w:w="1230"/>
+      </w:tblGrid>
+      <w:tr>
+        <w:trPr>
+          <w:trHeight w:val="465" w:hRule="atLeast"/>
+        </w:trPr>
+        <w:tc>
+          <w:tcPr>
+            <w:tcW w:w="2220" w:type="dxa"/>
+          </w:tcPr>
+          <w:p>
+            <w:pPr/>
+            <w:r>
+              <w:rPr>
+                <w:b/>
+              </w:rPr>
+              <w:t xml:space="preserve">Requirement ID</w:t>
+            </w:r>
+          </w:p>
+        </w:tc>
+        <w:tc>
+          <w:tcPr>
+            <w:tcW w:w="3525" w:type="dxa"/>
+          </w:tcPr>
+          <w:p>
+            <w:pPr/>
+            <w:r>
+              <w:t xml:space="preserve">REQ_F4118.31.5</w:t>
+            </w:r>
+          </w:p>
+        </w:tc>
+        <w:tc>
+          <w:tcPr>
+            <w:tcW w:w="2370" w:type="dxa"/>
+          </w:tcPr>
+          <w:p>
+            <w:pPr/>
+            <w:r>
+              <w:rPr>
+                <w:b/>
+              </w:rPr>
+              <w:t xml:space="preserve">Version</w:t>
+            </w:r>
+          </w:p>
+        </w:tc>
+        <w:tc>
+          <w:tcPr>
+            <w:tcW w:w="1230" w:type="dxa"/>
+          </w:tcPr>
+          <w:p>
+            <w:pPr/>
+            <w:r>
+              <w:t xml:space="preserve">1.0</w:t>
+            </w:r>
+          </w:p>
+        </w:tc>
+      </w:tr>
+      <w:tr>
+        <w:trPr>
+          <w:trHeight w:val="465" w:hRule="atLeast"/>
+        </w:trPr>
+        <w:tc>
+          <w:tcPr>
+            <w:tcW w:w="2220" w:type="dxa"/>
+          </w:tcPr>
+          <w:p>
+            <w:pPr/>
+            <w:r>
+              <w:rPr>
+                <w:b/>
+              </w:rPr>
+              <w:t xml:space="preserve">Description</w:t>
+            </w:r>
+          </w:p>
+        </w:tc>
+        <w:tc>
+          <w:tcPr>
+            <w:tcW w:w="7125" w:type="dxa"/>
+            <w:gridSpan w:val="3"/>
+          </w:tcPr>
+          <w:p>
+            <w:pPr/>
+            <w:r>
+              <w:t xml:space="preserve">System should provide a standard document page template with status, previous / next navigation and unsaved-change protection.</w:t>
+            </w:r>
+          </w:p>
+        </w:tc>
+      </w:tr>
+      <w:tr>
+        <w:trPr>
+          <w:trHeight w:val="465" w:hRule="atLeast"/>
+        </w:trPr>
+        <w:tc>
+          <w:tcPr>
+            <w:tcW w:w="2220" w:type="dxa"/>
+          </w:tcPr>
+          <w:p>
+            <w:pPr/>
+            <w:r>
+              <w:rPr>
+                <w:b/>
+              </w:rPr>
+              <w:t xml:space="preserve">Author</w:t>
+            </w:r>
+          </w:p>
+        </w:tc>
+        <w:tc>
+          <w:tcPr>
+            <w:tcW w:w="7125" w:type="dxa"/>
+            <w:gridSpan w:val="3"/>
+          </w:tcPr>
+          <w:p>
+            <w:pPr/>
+            <w:r>
+              <w:t xml:space="preserve">Developer</w:t>
+            </w:r>
+          </w:p>
+        </w:tc>
+      </w:tr>
+    </w:tbl>
+    <w:p/>
+    <w:tbl>
+      <w:tblPr>
+        <w:tblStyle w:val="TableGrid"/>
+        <w:tblW w:w="9345" w:type="dxa"/>
+        <w:jc w:val="left"/>
+        <w:tblBorders>
+          <w:top w:val="single" w:color="000000" w:sz="8" w:space="0"/>
+          <w:left w:val="single" w:color="000000" w:sz="8" w:space="0"/>
+          <w:bottom w:val="single" w:color="000000" w:sz="8" w:space="0"/>
+          <w:right w:val="single" w:color="000000" w:sz="8" w:space="0"/>
+          <w:insideH w:val="single" w:color="000000" w:sz="8" w:space="0"/>
+          <w:insideV w:val="single" w:color="000000" w:sz="8" w:space="0"/>
+        </w:tblBorders>
+        <w:tblLayout w:type="fixed"/>
+        <w:tblCellMar>
+          <w:top w:w="100" w:type="dxa"/>
+          <w:left w:w="100" w:type="dxa"/>
+          <w:bottom w:w="100" w:type="dxa"/>
+          <w:right w:w="100" w:type="dxa"/>
+        </w:tblCellMar>
+      </w:tblPr>
+      <w:tblGrid>
+        <w:gridCol w:w="2220"/>
+        <w:gridCol w:w="3525"/>
+        <w:gridCol w:w="2370"/>
+        <w:gridCol w:w="1230"/>
+      </w:tblGrid>
+      <w:tr>
+        <w:trPr>
+          <w:trHeight w:val="465" w:hRule="atLeast"/>
+        </w:trPr>
+        <w:tc>
+          <w:tcPr>
+            <w:tcW w:w="2220" w:type="dxa"/>
+          </w:tcPr>
+          <w:p>
+            <w:pPr/>
+            <w:r>
+              <w:rPr>
+                <w:b/>
+              </w:rPr>
+              <w:t xml:space="preserve">Requirement ID</w:t>
+            </w:r>
+          </w:p>
+        </w:tc>
+        <w:tc>
+          <w:tcPr>
+            <w:tcW w:w="3525" w:type="dxa"/>
+          </w:tcPr>
+          <w:p>
+            <w:pPr/>
+            <w:r>
+              <w:t xml:space="preserve">REQ_F4118.31.6</w:t>
+            </w:r>
+          </w:p>
+        </w:tc>
+        <w:tc>
+          <w:tcPr>
+            <w:tcW w:w="2370" w:type="dxa"/>
+          </w:tcPr>
+          <w:p>
+            <w:pPr/>
+            <w:r>
+              <w:rPr>
+                <w:b/>
+              </w:rPr>
+              <w:t xml:space="preserve">Version</w:t>
+            </w:r>
+          </w:p>
+        </w:tc>
+        <w:tc>
+          <w:tcPr>
+            <w:tcW w:w="1230" w:type="dxa"/>
+          </w:tcPr>
+          <w:p>
+            <w:pPr/>
+            <w:r>
+              <w:t xml:space="preserve">1.0</w:t>
+            </w:r>
+          </w:p>
+        </w:tc>
+      </w:tr>
+      <w:tr>
+        <w:trPr>
+          <w:trHeight w:val="465" w:hRule="atLeast"/>
+        </w:trPr>
+        <w:tc>
+          <w:tcPr>
+            <w:tcW w:w="2220" w:type="dxa"/>
+          </w:tcPr>
+          <w:p>
+            <w:pPr/>
+            <w:r>
+              <w:rPr>
+                <w:b/>
+              </w:rPr>
+              <w:t xml:space="preserve">Description</w:t>
+            </w:r>
+          </w:p>
+        </w:tc>
+        <w:tc>
+          <w:tcPr>
+            <w:tcW w:w="7125" w:type="dxa"/>
+            <w:gridSpan w:val="3"/>
+          </w:tcPr>
+          <w:p>
+            <w:pPr/>
+            <w:r>
+              <w:t xml:space="preserve">System should provide a date range filter with quick ranges and a document status tag following the macaron status colours.</w:t>
+            </w:r>
+          </w:p>
+        </w:tc>
+      </w:tr>
+      <w:tr>
+        <w:trPr>
+          <w:trHeight w:val="465" w:hRule="atLeast"/>
+        </w:trPr>
+        <w:tc>
+          <w:tcPr>
+            <w:tcW w:w="2220" w:type="dxa"/>
+          </w:tcPr>
+          <w:p>
+            <w:pPr/>
+            <w:r>
+              <w:rPr>
+                <w:b/>
+              </w:rPr>
+              <w:t xml:space="preserve">Author</w:t>
+            </w:r>
+          </w:p>
+        </w:tc>
+        <w:tc>
+          <w:tcPr>
+            <w:tcW w:w="7125" w:type="dxa"/>
+            <w:gridSpan w:val="3"/>
+          </w:tcPr>
+          <w:p>
+            <w:pPr/>
+            <w:r>
+              <w:t xml:space="preserve">Developer</w:t>
+            </w:r>
+          </w:p>
+        </w:tc>
+      </w:tr>
+    </w:tbl>
+    <w:p/>
+    <w:p>
+      <w:pPr>
         <w:pStyle w:val="Heading2"/>
       </w:pPr>
       <w:r>
@@ -29099,6 +29983,1676 @@
             <w:pPr/>
             <w:r>
               <w:t xml:space="preserve">可清除</w:t>
+            </w:r>
+          </w:p>
+        </w:tc>
+      </w:tr>
+      <w:tr>
+        <w:tc>
+          <w:tcPr>
+            <w:tcW w:w="2340" w:type="dxa"/>
+          </w:tcPr>
+          <w:p>
+            <w:pPr/>
+            <w:r>
+              <w:rPr>
+                <w:b/>
+              </w:rPr>
+              <w:t xml:space="preserve">Related I/O</w:t>
+            </w:r>
+          </w:p>
+        </w:tc>
+        <w:tc>
+          <w:tcPr>
+            <w:tcW w:w="7020" w:type="dxa"/>
+            <w:gridSpan w:val="3"/>
+          </w:tcPr>
+          <w:p>
+            <w:pPr/>
+            <w:r>
+              <w:t xml:space="preserve">None</w:t>
+            </w:r>
+          </w:p>
+        </w:tc>
+      </w:tr>
+      <w:tr>
+        <w:tc>
+          <w:tcPr>
+            <w:tcW w:w="2340" w:type="dxa"/>
+          </w:tcPr>
+          <w:p>
+            <w:pPr/>
+            <w:r>
+              <w:rPr>
+                <w:b/>
+              </w:rPr>
+              <w:t xml:space="preserve">Author</w:t>
+            </w:r>
+          </w:p>
+        </w:tc>
+        <w:tc>
+          <w:tcPr>
+            <w:tcW w:w="7020" w:type="dxa"/>
+            <w:gridSpan w:val="3"/>
+          </w:tcPr>
+          <w:p>
+            <w:pPr/>
+            <w:r>
+              <w:t xml:space="preserve">Developer</w:t>
+            </w:r>
+          </w:p>
+        </w:tc>
+      </w:tr>
+    </w:tbl>
+    <w:p/>
+    <w:p>
+      <w:pPr>
+        <w:pStyle w:val="Heading5"/>
+      </w:pPr>
+      <w:r>
+        <w:t xml:space="preserve">4.4.1.8.71 Confirmation / Prompt Box Interface（BlueWhale 4.4.1.9）</w:t>
+      </w:r>
+    </w:p>
+    <w:tbl>
+      <w:tblPr>
+        <w:tblStyle w:val="TableGrid"/>
+        <w:tblW w:w="9360" w:type="dxa"/>
+        <w:jc w:val="left"/>
+        <w:tblBorders>
+          <w:top w:val="single" w:color="000000" w:sz="6" w:space="0"/>
+          <w:left w:val="single" w:color="000000" w:sz="6" w:space="0"/>
+          <w:bottom w:val="single" w:color="000000" w:sz="6" w:space="0"/>
+          <w:right w:val="single" w:color="000000" w:sz="6" w:space="0"/>
+          <w:insideH w:val="single" w:color="000000" w:sz="6" w:space="0"/>
+          <w:insideV w:val="single" w:color="000000" w:sz="6" w:space="0"/>
+        </w:tblBorders>
+        <w:tblLayout w:type="fixed"/>
+        <w:tblCellMar>
+          <w:top w:w="100" w:type="dxa"/>
+          <w:left w:w="100" w:type="dxa"/>
+          <w:bottom w:w="100" w:type="dxa"/>
+          <w:right w:w="100" w:type="dxa"/>
+        </w:tblCellMar>
+      </w:tblPr>
+      <w:tblGrid>
+        <w:gridCol w:w="2340"/>
+        <w:gridCol w:w="2340"/>
+        <w:gridCol w:w="2340"/>
+        <w:gridCol w:w="2340"/>
+      </w:tblGrid>
+      <w:tr>
+        <w:tc>
+          <w:tcPr>
+            <w:tcW w:w="2340" w:type="dxa"/>
+          </w:tcPr>
+          <w:p>
+            <w:pPr/>
+            <w:r>
+              <w:rPr>
+                <w:b/>
+              </w:rPr>
+              <w:t xml:space="preserve">Requirement ID</w:t>
+            </w:r>
+          </w:p>
+        </w:tc>
+        <w:tc>
+          <w:tcPr>
+            <w:tcW w:w="2340" w:type="dxa"/>
+          </w:tcPr>
+          <w:p>
+            <w:pPr/>
+            <w:r>
+              <w:t xml:space="preserve">REQ_IO_A8.71.1</w:t>
+            </w:r>
+          </w:p>
+        </w:tc>
+        <w:tc>
+          <w:tcPr>
+            <w:tcW w:w="2340" w:type="dxa"/>
+          </w:tcPr>
+          <w:p>
+            <w:pPr/>
+            <w:r>
+              <w:rPr>
+                <w:b/>
+              </w:rPr>
+              <w:t xml:space="preserve">Version</w:t>
+            </w:r>
+          </w:p>
+        </w:tc>
+        <w:tc>
+          <w:tcPr>
+            <w:tcW w:w="2340" w:type="dxa"/>
+          </w:tcPr>
+          <w:p>
+            <w:pPr/>
+            <w:r>
+              <w:t xml:space="preserve">1.0</w:t>
+            </w:r>
+          </w:p>
+        </w:tc>
+      </w:tr>
+      <w:tr>
+        <w:tc>
+          <w:tcPr>
+            <w:tcW w:w="2340" w:type="dxa"/>
+          </w:tcPr>
+          <w:p>
+            <w:pPr/>
+            <w:r>
+              <w:rPr>
+                <w:b/>
+              </w:rPr>
+              <w:t xml:space="preserve">Item</w:t>
+            </w:r>
+          </w:p>
+        </w:tc>
+        <w:tc>
+          <w:tcPr>
+            <w:tcW w:w="7020" w:type="dxa"/>
+            <w:gridSpan w:val="3"/>
+          </w:tcPr>
+          <w:p>
+            <w:pPr/>
+            <w:r>
+              <w:t xml:space="preserve">OK / Cancel (Button)</w:t>
+            </w:r>
+          </w:p>
+        </w:tc>
+      </w:tr>
+      <w:tr>
+        <w:tc>
+          <w:tcPr>
+            <w:tcW w:w="2340" w:type="dxa"/>
+          </w:tcPr>
+          <w:p>
+            <w:pPr/>
+            <w:r>
+              <w:rPr>
+                <w:b/>
+              </w:rPr>
+              <w:t xml:space="preserve">Description</w:t>
+            </w:r>
+          </w:p>
+        </w:tc>
+        <w:tc>
+          <w:tcPr>
+            <w:tcW w:w="7020" w:type="dxa"/>
+            <w:gridSpan w:val="3"/>
+          </w:tcPr>
+          <w:p>
+            <w:pPr/>
+            <w:r>
+              <w:t xml:space="preserve">確定／取消</w:t>
+            </w:r>
+          </w:p>
+        </w:tc>
+      </w:tr>
+      <w:tr>
+        <w:tc>
+          <w:tcPr>
+            <w:tcW w:w="2340" w:type="dxa"/>
+          </w:tcPr>
+          <w:p>
+            <w:pPr/>
+            <w:r>
+              <w:rPr>
+                <w:b/>
+              </w:rPr>
+              <w:t xml:space="preserve">Purpose</w:t>
+            </w:r>
+          </w:p>
+        </w:tc>
+        <w:tc>
+          <w:tcPr>
+            <w:tcW w:w="7020" w:type="dxa"/>
+            <w:gridSpan w:val="3"/>
+          </w:tcPr>
+          <w:p>
+            <w:pPr/>
+            <w:r>
+              <w:t xml:space="preserve">確認或放棄動作</w:t>
+            </w:r>
+          </w:p>
+        </w:tc>
+      </w:tr>
+      <w:tr>
+        <w:tc>
+          <w:tcPr>
+            <w:tcW w:w="2340" w:type="dxa"/>
+          </w:tcPr>
+          <w:p>
+            <w:pPr/>
+            <w:r>
+              <w:rPr>
+                <w:b/>
+              </w:rPr>
+              <w:t xml:space="preserve">Format</w:t>
+            </w:r>
+          </w:p>
+        </w:tc>
+        <w:tc>
+          <w:tcPr>
+            <w:tcW w:w="2340" w:type="dxa"/>
+          </w:tcPr>
+          <w:p>
+            <w:pPr/>
+            <w:r>
+              <w:t xml:space="preserve">Button</w:t>
+            </w:r>
+          </w:p>
+        </w:tc>
+        <w:tc>
+          <w:tcPr>
+            <w:tcW w:w="2340" w:type="dxa"/>
+          </w:tcPr>
+          <w:p>
+            <w:pPr/>
+            <w:r>
+              <w:rPr>
+                <w:b/>
+              </w:rPr>
+              <w:t xml:space="preserve">Valid Range</w:t>
+            </w:r>
+          </w:p>
+        </w:tc>
+        <w:tc>
+          <w:tcPr>
+            <w:tcW w:w="2340" w:type="dxa"/>
+          </w:tcPr>
+          <w:p>
+            <w:pPr/>
+            <w:r>
+              <w:t xml:space="preserve">確認框兩個按鈕，提示框只有確定；Esc 等同取消</w:t>
+            </w:r>
+          </w:p>
+        </w:tc>
+      </w:tr>
+      <w:tr>
+        <w:tc>
+          <w:tcPr>
+            <w:tcW w:w="2340" w:type="dxa"/>
+          </w:tcPr>
+          <w:p>
+            <w:pPr/>
+            <w:r>
+              <w:rPr>
+                <w:b/>
+              </w:rPr>
+              <w:t xml:space="preserve">Related I/O</w:t>
+            </w:r>
+          </w:p>
+        </w:tc>
+        <w:tc>
+          <w:tcPr>
+            <w:tcW w:w="7020" w:type="dxa"/>
+            <w:gridSpan w:val="3"/>
+          </w:tcPr>
+          <w:p>
+            <w:pPr/>
+            <w:r>
+              <w:t xml:space="preserve">None</w:t>
+            </w:r>
+          </w:p>
+        </w:tc>
+      </w:tr>
+      <w:tr>
+        <w:tc>
+          <w:tcPr>
+            <w:tcW w:w="2340" w:type="dxa"/>
+          </w:tcPr>
+          <w:p>
+            <w:pPr/>
+            <w:r>
+              <w:rPr>
+                <w:b/>
+              </w:rPr>
+              <w:t xml:space="preserve">Author</w:t>
+            </w:r>
+          </w:p>
+        </w:tc>
+        <w:tc>
+          <w:tcPr>
+            <w:tcW w:w="7020" w:type="dxa"/>
+            <w:gridSpan w:val="3"/>
+          </w:tcPr>
+          <w:p>
+            <w:pPr/>
+            <w:r>
+              <w:t xml:space="preserve">Developer</w:t>
+            </w:r>
+          </w:p>
+        </w:tc>
+      </w:tr>
+    </w:tbl>
+    <w:p/>
+    <w:p>
+      <w:pPr>
+        <w:pStyle w:val="Heading5"/>
+      </w:pPr>
+      <w:r>
+        <w:t xml:space="preserve">4.4.1.8.72 Select Dialog Interface（BlueWhale 4.4.1.9 Select Client / Supplier / Item）</w:t>
+      </w:r>
+    </w:p>
+    <w:tbl>
+      <w:tblPr>
+        <w:tblStyle w:val="TableGrid"/>
+        <w:tblW w:w="9360" w:type="dxa"/>
+        <w:jc w:val="left"/>
+        <w:tblBorders>
+          <w:top w:val="single" w:color="000000" w:sz="6" w:space="0"/>
+          <w:left w:val="single" w:color="000000" w:sz="6" w:space="0"/>
+          <w:bottom w:val="single" w:color="000000" w:sz="6" w:space="0"/>
+          <w:right w:val="single" w:color="000000" w:sz="6" w:space="0"/>
+          <w:insideH w:val="single" w:color="000000" w:sz="6" w:space="0"/>
+          <w:insideV w:val="single" w:color="000000" w:sz="6" w:space="0"/>
+        </w:tblBorders>
+        <w:tblLayout w:type="fixed"/>
+        <w:tblCellMar>
+          <w:top w:w="100" w:type="dxa"/>
+          <w:left w:w="100" w:type="dxa"/>
+          <w:bottom w:w="100" w:type="dxa"/>
+          <w:right w:w="100" w:type="dxa"/>
+        </w:tblCellMar>
+      </w:tblPr>
+      <w:tblGrid>
+        <w:gridCol w:w="2340"/>
+        <w:gridCol w:w="2340"/>
+        <w:gridCol w:w="2340"/>
+        <w:gridCol w:w="2340"/>
+      </w:tblGrid>
+      <w:tr>
+        <w:tc>
+          <w:tcPr>
+            <w:tcW w:w="2340" w:type="dxa"/>
+          </w:tcPr>
+          <w:p>
+            <w:pPr/>
+            <w:r>
+              <w:rPr>
+                <w:b/>
+              </w:rPr>
+              <w:t xml:space="preserve">Requirement ID</w:t>
+            </w:r>
+          </w:p>
+        </w:tc>
+        <w:tc>
+          <w:tcPr>
+            <w:tcW w:w="2340" w:type="dxa"/>
+          </w:tcPr>
+          <w:p>
+            <w:pPr/>
+            <w:r>
+              <w:t xml:space="preserve">REQ_IO_A8.72.1</w:t>
+            </w:r>
+          </w:p>
+        </w:tc>
+        <w:tc>
+          <w:tcPr>
+            <w:tcW w:w="2340" w:type="dxa"/>
+          </w:tcPr>
+          <w:p>
+            <w:pPr/>
+            <w:r>
+              <w:rPr>
+                <w:b/>
+              </w:rPr>
+              <w:t xml:space="preserve">Version</w:t>
+            </w:r>
+          </w:p>
+        </w:tc>
+        <w:tc>
+          <w:tcPr>
+            <w:tcW w:w="2340" w:type="dxa"/>
+          </w:tcPr>
+          <w:p>
+            <w:pPr/>
+            <w:r>
+              <w:t xml:space="preserve">1.0</w:t>
+            </w:r>
+          </w:p>
+        </w:tc>
+      </w:tr>
+      <w:tr>
+        <w:tc>
+          <w:tcPr>
+            <w:tcW w:w="2340" w:type="dxa"/>
+          </w:tcPr>
+          <w:p>
+            <w:pPr/>
+            <w:r>
+              <w:rPr>
+                <w:b/>
+              </w:rPr>
+              <w:t xml:space="preserve">Item</w:t>
+            </w:r>
+          </w:p>
+        </w:tc>
+        <w:tc>
+          <w:tcPr>
+            <w:tcW w:w="7020" w:type="dxa"/>
+            <w:gridSpan w:val="3"/>
+          </w:tcPr>
+          <w:p>
+            <w:pPr/>
+            <w:r>
+              <w:t xml:space="preserve">Keyword (Input)</w:t>
+            </w:r>
+          </w:p>
+        </w:tc>
+      </w:tr>
+      <w:tr>
+        <w:tc>
+          <w:tcPr>
+            <w:tcW w:w="2340" w:type="dxa"/>
+          </w:tcPr>
+          <w:p>
+            <w:pPr/>
+            <w:r>
+              <w:rPr>
+                <w:b/>
+              </w:rPr>
+              <w:t xml:space="preserve">Description</w:t>
+            </w:r>
+          </w:p>
+        </w:tc>
+        <w:tc>
+          <w:tcPr>
+            <w:tcW w:w="7020" w:type="dxa"/>
+            <w:gridSpan w:val="3"/>
+          </w:tcPr>
+          <w:p>
+            <w:pPr/>
+            <w:r>
+              <w:t xml:space="preserve">關鍵字</w:t>
+            </w:r>
+          </w:p>
+        </w:tc>
+      </w:tr>
+      <w:tr>
+        <w:tc>
+          <w:tcPr>
+            <w:tcW w:w="2340" w:type="dxa"/>
+          </w:tcPr>
+          <w:p>
+            <w:pPr/>
+            <w:r>
+              <w:rPr>
+                <w:b/>
+              </w:rPr>
+              <w:t xml:space="preserve">Purpose</w:t>
+            </w:r>
+          </w:p>
+        </w:tc>
+        <w:tc>
+          <w:tcPr>
+            <w:tcW w:w="7020" w:type="dxa"/>
+            <w:gridSpan w:val="3"/>
+          </w:tcPr>
+          <w:p>
+            <w:pPr/>
+            <w:r>
+              <w:t xml:space="preserve">搜尋主檔</w:t>
+            </w:r>
+          </w:p>
+        </w:tc>
+      </w:tr>
+      <w:tr>
+        <w:tc>
+          <w:tcPr>
+            <w:tcW w:w="2340" w:type="dxa"/>
+          </w:tcPr>
+          <w:p>
+            <w:pPr/>
+            <w:r>
+              <w:rPr>
+                <w:b/>
+              </w:rPr>
+              <w:t xml:space="preserve">Format</w:t>
+            </w:r>
+          </w:p>
+        </w:tc>
+        <w:tc>
+          <w:tcPr>
+            <w:tcW w:w="2340" w:type="dxa"/>
+          </w:tcPr>
+          <w:p>
+            <w:pPr/>
+            <w:r>
+              <w:t xml:space="preserve">Text</w:t>
+            </w:r>
+          </w:p>
+        </w:tc>
+        <w:tc>
+          <w:tcPr>
+            <w:tcW w:w="2340" w:type="dxa"/>
+          </w:tcPr>
+          <w:p>
+            <w:pPr/>
+            <w:r>
+              <w:rPr>
+                <w:b/>
+              </w:rPr>
+              <w:t xml:space="preserve">Valid Range</w:t>
+            </w:r>
+          </w:p>
+        </w:tc>
+        <w:tc>
+          <w:tcPr>
+            <w:tcW w:w="2340" w:type="dxa"/>
+          </w:tcPr>
+          <w:p>
+            <w:pPr/>
+            <w:r>
+              <w:t xml:space="preserve">去除前後空白；查詢回到第 1 頁</w:t>
+            </w:r>
+          </w:p>
+        </w:tc>
+      </w:tr>
+      <w:tr>
+        <w:tc>
+          <w:tcPr>
+            <w:tcW w:w="2340" w:type="dxa"/>
+          </w:tcPr>
+          <w:p>
+            <w:pPr/>
+            <w:r>
+              <w:rPr>
+                <w:b/>
+              </w:rPr>
+              <w:t xml:space="preserve">Related I/O</w:t>
+            </w:r>
+          </w:p>
+        </w:tc>
+        <w:tc>
+          <w:tcPr>
+            <w:tcW w:w="7020" w:type="dxa"/>
+            <w:gridSpan w:val="3"/>
+          </w:tcPr>
+          <w:p>
+            <w:pPr/>
+            <w:r>
+              <w:t xml:space="preserve">None</w:t>
+            </w:r>
+          </w:p>
+        </w:tc>
+      </w:tr>
+      <w:tr>
+        <w:tc>
+          <w:tcPr>
+            <w:tcW w:w="2340" w:type="dxa"/>
+          </w:tcPr>
+          <w:p>
+            <w:pPr/>
+            <w:r>
+              <w:rPr>
+                <w:b/>
+              </w:rPr>
+              <w:t xml:space="preserve">Author</w:t>
+            </w:r>
+          </w:p>
+        </w:tc>
+        <w:tc>
+          <w:tcPr>
+            <w:tcW w:w="7020" w:type="dxa"/>
+            <w:gridSpan w:val="3"/>
+          </w:tcPr>
+          <w:p>
+            <w:pPr/>
+            <w:r>
+              <w:t xml:space="preserve">Developer</w:t>
+            </w:r>
+          </w:p>
+        </w:tc>
+      </w:tr>
+    </w:tbl>
+    <w:p/>
+    <w:tbl>
+      <w:tblPr>
+        <w:tblStyle w:val="TableGrid"/>
+        <w:tblW w:w="9360" w:type="dxa"/>
+        <w:jc w:val="left"/>
+        <w:tblBorders>
+          <w:top w:val="single" w:color="000000" w:sz="6" w:space="0"/>
+          <w:left w:val="single" w:color="000000" w:sz="6" w:space="0"/>
+          <w:bottom w:val="single" w:color="000000" w:sz="6" w:space="0"/>
+          <w:right w:val="single" w:color="000000" w:sz="6" w:space="0"/>
+          <w:insideH w:val="single" w:color="000000" w:sz="6" w:space="0"/>
+          <w:insideV w:val="single" w:color="000000" w:sz="6" w:space="0"/>
+        </w:tblBorders>
+        <w:tblLayout w:type="fixed"/>
+        <w:tblCellMar>
+          <w:top w:w="100" w:type="dxa"/>
+          <w:left w:w="100" w:type="dxa"/>
+          <w:bottom w:w="100" w:type="dxa"/>
+          <w:right w:w="100" w:type="dxa"/>
+        </w:tblCellMar>
+      </w:tblPr>
+      <w:tblGrid>
+        <w:gridCol w:w="2340"/>
+        <w:gridCol w:w="2340"/>
+        <w:gridCol w:w="2340"/>
+        <w:gridCol w:w="2340"/>
+      </w:tblGrid>
+      <w:tr>
+        <w:tc>
+          <w:tcPr>
+            <w:tcW w:w="2340" w:type="dxa"/>
+          </w:tcPr>
+          <w:p>
+            <w:pPr/>
+            <w:r>
+              <w:rPr>
+                <w:b/>
+              </w:rPr>
+              <w:t xml:space="preserve">Requirement ID</w:t>
+            </w:r>
+          </w:p>
+        </w:tc>
+        <w:tc>
+          <w:tcPr>
+            <w:tcW w:w="2340" w:type="dxa"/>
+          </w:tcPr>
+          <w:p>
+            <w:pPr/>
+            <w:r>
+              <w:t xml:space="preserve">REQ_IO_A8.72.2</w:t>
+            </w:r>
+          </w:p>
+        </w:tc>
+        <w:tc>
+          <w:tcPr>
+            <w:tcW w:w="2340" w:type="dxa"/>
+          </w:tcPr>
+          <w:p>
+            <w:pPr/>
+            <w:r>
+              <w:rPr>
+                <w:b/>
+              </w:rPr>
+              <w:t xml:space="preserve">Version</w:t>
+            </w:r>
+          </w:p>
+        </w:tc>
+        <w:tc>
+          <w:tcPr>
+            <w:tcW w:w="2340" w:type="dxa"/>
+          </w:tcPr>
+          <w:p>
+            <w:pPr/>
+            <w:r>
+              <w:t xml:space="preserve">1.0</w:t>
+            </w:r>
+          </w:p>
+        </w:tc>
+      </w:tr>
+      <w:tr>
+        <w:tc>
+          <w:tcPr>
+            <w:tcW w:w="2340" w:type="dxa"/>
+          </w:tcPr>
+          <w:p>
+            <w:pPr/>
+            <w:r>
+              <w:rPr>
+                <w:b/>
+              </w:rPr>
+              <w:t xml:space="preserve">Item</w:t>
+            </w:r>
+          </w:p>
+        </w:tc>
+        <w:tc>
+          <w:tcPr>
+            <w:tcW w:w="7020" w:type="dxa"/>
+            <w:gridSpan w:val="3"/>
+          </w:tcPr>
+          <w:p>
+            <w:pPr/>
+            <w:r>
+              <w:t xml:space="preserve">Selection (Checkbox / Row)</w:t>
+            </w:r>
+          </w:p>
+        </w:tc>
+      </w:tr>
+      <w:tr>
+        <w:tc>
+          <w:tcPr>
+            <w:tcW w:w="2340" w:type="dxa"/>
+          </w:tcPr>
+          <w:p>
+            <w:pPr/>
+            <w:r>
+              <w:rPr>
+                <w:b/>
+              </w:rPr>
+              <w:t xml:space="preserve">Description</w:t>
+            </w:r>
+          </w:p>
+        </w:tc>
+        <w:tc>
+          <w:tcPr>
+            <w:tcW w:w="7020" w:type="dxa"/>
+            <w:gridSpan w:val="3"/>
+          </w:tcPr>
+          <w:p>
+            <w:pPr/>
+            <w:r>
+              <w:t xml:space="preserve">選取</w:t>
+            </w:r>
+          </w:p>
+        </w:tc>
+      </w:tr>
+      <w:tr>
+        <w:tc>
+          <w:tcPr>
+            <w:tcW w:w="2340" w:type="dxa"/>
+          </w:tcPr>
+          <w:p>
+            <w:pPr/>
+            <w:r>
+              <w:rPr>
+                <w:b/>
+              </w:rPr>
+              <w:t xml:space="preserve">Purpose</w:t>
+            </w:r>
+          </w:p>
+        </w:tc>
+        <w:tc>
+          <w:tcPr>
+            <w:tcW w:w="7020" w:type="dxa"/>
+            <w:gridSpan w:val="3"/>
+          </w:tcPr>
+          <w:p>
+            <w:pPr/>
+            <w:r>
+              <w:t xml:space="preserve">選擇主檔資料</w:t>
+            </w:r>
+          </w:p>
+        </w:tc>
+      </w:tr>
+      <w:tr>
+        <w:tc>
+          <w:tcPr>
+            <w:tcW w:w="2340" w:type="dxa"/>
+          </w:tcPr>
+          <w:p>
+            <w:pPr/>
+            <w:r>
+              <w:rPr>
+                <w:b/>
+              </w:rPr>
+              <w:t xml:space="preserve">Format</w:t>
+            </w:r>
+          </w:p>
+        </w:tc>
+        <w:tc>
+          <w:tcPr>
+            <w:tcW w:w="2340" w:type="dxa"/>
+          </w:tcPr>
+          <w:p>
+            <w:pPr/>
+            <w:r>
+              <w:t xml:space="preserve">Row key</w:t>
+            </w:r>
+          </w:p>
+        </w:tc>
+        <w:tc>
+          <w:tcPr>
+            <w:tcW w:w="2340" w:type="dxa"/>
+          </w:tcPr>
+          <w:p>
+            <w:pPr/>
+            <w:r>
+              <w:rPr>
+                <w:b/>
+              </w:rPr>
+              <w:t xml:space="preserve">Valid Range</w:t>
+            </w:r>
+          </w:p>
+        </w:tc>
+        <w:tc>
+          <w:tcPr>
+            <w:tcW w:w="2340" w:type="dxa"/>
+          </w:tcPr>
+          <w:p>
+            <w:pPr/>
+            <w:r>
+              <w:t xml:space="preserve">單選 1 筆、多選跨頁累積；至少 1 筆才可確定</w:t>
+            </w:r>
+          </w:p>
+        </w:tc>
+      </w:tr>
+      <w:tr>
+        <w:tc>
+          <w:tcPr>
+            <w:tcW w:w="2340" w:type="dxa"/>
+          </w:tcPr>
+          <w:p>
+            <w:pPr/>
+            <w:r>
+              <w:rPr>
+                <w:b/>
+              </w:rPr>
+              <w:t xml:space="preserve">Related I/O</w:t>
+            </w:r>
+          </w:p>
+        </w:tc>
+        <w:tc>
+          <w:tcPr>
+            <w:tcW w:w="7020" w:type="dxa"/>
+            <w:gridSpan w:val="3"/>
+          </w:tcPr>
+          <w:p>
+            <w:pPr/>
+            <w:r>
+              <w:t xml:space="preserve">REQ_IO_A8.72.1</w:t>
+            </w:r>
+          </w:p>
+        </w:tc>
+      </w:tr>
+      <w:tr>
+        <w:tc>
+          <w:tcPr>
+            <w:tcW w:w="2340" w:type="dxa"/>
+          </w:tcPr>
+          <w:p>
+            <w:pPr/>
+            <w:r>
+              <w:rPr>
+                <w:b/>
+              </w:rPr>
+              <w:t xml:space="preserve">Author</w:t>
+            </w:r>
+          </w:p>
+        </w:tc>
+        <w:tc>
+          <w:tcPr>
+            <w:tcW w:w="7020" w:type="dxa"/>
+            <w:gridSpan w:val="3"/>
+          </w:tcPr>
+          <w:p>
+            <w:pPr/>
+            <w:r>
+              <w:t xml:space="preserve">Developer</w:t>
+            </w:r>
+          </w:p>
+        </w:tc>
+      </w:tr>
+    </w:tbl>
+    <w:p/>
+    <w:p>
+      <w:pPr>
+        <w:pStyle w:val="Heading5"/>
+      </w:pPr>
+      <w:r>
+        <w:t xml:space="preserve">4.4.1.8.73 Standard List Page Template</w:t>
+      </w:r>
+    </w:p>
+    <w:tbl>
+      <w:tblPr>
+        <w:tblStyle w:val="TableGrid"/>
+        <w:tblW w:w="9360" w:type="dxa"/>
+        <w:jc w:val="left"/>
+        <w:tblBorders>
+          <w:top w:val="single" w:color="000000" w:sz="6" w:space="0"/>
+          <w:left w:val="single" w:color="000000" w:sz="6" w:space="0"/>
+          <w:bottom w:val="single" w:color="000000" w:sz="6" w:space="0"/>
+          <w:right w:val="single" w:color="000000" w:sz="6" w:space="0"/>
+          <w:insideH w:val="single" w:color="000000" w:sz="6" w:space="0"/>
+          <w:insideV w:val="single" w:color="000000" w:sz="6" w:space="0"/>
+        </w:tblBorders>
+        <w:tblLayout w:type="fixed"/>
+        <w:tblCellMar>
+          <w:top w:w="100" w:type="dxa"/>
+          <w:left w:w="100" w:type="dxa"/>
+          <w:bottom w:w="100" w:type="dxa"/>
+          <w:right w:w="100" w:type="dxa"/>
+        </w:tblCellMar>
+      </w:tblPr>
+      <w:tblGrid>
+        <w:gridCol w:w="2340"/>
+        <w:gridCol w:w="2340"/>
+        <w:gridCol w:w="2340"/>
+        <w:gridCol w:w="2340"/>
+      </w:tblGrid>
+      <w:tr>
+        <w:tc>
+          <w:tcPr>
+            <w:tcW w:w="2340" w:type="dxa"/>
+          </w:tcPr>
+          <w:p>
+            <w:pPr/>
+            <w:r>
+              <w:rPr>
+                <w:b/>
+              </w:rPr>
+              <w:t xml:space="preserve">Requirement ID</w:t>
+            </w:r>
+          </w:p>
+        </w:tc>
+        <w:tc>
+          <w:tcPr>
+            <w:tcW w:w="2340" w:type="dxa"/>
+          </w:tcPr>
+          <w:p>
+            <w:pPr/>
+            <w:r>
+              <w:t xml:space="preserve">REQ_IO_A8.73.1</w:t>
+            </w:r>
+          </w:p>
+        </w:tc>
+        <w:tc>
+          <w:tcPr>
+            <w:tcW w:w="2340" w:type="dxa"/>
+          </w:tcPr>
+          <w:p>
+            <w:pPr/>
+            <w:r>
+              <w:rPr>
+                <w:b/>
+              </w:rPr>
+              <w:t xml:space="preserve">Version</w:t>
+            </w:r>
+          </w:p>
+        </w:tc>
+        <w:tc>
+          <w:tcPr>
+            <w:tcW w:w="2340" w:type="dxa"/>
+          </w:tcPr>
+          <w:p>
+            <w:pPr/>
+            <w:r>
+              <w:t xml:space="preserve">1.0</w:t>
+            </w:r>
+          </w:p>
+        </w:tc>
+      </w:tr>
+      <w:tr>
+        <w:tc>
+          <w:tcPr>
+            <w:tcW w:w="2340" w:type="dxa"/>
+          </w:tcPr>
+          <w:p>
+            <w:pPr/>
+            <w:r>
+              <w:rPr>
+                <w:b/>
+              </w:rPr>
+              <w:t xml:space="preserve">Item</w:t>
+            </w:r>
+          </w:p>
+        </w:tc>
+        <w:tc>
+          <w:tcPr>
+            <w:tcW w:w="7020" w:type="dxa"/>
+            <w:gridSpan w:val="3"/>
+          </w:tcPr>
+          <w:p>
+            <w:pPr/>
+            <w:r>
+              <w:t xml:space="preserve">Date Range (Date inputs + quick buttons)</w:t>
+            </w:r>
+          </w:p>
+        </w:tc>
+      </w:tr>
+      <w:tr>
+        <w:tc>
+          <w:tcPr>
+            <w:tcW w:w="2340" w:type="dxa"/>
+          </w:tcPr>
+          <w:p>
+            <w:pPr/>
+            <w:r>
+              <w:rPr>
+                <w:b/>
+              </w:rPr>
+              <w:t xml:space="preserve">Description</w:t>
+            </w:r>
+          </w:p>
+        </w:tc>
+        <w:tc>
+          <w:tcPr>
+            <w:tcW w:w="7020" w:type="dxa"/>
+            <w:gridSpan w:val="3"/>
+          </w:tcPr>
+          <w:p>
+            <w:pPr/>
+            <w:r>
+              <w:t xml:space="preserve">開始／結束日期</w:t>
+            </w:r>
+          </w:p>
+        </w:tc>
+      </w:tr>
+      <w:tr>
+        <w:tc>
+          <w:tcPr>
+            <w:tcW w:w="2340" w:type="dxa"/>
+          </w:tcPr>
+          <w:p>
+            <w:pPr/>
+            <w:r>
+              <w:rPr>
+                <w:b/>
+              </w:rPr>
+              <w:t xml:space="preserve">Purpose</w:t>
+            </w:r>
+          </w:p>
+        </w:tc>
+        <w:tc>
+          <w:tcPr>
+            <w:tcW w:w="7020" w:type="dxa"/>
+            <w:gridSpan w:val="3"/>
+          </w:tcPr>
+          <w:p>
+            <w:pPr/>
+            <w:r>
+              <w:t xml:space="preserve">限制查詢期間</w:t>
+            </w:r>
+          </w:p>
+        </w:tc>
+      </w:tr>
+      <w:tr>
+        <w:tc>
+          <w:tcPr>
+            <w:tcW w:w="2340" w:type="dxa"/>
+          </w:tcPr>
+          <w:p>
+            <w:pPr/>
+            <w:r>
+              <w:rPr>
+                <w:b/>
+              </w:rPr>
+              <w:t xml:space="preserve">Format</w:t>
+            </w:r>
+          </w:p>
+        </w:tc>
+        <w:tc>
+          <w:tcPr>
+            <w:tcW w:w="2340" w:type="dxa"/>
+          </w:tcPr>
+          <w:p>
+            <w:pPr/>
+            <w:r>
+              <w:t xml:space="preserve">yyyy-MM-dd</w:t>
+            </w:r>
+          </w:p>
+        </w:tc>
+        <w:tc>
+          <w:tcPr>
+            <w:tcW w:w="2340" w:type="dxa"/>
+          </w:tcPr>
+          <w:p>
+            <w:pPr/>
+            <w:r>
+              <w:rPr>
+                <w:b/>
+              </w:rPr>
+              <w:t xml:space="preserve">Valid Range</w:t>
+            </w:r>
+          </w:p>
+        </w:tc>
+        <w:tc>
+          <w:tcPr>
+            <w:tcW w:w="2340" w:type="dxa"/>
+          </w:tcPr>
+          <w:p>
+            <w:pPr/>
+            <w:r>
+              <w:t xml:space="preserve">含頭尾；快選今天、本週、本月、上月、本季、本年；開始晚於結束時提示</w:t>
+            </w:r>
+          </w:p>
+        </w:tc>
+      </w:tr>
+      <w:tr>
+        <w:tc>
+          <w:tcPr>
+            <w:tcW w:w="2340" w:type="dxa"/>
+          </w:tcPr>
+          <w:p>
+            <w:pPr/>
+            <w:r>
+              <w:rPr>
+                <w:b/>
+              </w:rPr>
+              <w:t xml:space="preserve">Related I/O</w:t>
+            </w:r>
+          </w:p>
+        </w:tc>
+        <w:tc>
+          <w:tcPr>
+            <w:tcW w:w="7020" w:type="dxa"/>
+            <w:gridSpan w:val="3"/>
+          </w:tcPr>
+          <w:p>
+            <w:pPr/>
+            <w:r>
+              <w:t xml:space="preserve">None</w:t>
+            </w:r>
+          </w:p>
+        </w:tc>
+      </w:tr>
+      <w:tr>
+        <w:tc>
+          <w:tcPr>
+            <w:tcW w:w="2340" w:type="dxa"/>
+          </w:tcPr>
+          <w:p>
+            <w:pPr/>
+            <w:r>
+              <w:rPr>
+                <w:b/>
+              </w:rPr>
+              <w:t xml:space="preserve">Author</w:t>
+            </w:r>
+          </w:p>
+        </w:tc>
+        <w:tc>
+          <w:tcPr>
+            <w:tcW w:w="7020" w:type="dxa"/>
+            <w:gridSpan w:val="3"/>
+          </w:tcPr>
+          <w:p>
+            <w:pPr/>
+            <w:r>
+              <w:t xml:space="preserve">Developer</w:t>
+            </w:r>
+          </w:p>
+        </w:tc>
+      </w:tr>
+    </w:tbl>
+    <w:p/>
+    <w:tbl>
+      <w:tblPr>
+        <w:tblStyle w:val="TableGrid"/>
+        <w:tblW w:w="9360" w:type="dxa"/>
+        <w:jc w:val="left"/>
+        <w:tblBorders>
+          <w:top w:val="single" w:color="000000" w:sz="6" w:space="0"/>
+          <w:left w:val="single" w:color="000000" w:sz="6" w:space="0"/>
+          <w:bottom w:val="single" w:color="000000" w:sz="6" w:space="0"/>
+          <w:right w:val="single" w:color="000000" w:sz="6" w:space="0"/>
+          <w:insideH w:val="single" w:color="000000" w:sz="6" w:space="0"/>
+          <w:insideV w:val="single" w:color="000000" w:sz="6" w:space="0"/>
+        </w:tblBorders>
+        <w:tblLayout w:type="fixed"/>
+        <w:tblCellMar>
+          <w:top w:w="100" w:type="dxa"/>
+          <w:left w:w="100" w:type="dxa"/>
+          <w:bottom w:w="100" w:type="dxa"/>
+          <w:right w:w="100" w:type="dxa"/>
+        </w:tblCellMar>
+      </w:tblPr>
+      <w:tblGrid>
+        <w:gridCol w:w="2340"/>
+        <w:gridCol w:w="2340"/>
+        <w:gridCol w:w="2340"/>
+        <w:gridCol w:w="2340"/>
+      </w:tblGrid>
+      <w:tr>
+        <w:tc>
+          <w:tcPr>
+            <w:tcW w:w="2340" w:type="dxa"/>
+          </w:tcPr>
+          <w:p>
+            <w:pPr/>
+            <w:r>
+              <w:rPr>
+                <w:b/>
+              </w:rPr>
+              <w:t xml:space="preserve">Requirement ID</w:t>
+            </w:r>
+          </w:p>
+        </w:tc>
+        <w:tc>
+          <w:tcPr>
+            <w:tcW w:w="2340" w:type="dxa"/>
+          </w:tcPr>
+          <w:p>
+            <w:pPr/>
+            <w:r>
+              <w:t xml:space="preserve">REQ_IO_A8.73.2</w:t>
+            </w:r>
+          </w:p>
+        </w:tc>
+        <w:tc>
+          <w:tcPr>
+            <w:tcW w:w="2340" w:type="dxa"/>
+          </w:tcPr>
+          <w:p>
+            <w:pPr/>
+            <w:r>
+              <w:rPr>
+                <w:b/>
+              </w:rPr>
+              <w:t xml:space="preserve">Version</w:t>
+            </w:r>
+          </w:p>
+        </w:tc>
+        <w:tc>
+          <w:tcPr>
+            <w:tcW w:w="2340" w:type="dxa"/>
+          </w:tcPr>
+          <w:p>
+            <w:pPr/>
+            <w:r>
+              <w:t xml:space="preserve">1.0</w:t>
+            </w:r>
+          </w:p>
+        </w:tc>
+      </w:tr>
+      <w:tr>
+        <w:tc>
+          <w:tcPr>
+            <w:tcW w:w="2340" w:type="dxa"/>
+          </w:tcPr>
+          <w:p>
+            <w:pPr/>
+            <w:r>
+              <w:rPr>
+                <w:b/>
+              </w:rPr>
+              <w:t xml:space="preserve">Item</w:t>
+            </w:r>
+          </w:p>
+        </w:tc>
+        <w:tc>
+          <w:tcPr>
+            <w:tcW w:w="7020" w:type="dxa"/>
+            <w:gridSpan w:val="3"/>
+          </w:tcPr>
+          <w:p>
+            <w:pPr/>
+            <w:r>
+              <w:t xml:space="preserve">Page Size (Dropdown)</w:t>
+            </w:r>
+          </w:p>
+        </w:tc>
+      </w:tr>
+      <w:tr>
+        <w:tc>
+          <w:tcPr>
+            <w:tcW w:w="2340" w:type="dxa"/>
+          </w:tcPr>
+          <w:p>
+            <w:pPr/>
+            <w:r>
+              <w:rPr>
+                <w:b/>
+              </w:rPr>
+              <w:t xml:space="preserve">Description</w:t>
+            </w:r>
+          </w:p>
+        </w:tc>
+        <w:tc>
+          <w:tcPr>
+            <w:tcW w:w="7020" w:type="dxa"/>
+            <w:gridSpan w:val="3"/>
+          </w:tcPr>
+          <w:p>
+            <w:pPr/>
+            <w:r>
+              <w:t xml:space="preserve">每頁筆數</w:t>
+            </w:r>
+          </w:p>
+        </w:tc>
+      </w:tr>
+      <w:tr>
+        <w:tc>
+          <w:tcPr>
+            <w:tcW w:w="2340" w:type="dxa"/>
+          </w:tcPr>
+          <w:p>
+            <w:pPr/>
+            <w:r>
+              <w:rPr>
+                <w:b/>
+              </w:rPr>
+              <w:t xml:space="preserve">Purpose</w:t>
+            </w:r>
+          </w:p>
+        </w:tc>
+        <w:tc>
+          <w:tcPr>
+            <w:tcW w:w="7020" w:type="dxa"/>
+            <w:gridSpan w:val="3"/>
+          </w:tcPr>
+          <w:p>
+            <w:pPr/>
+            <w:r>
+              <w:t xml:space="preserve">分頁</w:t>
+            </w:r>
+          </w:p>
+        </w:tc>
+      </w:tr>
+      <w:tr>
+        <w:tc>
+          <w:tcPr>
+            <w:tcW w:w="2340" w:type="dxa"/>
+          </w:tcPr>
+          <w:p>
+            <w:pPr/>
+            <w:r>
+              <w:rPr>
+                <w:b/>
+              </w:rPr>
+              <w:t xml:space="preserve">Format</w:t>
+            </w:r>
+          </w:p>
+        </w:tc>
+        <w:tc>
+          <w:tcPr>
+            <w:tcW w:w="2340" w:type="dxa"/>
+          </w:tcPr>
+          <w:p>
+            <w:pPr/>
+            <w:r>
+              <w:t xml:space="preserve">整數</w:t>
+            </w:r>
+          </w:p>
+        </w:tc>
+        <w:tc>
+          <w:tcPr>
+            <w:tcW w:w="2340" w:type="dxa"/>
+          </w:tcPr>
+          <w:p>
+            <w:pPr/>
+            <w:r>
+              <w:rPr>
+                <w:b/>
+              </w:rPr>
+              <w:t xml:space="preserve">Valid Range</w:t>
+            </w:r>
+          </w:p>
+        </w:tc>
+        <w:tc>
+          <w:tcPr>
+            <w:tcW w:w="2340" w:type="dxa"/>
+          </w:tcPr>
+          <w:p>
+            <w:pPr/>
+            <w:r>
+              <w:t xml:space="preserve">10／20／50／100／200</w:t>
+            </w:r>
+          </w:p>
+        </w:tc>
+      </w:tr>
+      <w:tr>
+        <w:tc>
+          <w:tcPr>
+            <w:tcW w:w="2340" w:type="dxa"/>
+          </w:tcPr>
+          <w:p>
+            <w:pPr/>
+            <w:r>
+              <w:rPr>
+                <w:b/>
+              </w:rPr>
+              <w:t xml:space="preserve">Related I/O</w:t>
+            </w:r>
+          </w:p>
+        </w:tc>
+        <w:tc>
+          <w:tcPr>
+            <w:tcW w:w="7020" w:type="dxa"/>
+            <w:gridSpan w:val="3"/>
+          </w:tcPr>
+          <w:p>
+            <w:pPr/>
+            <w:r>
+              <w:t xml:space="preserve">None</w:t>
+            </w:r>
+          </w:p>
+        </w:tc>
+      </w:tr>
+      <w:tr>
+        <w:tc>
+          <w:tcPr>
+            <w:tcW w:w="2340" w:type="dxa"/>
+          </w:tcPr>
+          <w:p>
+            <w:pPr/>
+            <w:r>
+              <w:rPr>
+                <w:b/>
+              </w:rPr>
+              <w:t xml:space="preserve">Author</w:t>
+            </w:r>
+          </w:p>
+        </w:tc>
+        <w:tc>
+          <w:tcPr>
+            <w:tcW w:w="7020" w:type="dxa"/>
+            <w:gridSpan w:val="3"/>
+          </w:tcPr>
+          <w:p>
+            <w:pPr/>
+            <w:r>
+              <w:t xml:space="preserve">Developer</w:t>
+            </w:r>
+          </w:p>
+        </w:tc>
+      </w:tr>
+    </w:tbl>
+    <w:p/>
+    <w:p>
+      <w:pPr>
+        <w:pStyle w:val="Heading5"/>
+      </w:pPr>
+      <w:r>
+        <w:t xml:space="preserve">4.4.1.8.74 Standard Document Page Template</w:t>
+      </w:r>
+    </w:p>
+    <w:tbl>
+      <w:tblPr>
+        <w:tblStyle w:val="TableGrid"/>
+        <w:tblW w:w="9360" w:type="dxa"/>
+        <w:jc w:val="left"/>
+        <w:tblBorders>
+          <w:top w:val="single" w:color="000000" w:sz="6" w:space="0"/>
+          <w:left w:val="single" w:color="000000" w:sz="6" w:space="0"/>
+          <w:bottom w:val="single" w:color="000000" w:sz="6" w:space="0"/>
+          <w:right w:val="single" w:color="000000" w:sz="6" w:space="0"/>
+          <w:insideH w:val="single" w:color="000000" w:sz="6" w:space="0"/>
+          <w:insideV w:val="single" w:color="000000" w:sz="6" w:space="0"/>
+        </w:tblBorders>
+        <w:tblLayout w:type="fixed"/>
+        <w:tblCellMar>
+          <w:top w:w="100" w:type="dxa"/>
+          <w:left w:w="100" w:type="dxa"/>
+          <w:bottom w:w="100" w:type="dxa"/>
+          <w:right w:w="100" w:type="dxa"/>
+        </w:tblCellMar>
+      </w:tblPr>
+      <w:tblGrid>
+        <w:gridCol w:w="2340"/>
+        <w:gridCol w:w="2340"/>
+        <w:gridCol w:w="2340"/>
+        <w:gridCol w:w="2340"/>
+      </w:tblGrid>
+      <w:tr>
+        <w:tc>
+          <w:tcPr>
+            <w:tcW w:w="2340" w:type="dxa"/>
+          </w:tcPr>
+          <w:p>
+            <w:pPr/>
+            <w:r>
+              <w:rPr>
+                <w:b/>
+              </w:rPr>
+              <w:t xml:space="preserve">Requirement ID</w:t>
+            </w:r>
+          </w:p>
+        </w:tc>
+        <w:tc>
+          <w:tcPr>
+            <w:tcW w:w="2340" w:type="dxa"/>
+          </w:tcPr>
+          <w:p>
+            <w:pPr/>
+            <w:r>
+              <w:t xml:space="preserve">REQ_IO_A8.74.1</w:t>
+            </w:r>
+          </w:p>
+        </w:tc>
+        <w:tc>
+          <w:tcPr>
+            <w:tcW w:w="2340" w:type="dxa"/>
+          </w:tcPr>
+          <w:p>
+            <w:pPr/>
+            <w:r>
+              <w:rPr>
+                <w:b/>
+              </w:rPr>
+              <w:t xml:space="preserve">Version</w:t>
+            </w:r>
+          </w:p>
+        </w:tc>
+        <w:tc>
+          <w:tcPr>
+            <w:tcW w:w="2340" w:type="dxa"/>
+          </w:tcPr>
+          <w:p>
+            <w:pPr/>
+            <w:r>
+              <w:t xml:space="preserve">1.0</w:t>
+            </w:r>
+          </w:p>
+        </w:tc>
+      </w:tr>
+      <w:tr>
+        <w:tc>
+          <w:tcPr>
+            <w:tcW w:w="2340" w:type="dxa"/>
+          </w:tcPr>
+          <w:p>
+            <w:pPr/>
+            <w:r>
+              <w:rPr>
+                <w:b/>
+              </w:rPr>
+              <w:t xml:space="preserve">Item</w:t>
+            </w:r>
+          </w:p>
+        </w:tc>
+        <w:tc>
+          <w:tcPr>
+            <w:tcW w:w="7020" w:type="dxa"/>
+            <w:gridSpan w:val="3"/>
+          </w:tcPr>
+          <w:p>
+            <w:pPr/>
+            <w:r>
+              <w:t xml:space="preserve">Previous / Next (Button)</w:t>
+            </w:r>
+          </w:p>
+        </w:tc>
+      </w:tr>
+      <w:tr>
+        <w:tc>
+          <w:tcPr>
+            <w:tcW w:w="2340" w:type="dxa"/>
+          </w:tcPr>
+          <w:p>
+            <w:pPr/>
+            <w:r>
+              <w:rPr>
+                <w:b/>
+              </w:rPr>
+              <w:t xml:space="preserve">Description</w:t>
+            </w:r>
+          </w:p>
+        </w:tc>
+        <w:tc>
+          <w:tcPr>
+            <w:tcW w:w="7020" w:type="dxa"/>
+            <w:gridSpan w:val="3"/>
+          </w:tcPr>
+          <w:p>
+            <w:pPr/>
+            <w:r>
+              <w:t xml:space="preserve">上一筆／下一筆</w:t>
+            </w:r>
+          </w:p>
+        </w:tc>
+      </w:tr>
+      <w:tr>
+        <w:tc>
+          <w:tcPr>
+            <w:tcW w:w="2340" w:type="dxa"/>
+          </w:tcPr>
+          <w:p>
+            <w:pPr/>
+            <w:r>
+              <w:rPr>
+                <w:b/>
+              </w:rPr>
+              <w:t xml:space="preserve">Purpose</w:t>
+            </w:r>
+          </w:p>
+        </w:tc>
+        <w:tc>
+          <w:tcPr>
+            <w:tcW w:w="7020" w:type="dxa"/>
+            <w:gridSpan w:val="3"/>
+          </w:tcPr>
+          <w:p>
+            <w:pPr/>
+            <w:r>
+              <w:t xml:space="preserve">依列表順序切換單據</w:t>
+            </w:r>
+          </w:p>
+        </w:tc>
+      </w:tr>
+      <w:tr>
+        <w:tc>
+          <w:tcPr>
+            <w:tcW w:w="2340" w:type="dxa"/>
+          </w:tcPr>
+          <w:p>
+            <w:pPr/>
+            <w:r>
+              <w:rPr>
+                <w:b/>
+              </w:rPr>
+              <w:t xml:space="preserve">Format</w:t>
+            </w:r>
+          </w:p>
+        </w:tc>
+        <w:tc>
+          <w:tcPr>
+            <w:tcW w:w="2340" w:type="dxa"/>
+          </w:tcPr>
+          <w:p>
+            <w:pPr/>
+            <w:r>
+              <w:t xml:space="preserve">Button</w:t>
+            </w:r>
+          </w:p>
+        </w:tc>
+        <w:tc>
+          <w:tcPr>
+            <w:tcW w:w="2340" w:type="dxa"/>
+          </w:tcPr>
+          <w:p>
+            <w:pPr/>
+            <w:r>
+              <w:rPr>
+                <w:b/>
+              </w:rPr>
+              <w:t xml:space="preserve">Valid Range</w:t>
+            </w:r>
+          </w:p>
+        </w:tc>
+        <w:tc>
+          <w:tcPr>
+            <w:tcW w:w="2340" w:type="dxa"/>
+          </w:tcPr>
+          <w:p>
+            <w:pPr/>
+            <w:r>
+              <w:t xml:space="preserve">第一筆停用上一筆、最後一筆停用下一筆</w:t>
             </w:r>
           </w:p>
         </w:tc>
@@ -29434,6 +31988,82 @@
     </w:p>
     <w:p>
       <w:pPr>
+        <w:pStyle w:val="Heading5"/>
+      </w:pPr>
+      <w:r>
+        <w:t xml:space="preserve">4.5.1.8.71 Confirmation / Prompt Box Interface（BlueWhale 4.4.1.9）</w:t>
+      </w:r>
+    </w:p>
+    <w:p>
+      <w:pPr>
+        <w:jc w:val="center"/>
+      </w:pPr>
+      <w:r>
+        <w:rPr>
+          <w:i/>
+        </w:rPr>
+        <w:t xml:space="preserve">[Pending] Prototype screenshot of Confirmation / Prompt Box Interface（BlueWhale 4.4.1.9）.</w:t>
+      </w:r>
+    </w:p>
+    <w:p>
+      <w:pPr>
+        <w:pStyle w:val="Heading5"/>
+      </w:pPr>
+      <w:r>
+        <w:t xml:space="preserve">4.5.1.8.72 Select Dialog Interface（BlueWhale 4.4.1.9 Select Client / Supplier / Item）</w:t>
+      </w:r>
+    </w:p>
+    <w:p>
+      <w:pPr>
+        <w:jc w:val="center"/>
+      </w:pPr>
+      <w:r>
+        <w:rPr>
+          <w:i/>
+        </w:rPr>
+        <w:t xml:space="preserve">[Pending] Prototype screenshot of Select Dialog Interface（BlueWhale 4.4.1.9 Select Client / Supplier / Item）.</w:t>
+      </w:r>
+    </w:p>
+    <w:p>
+      <w:pPr>
+        <w:pStyle w:val="Heading5"/>
+      </w:pPr>
+      <w:r>
+        <w:t xml:space="preserve">4.5.1.8.73 Standard List Page Template</w:t>
+      </w:r>
+    </w:p>
+    <w:p>
+      <w:pPr>
+        <w:jc w:val="center"/>
+      </w:pPr>
+      <w:r>
+        <w:rPr>
+          <w:i/>
+        </w:rPr>
+        <w:t xml:space="preserve">[Pending] Prototype screenshot of Standard List Page Template.</w:t>
+      </w:r>
+    </w:p>
+    <w:p>
+      <w:pPr>
+        <w:pStyle w:val="Heading5"/>
+      </w:pPr>
+      <w:r>
+        <w:t xml:space="preserve">4.5.1.8.74 Standard Document Page Template</w:t>
+      </w:r>
+    </w:p>
+    <w:p>
+      <w:pPr>
+        <w:jc w:val="center"/>
+      </w:pPr>
+      <w:r>
+        <w:rPr>
+          <w:i/>
+        </w:rPr>
+        <w:t xml:space="preserve">[Pending] Prototype screenshot of Standard Document Page Template.</w:t>
+      </w:r>
+    </w:p>
+    <w:p>
+      <w:pPr>
         <w:pStyle w:val="Heading2"/>
       </w:pPr>
       <w:r>
@@ -29526,7 +32156,7 @@
       </w:r>
     </w:p>
     <w:sectPr>
-      <w:footerReference xmlns:r="http://schemas.openxmlformats.org/officeDocument/2006/relationships" w:type="default" r:id="R953baf6950cc4b67"/>
+      <w:footerReference xmlns:r="http://schemas.openxmlformats.org/officeDocument/2006/relationships" w:type="default" r:id="Rebcfac10412746a6"/>
       <w:pgSz w:w="11906" w:h="16838"/>
       <w:pgMar w:top="1440" w:right="1440" w:bottom="1440" w:left="1440" w:header="720" w:footer="720" w:gutter="0"/>
     </w:sectPr>

</xml_diff>

<commit_message>
chore(sys): complete full regression and module handoff
</commit_message>
<xml_diff>
--- a/docs/99-output/MyERP_SRS.docx
+++ b/docs/99-output/MyERP_SRS.docx
@@ -1112,7 +1112,7 @@
           <w:p>
             <w:pPr/>
             <w:r>
-              <w:t xml:space="preserve">1.1</w:t>
+              <w:t xml:space="preserve">1.2</w:t>
             </w:r>
           </w:p>
         </w:tc>
@@ -3342,7 +3342,7 @@
           <w:p>
             <w:pPr/>
             <w:r>
-              <w:t xml:space="preserve">1.1</w:t>
+              <w:t xml:space="preserve">1.2</w:t>
             </w:r>
           </w:p>
         </w:tc>
@@ -5410,7 +5410,7 @@
           <w:p>
             <w:pPr/>
             <w:r>
-              <w:t xml:space="preserve">1.0</w:t>
+              <w:t xml:space="preserve">1.1</w:t>
             </w:r>
           </w:p>
         </w:tc>
@@ -5556,7 +5556,7 @@
           <w:p>
             <w:pPr/>
             <w:r>
-              <w:t xml:space="preserve">1.0</w:t>
+              <w:t xml:space="preserve">1.1</w:t>
             </w:r>
           </w:p>
         </w:tc>
@@ -7178,7 +7178,7 @@
           <w:p>
             <w:pPr/>
             <w:r>
-              <w:t xml:space="preserve">1.0</w:t>
+              <w:t xml:space="preserve">1.1</w:t>
             </w:r>
           </w:p>
         </w:tc>
@@ -13958,7 +13958,7 @@
           <w:p>
             <w:pPr/>
             <w:r>
-              <w:t xml:space="preserve">1.0</w:t>
+              <w:t xml:space="preserve">1.1</w:t>
             </w:r>
           </w:p>
         </w:tc>
@@ -48601,7 +48601,7 @@
       </w:r>
     </w:p>
     <w:sectPr>
-      <w:footerReference xmlns:r="http://schemas.openxmlformats.org/officeDocument/2006/relationships" w:type="default" r:id="R31dc8791876f4fbd"/>
+      <w:footerReference xmlns:r="http://schemas.openxmlformats.org/officeDocument/2006/relationships" w:type="default" r:id="Rc0316dfe84d24e5a"/>
       <w:pgSz w:w="11906" w:h="16838"/>
       <w:pgMar w:top="1440" w:right="1440" w:bottom="1440" w:left="1440" w:header="720" w:footer="720" w:gutter="0"/>
     </w:sectPr>

</xml_diff>